<commit_message>
Actualizar documentación del MVP a la versión 3
- IA real con Gemini (provisional), chat como extra, despliegue en Vercel
- Validador de Fase 1: ingeniero a cargo
- Aviso ISO y número de proyecto 2026-544-15

Co-Authored-By: Claude Opus 5.5 <noreply@anthropic.com>
</commit_message>
<xml_diff>
--- a/Documentacion_MVP_Plataforma.docx
+++ b/Documentacion_MVP_Plataforma.docx
@@ -399,7 +399,7 @@
                 <w:sz w:val="19"/>
                 <w:szCs w:val="19"/>
               </w:rPr>
-              <w:t>Prototipo navegable de organigramas + descripciones de puesto + mockup de IA</w:t>
+              <w:t>Prototipo navegable de organigramas + descripciones de puesto + asistente de IA (IA real provisional)</w:t>
             </w:r>
           </w:p>
         </w:tc>
@@ -487,7 +487,7 @@
                 <w:sz w:val="19"/>
                 <w:szCs w:val="19"/>
               </w:rPr>
-              <w:t>Validado con al menos 1 persona real (Calidad/RH) y aprobado por Carlos/coordinador</w:t>
+              <w:t>Revisado y aprobado por el ingeniero a cargo del proyecto (luz verde para la Fase 2)</w:t>
             </w:r>
           </w:p>
         </w:tc>
@@ -1418,7 +1418,7 @@
                 <w:sz w:val="19"/>
                 <w:szCs w:val="19"/>
               </w:rPr>
-              <w:t>Prueba el MVP (Calidad/RH de una empresa real)</w:t>
+              <w:t>Ingeniero a cargo del proyecto</w:t>
             </w:r>
           </w:p>
         </w:tc>
@@ -1448,7 +1448,7 @@
                 <w:sz w:val="19"/>
                 <w:szCs w:val="19"/>
               </w:rPr>
-              <w:t>Recorrer el flujo y dar retroalimentación</w:t>
+              <w:t>Revisar el MVP, dar retroalimentación y autorizar el paso a la Fase 2</w:t>
             </w:r>
           </w:p>
         </w:tc>
@@ -1478,7 +1478,7 @@
                 <w:sz w:val="19"/>
                 <w:szCs w:val="19"/>
               </w:rPr>
-              <w:t>Se documenta fuera de la plataforma (ficha del proyecto)</w:t>
+              <w:t>Se documenta fuera de la plataforma (sección 23.3 y ficha del proyecto)</w:t>
             </w:r>
           </w:p>
         </w:tc>
@@ -1570,7 +1570,7 @@
         <w:rPr>
           <w:color w:val="172033"/>
         </w:rPr>
-        <w:t>Entregar un MVP navegable (Fase 1) con los 2 módulos y el mockup de IA.</w:t>
+        <w:t>Entregar un MVP navegable (Fase 1) con los 2 módulos y el asistente de IA. Se entregó con IA real de forma provisional (Google Gemini), aunque el requisito pedía solo un mockup.</w:t>
       </w:r>
     </w:p>
     <w:p>
@@ -1586,7 +1586,7 @@
         <w:rPr>
           <w:color w:val="172033"/>
         </w:rPr>
-        <w:t>Validar el flujo con al menos 1 persona real de Calidad o RH y documentar sus observaciones y los ajustes realizados.</w:t>
+        <w:t>Validar el MVP con el ingeniero a cargo del proyecto, quien revisa la evidencia y da la luz verde para pasar a la Fase 2; documentar sus observaciones y los ajustes realizados.</w:t>
       </w:r>
     </w:p>
     <w:p>
@@ -1618,7 +1618,7 @@
         <w:rPr>
           <w:color w:val="172033"/>
         </w:rPr>
-        <w:t>Conectar el asistente a un modelo de lenguaje real, con revisión humana obligatoria antes de guardar.</w:t>
+        <w:t>Conectar el asistente a un modelo de lenguaje real, con revisión humana obligatoria antes de guardar. Adelantado en el MVP con Gemini; el agente de IA definitivo está pendiente de asignación por parte del ingeniero.</w:t>
       </w:r>
     </w:p>
     <w:p>
@@ -2066,7 +2066,7 @@
                 <w:sz w:val="19"/>
                 <w:szCs w:val="19"/>
               </w:rPr>
-              <w:t>Mockup en Fase 1, real en Fase 2</w:t>
+              <w:t>Adelantado en la Fase 1 con IA real provisional (Gemini); el agente definitivo lo asigna el ingeniero</w:t>
             </w:r>
           </w:p>
         </w:tc>
@@ -2826,7 +2826,7 @@
         <w:rPr>
           <w:color w:val="172033"/>
         </w:rPr>
-        <w:t>Un solo practicante (perfil Multimedia) con apoyo de mentor; el apoyo técnico para Django e IA está pendiente de asignar.</w:t>
+        <w:t>Un solo practicante (perfil Multimedia) con apoyo de mentor; el apoyo técnico para Django y el agente de IA definitivo están pendientes de asignar por parte del ingeniero.</w:t>
       </w:r>
     </w:p>
     <w:p>
@@ -2916,7 +2916,7 @@
         <w:rPr>
           <w:color w:val="172033"/>
         </w:rPr>
-        <w:t>Cada requerimiento tiene un identificador, prioridad (Alta/Media/Baja), fase objetivo y su estado en el MVP actual (plataforma_iot.html), para poder rastrear qué ya existe y qué falta.</w:t>
+        <w:t>Cada requerimiento tiene un identificador, prioridad (Alta/Media/Baja), fase objetivo y su estado en el MVP actual (index.html y funciones /api, publicado en Vercel), para poder rastrear qué ya existe y qué falta.</w:t>
       </w:r>
     </w:p>
     <w:p>
@@ -7152,7 +7152,7 @@
               <w:bottom w:val="single" w:sz="4" w:space="0" w:color="D1D5DB"/>
               <w:right w:val="single" w:sz="4" w:space="0" w:color="D1D5DB"/>
             </w:tcBorders>
-            <w:shd w:val="clear" w:color="auto" w:fill="FEF3C7"/>
+            <w:shd w:val="clear" w:color="auto" w:fill="E6F4EC"/>
             <w:tcMar>
               <w:top w:w="70" w:type="dxa"/>
               <w:left w:w="100" w:type="dxa"/>
@@ -7165,7 +7165,7 @@
               <w:rPr>
                 <w:sz w:val="18"/>
               </w:rPr>
-              <w:t>Simulado (reglas de texto; sin modelo real)</w:t>
+              <w:t>Implementado con IA real con Google Gemini (provisional; el agente definitivo lo asigna el ingeniero)</w:t>
             </w:r>
           </w:p>
         </w:tc>
@@ -7926,25 +7926,25 @@
               <w:bottom w:val="single" w:sz="4" w:space="0" w:color="D1D5DB"/>
               <w:right w:val="single" w:sz="4" w:space="0" w:color="D1D5DB"/>
             </w:tcBorders>
-            <w:shd w:val="clear" w:color="auto" w:fill="FDE8E8"/>
-            <w:tcMar>
-              <w:top w:w="70" w:type="dxa"/>
-              <w:left w:w="100" w:type="dxa"/>
-              <w:bottom w:w="70" w:type="dxa"/>
-              <w:right w:w="100" w:type="dxa"/>
-            </w:tcMar>
-          </w:tcPr>
-          <w:p>
-            <w:pPr>
-              <w:spacing w:after="20"/>
-            </w:pPr>
-            <w:r>
-              <w:rPr>
-                <w:color w:val="172033"/>
-                <w:sz w:val="19"/>
-                <w:szCs w:val="19"/>
-              </w:rPr>
-              <w:t>No</w:t>
+            <w:shd w:val="clear" w:color="auto" w:fill="E6F4EC"/>
+            <w:tcMar>
+              <w:top w:w="70" w:type="dxa"/>
+              <w:left w:w="100" w:type="dxa"/>
+              <w:bottom w:w="70" w:type="dxa"/>
+              <w:right w:w="100" w:type="dxa"/>
+            </w:tcMar>
+          </w:tcPr>
+          <w:p>
+            <w:pPr>
+              <w:spacing w:after="20"/>
+            </w:pPr>
+            <w:r>
+              <w:rPr>
+                <w:color w:val="172033"/>
+                <w:sz w:val="19"/>
+                <w:szCs w:val="19"/>
+              </w:rPr>
+              <w:t>Adelantado en el MVP: función de servidor en Vercel que llama a Gemini; proveedor definitivo por confirmar</w:t>
             </w:r>
           </w:p>
         </w:tc>
@@ -8408,25 +8408,187 @@
               <w:bottom w:val="single" w:sz="4" w:space="0" w:color="D1D5DB"/>
               <w:right w:val="single" w:sz="4" w:space="0" w:color="D1D5DB"/>
             </w:tcBorders>
-            <w:shd w:val="clear" w:color="auto" w:fill="FDE8E8"/>
-            <w:tcMar>
-              <w:top w:w="70" w:type="dxa"/>
-              <w:left w:w="100" w:type="dxa"/>
-              <w:bottom w:w="70" w:type="dxa"/>
-              <w:right w:w="100" w:type="dxa"/>
-            </w:tcMar>
-          </w:tcPr>
-          <w:p>
-            <w:pPr>
-              <w:spacing w:after="20"/>
-            </w:pPr>
-            <w:r>
-              <w:rPr>
-                <w:color w:val="172033"/>
-                <w:sz w:val="19"/>
-                <w:szCs w:val="19"/>
-              </w:rPr>
-              <w:t>No</w:t>
+            <w:shd w:val="clear" w:color="auto" w:fill="E6F4EC"/>
+            <w:tcMar>
+              <w:top w:w="70" w:type="dxa"/>
+              <w:left w:w="100" w:type="dxa"/>
+              <w:bottom w:w="70" w:type="dxa"/>
+              <w:right w:w="100" w:type="dxa"/>
+            </w:tcMar>
+          </w:tcPr>
+          <w:p>
+            <w:pPr>
+              <w:spacing w:after="20"/>
+            </w:pPr>
+            <w:r>
+              <w:rPr>
+                <w:color w:val="172033"/>
+                <w:sz w:val="19"/>
+                <w:szCs w:val="19"/>
+              </w:rPr>
+              <w:t>Implementado: mensajes claros de error y reintento con modelos de respaldo si Gemini está saturado</w:t>
+            </w:r>
+          </w:p>
+        </w:tc>
+      </w:tr>
+      <w:tr>
+        <w:trPr>
+          <w:cantSplit/>
+        </w:trPr>
+        <w:tc>
+          <w:tcPr>
+            <w:tcW w:w="900" w:type="dxa"/>
+            <w:tcBorders>
+              <w:top w:val="single" w:sz="4" w:space="0" w:color="D1D5DB"/>
+              <w:left w:val="single" w:sz="4" w:space="0" w:color="D1D5DB"/>
+              <w:bottom w:val="single" w:sz="4" w:space="0" w:color="D1D5DB"/>
+              <w:right w:val="single" w:sz="4" w:space="0" w:color="D1D5DB"/>
+            </w:tcBorders>
+            <w:shd w:val="clear" w:color="auto" w:fill="F3F4F6"/>
+            <w:tcMar>
+              <w:top w:w="70" w:type="dxa"/>
+              <w:left w:w="100" w:type="dxa"/>
+              <w:bottom w:w="70" w:type="dxa"/>
+              <w:right w:w="100" w:type="dxa"/>
+            </w:tcMar>
+          </w:tcPr>
+          <w:p>
+            <w:pPr>
+              <w:spacing w:after="20"/>
+            </w:pPr>
+            <w:r>
+              <w:rPr>
+                <w:b/>
+                <w:bCs/>
+                <w:color w:val="172033"/>
+                <w:sz w:val="19"/>
+                <w:szCs w:val="19"/>
+              </w:rPr>
+              <w:t>IA-11</w:t>
+            </w:r>
+          </w:p>
+        </w:tc>
+        <w:tc>
+          <w:tcPr>
+            <w:tcW w:w="4160" w:type="dxa"/>
+            <w:tcBorders>
+              <w:top w:val="single" w:sz="4" w:space="0" w:color="D1D5DB"/>
+              <w:left w:val="single" w:sz="4" w:space="0" w:color="D1D5DB"/>
+              <w:bottom w:val="single" w:sz="4" w:space="0" w:color="D1D5DB"/>
+              <w:right w:val="single" w:sz="4" w:space="0" w:color="D1D5DB"/>
+            </w:tcBorders>
+            <w:shd w:val="clear" w:color="auto" w:fill="F3F4F6"/>
+            <w:tcMar>
+              <w:top w:w="70" w:type="dxa"/>
+              <w:left w:w="100" w:type="dxa"/>
+              <w:bottom w:w="70" w:type="dxa"/>
+              <w:right w:w="100" w:type="dxa"/>
+            </w:tcMar>
+          </w:tcPr>
+          <w:p>
+            <w:pPr>
+              <w:spacing w:after="20"/>
+            </w:pPr>
+            <w:r>
+              <w:rPr>
+                <w:color w:val="172033"/>
+                <w:sz w:val="19"/>
+                <w:szCs w:val="19"/>
+              </w:rPr>
+              <w:t>Chat de consulta sobre el organigrama y los puestos registrados</w:t>
+            </w:r>
+          </w:p>
+        </w:tc>
+        <w:tc>
+          <w:tcPr>
+            <w:tcW w:w="1000" w:type="dxa"/>
+            <w:tcBorders>
+              <w:top w:val="single" w:sz="4" w:space="0" w:color="D1D5DB"/>
+              <w:left w:val="single" w:sz="4" w:space="0" w:color="D1D5DB"/>
+              <w:bottom w:val="single" w:sz="4" w:space="0" w:color="D1D5DB"/>
+              <w:right w:val="single" w:sz="4" w:space="0" w:color="D1D5DB"/>
+            </w:tcBorders>
+            <w:shd w:val="clear" w:color="auto" w:fill="F3F4F6"/>
+            <w:tcMar>
+              <w:top w:w="70" w:type="dxa"/>
+              <w:left w:w="100" w:type="dxa"/>
+              <w:bottom w:w="70" w:type="dxa"/>
+              <w:right w:w="100" w:type="dxa"/>
+            </w:tcMar>
+          </w:tcPr>
+          <w:p>
+            <w:pPr>
+              <w:spacing w:after="20"/>
+            </w:pPr>
+            <w:r>
+              <w:rPr>
+                <w:color w:val="172033"/>
+                <w:sz w:val="19"/>
+                <w:szCs w:val="19"/>
+              </w:rPr>
+              <w:t>Baja</w:t>
+            </w:r>
+          </w:p>
+        </w:tc>
+        <w:tc>
+          <w:tcPr>
+            <w:tcW w:w="700" w:type="dxa"/>
+            <w:tcBorders>
+              <w:top w:val="single" w:sz="4" w:space="0" w:color="D1D5DB"/>
+              <w:left w:val="single" w:sz="4" w:space="0" w:color="D1D5DB"/>
+              <w:bottom w:val="single" w:sz="4" w:space="0" w:color="D1D5DB"/>
+              <w:right w:val="single" w:sz="4" w:space="0" w:color="D1D5DB"/>
+            </w:tcBorders>
+            <w:shd w:val="clear" w:color="auto" w:fill="F3F4F6"/>
+            <w:tcMar>
+              <w:top w:w="70" w:type="dxa"/>
+              <w:left w:w="100" w:type="dxa"/>
+              <w:bottom w:w="70" w:type="dxa"/>
+              <w:right w:w="100" w:type="dxa"/>
+            </w:tcMar>
+          </w:tcPr>
+          <w:p>
+            <w:pPr>
+              <w:spacing w:after="20"/>
+            </w:pPr>
+            <w:r>
+              <w:rPr>
+                <w:color w:val="172033"/>
+                <w:sz w:val="19"/>
+                <w:szCs w:val="19"/>
+              </w:rPr>
+              <w:t>Extra</w:t>
+            </w:r>
+          </w:p>
+        </w:tc>
+        <w:tc>
+          <w:tcPr>
+            <w:tcW w:w="2600" w:type="dxa"/>
+            <w:tcBorders>
+              <w:top w:val="single" w:sz="4" w:space="0" w:color="D1D5DB"/>
+              <w:left w:val="single" w:sz="4" w:space="0" w:color="D1D5DB"/>
+              <w:bottom w:val="single" w:sz="4" w:space="0" w:color="D1D5DB"/>
+              <w:right w:val="single" w:sz="4" w:space="0" w:color="D1D5DB"/>
+            </w:tcBorders>
+            <w:shd w:val="clear" w:color="auto" w:fill="E6F4EC"/>
+            <w:tcMar>
+              <w:top w:w="70" w:type="dxa"/>
+              <w:left w:w="100" w:type="dxa"/>
+              <w:bottom w:w="70" w:type="dxa"/>
+              <w:right w:w="100" w:type="dxa"/>
+            </w:tcMar>
+          </w:tcPr>
+          <w:p>
+            <w:pPr>
+              <w:spacing w:after="20"/>
+            </w:pPr>
+            <w:r>
+              <w:rPr>
+                <w:color w:val="172033"/>
+                <w:sz w:val="19"/>
+                <w:szCs w:val="19"/>
+              </w:rPr>
+              <w:t>Implementado como extra fuera del alcance original; sujeto a aprobación del ingeniero</w:t>
             </w:r>
           </w:p>
         </w:tc>
@@ -9122,7 +9284,7 @@
                 <w:sz w:val="19"/>
                 <w:szCs w:val="19"/>
               </w:rPr>
-              <w:t>Retirado; aviso ISO por reubicar</w:t>
+              <w:t>Implementado: aviso en el Dashboard y en el pie de página de todas las secciones</w:t>
             </w:r>
           </w:p>
         </w:tc>
@@ -11053,7 +11215,7 @@
               <w:bottom w:val="single" w:sz="4" w:space="0" w:color="D1D5DB"/>
               <w:right w:val="single" w:sz="4" w:space="0" w:color="D1D5DB"/>
             </w:tcBorders>
-            <w:shd w:val="clear" w:color="auto" w:fill="FDE8E8"/>
+            <w:shd w:val="clear" w:color="auto" w:fill="FEF3C7"/>
             <w:tcMar>
               <w:top w:w="70" w:type="dxa"/>
               <w:left w:w="100" w:type="dxa"/>
@@ -11066,7 +11228,7 @@
               <w:rPr>
                 <w:sz w:val="18"/>
               </w:rPr>
-              <w:t>Implementado</w:t>
+              <w:t>Parcial: logo oficial y paleta principal aplicados; pendiente alinear tipografía de títulos y colores secundarios con el manual</w:t>
             </w:r>
           </w:p>
         </w:tc>
@@ -13609,56 +13771,14 @@
               <w:rPr>
                 <w:sz w:val="18"/>
               </w:rPr>
-              <w:t xml:space="preserve">JavaScript ES6 sin </w:t>
+              <w:t>JavaScript ES6 sin frameworks; navegación, renderizado del organigrama y puestos, modales, búsqueda, login demo, llamadas a la IA mediante /api, chat, mensajes toast y persistencia local.</w:t>
             </w:r>
             <w:proofErr w:type="spellStart"/>
-            <w:r>
-              <w:rPr>
-                <w:sz w:val="18"/>
-              </w:rPr>
-              <w:t>frameworks</w:t>
-            </w:r>
             <w:proofErr w:type="spellEnd"/>
-            <w:r>
-              <w:rPr>
-                <w:sz w:val="18"/>
-              </w:rPr>
-              <w:t xml:space="preserve">; navegación, renderizado del organigrama y puestos, modales, búsqueda, </w:t>
-            </w:r>
             <w:proofErr w:type="spellStart"/>
-            <w:r>
-              <w:rPr>
-                <w:sz w:val="18"/>
-              </w:rPr>
-              <w:t>login</w:t>
-            </w:r>
             <w:proofErr w:type="spellEnd"/>
-            <w:r>
-              <w:rPr>
-                <w:sz w:val="18"/>
-              </w:rPr>
-              <w:t xml:space="preserve"> demo, IA simulada, mensajes </w:t>
-            </w:r>
             <w:proofErr w:type="spellStart"/>
-            <w:r>
-              <w:rPr>
-                <w:sz w:val="18"/>
-              </w:rPr>
-              <w:t>toast</w:t>
-            </w:r>
             <w:proofErr w:type="spellEnd"/>
-            <w:r>
-              <w:rPr>
-                <w:sz w:val="18"/>
-              </w:rPr>
-              <w:t xml:space="preserve"> y </w:t>
-            </w:r>
-            <w:r>
-              <w:rPr>
-                <w:sz w:val="18"/>
-              </w:rPr>
-              <w:t>persistencia local.</w:t>
-            </w:r>
           </w:p>
         </w:tc>
       </w:tr>
@@ -13821,7 +13941,7 @@
                 <w:sz w:val="19"/>
                 <w:szCs w:val="19"/>
               </w:rPr>
-              <w:t>"IA"</w:t>
+              <w:t>IA</w:t>
             </w:r>
           </w:p>
         </w:tc>
@@ -13851,7 +13971,7 @@
                 <w:sz w:val="19"/>
                 <w:szCs w:val="19"/>
               </w:rPr>
-              <w:t>Simulación por reglas</w:t>
+              <w:t>Google Gemini (API REST generateContent)</w:t>
             </w:r>
           </w:p>
         </w:tc>
@@ -13876,7 +13996,7 @@
               <w:rPr>
                 <w:sz w:val="18"/>
               </w:rPr>
-              <w:t>Simulación por reglas: procesa las responsabilidades y genera objetivo, responsabilidades, competencias y perfil académico. No llama a un modelo real.</w:t>
+              <w:t>Funciones de servidor en Vercel: /api/generate devuelve el borrador en JSON estructurado y /api/chat responde con el organigrama como contexto. Modelo gemini-3.8-flash con respaldo gemini-3.5-flash y gemini-3.5-flash-lite. La clave GEMINI_API_KEY vive solo en el servidor.</w:t>
             </w:r>
           </w:p>
         </w:tc>
@@ -14086,7 +14206,7 @@
                 <w:sz w:val="19"/>
                 <w:szCs w:val="19"/>
               </w:rPr>
-              <w:t>Hosting estático</w:t>
+              <w:t>Vercel</w:t>
             </w:r>
           </w:p>
         </w:tc>
@@ -14111,7 +14231,7 @@
               <w:rPr>
                 <w:sz w:val="18"/>
               </w:rPr>
-              <w:t>Archivo HTML local o hosting estático.</w:t>
+              <w:t>Sitio estático + funciones serverless (/api) con despliegue automático desde GitHub: plataforma-desarrollo-organizaciona.vercel.app</w:t>
             </w:r>
           </w:p>
         </w:tc>
@@ -14206,7 +14326,7 @@
               <w:rPr>
                 <w:sz w:val="18"/>
               </w:rPr>
-              <w:t>Git recomendado para conservar la evolución del prototipo.</w:t>
+              <w:t>Git + GitHub (repositorio 2026-544-15---Plataforma-Desarrollo-Organizacional).</w:t>
             </w:r>
           </w:p>
         </w:tc>
@@ -15048,26 +15168,10 @@
                 <w:sz w:val="19"/>
                 <w:szCs w:val="19"/>
               </w:rPr>
-              <w:t xml:space="preserve">API de un modelo de lenguaje (por definir; p. ej. Claude API de </w:t>
+              <w:t>API de un modelo de lenguaje (por definir por el ingeniero; en el MVP se usa Google Gemini de forma provisional) llamada desde el servidor</w:t>
             </w:r>
             <w:proofErr w:type="spellStart"/>
-            <w:r>
-              <w:rPr>
-                <w:color w:val="172033"/>
-                <w:sz w:val="19"/>
-                <w:szCs w:val="19"/>
-              </w:rPr>
-              <w:t>Anthropic</w:t>
-            </w:r>
             <w:proofErr w:type="spellEnd"/>
-            <w:r>
-              <w:rPr>
-                <w:color w:val="172033"/>
-                <w:sz w:val="19"/>
-                <w:szCs w:val="19"/>
-              </w:rPr>
-              <w:t>) mediante SDK de Python</w:t>
-            </w:r>
           </w:p>
         </w:tc>
         <w:tc>
@@ -15990,7 +16094,7 @@
         <w:rPr>
           <w:color w:val="3157D5"/>
         </w:rPr>
-        <w:t>Fase 1 — archivo actual (plataforma_iot.html)</w:t>
+        <w:t>Fase 1 — estructura actual (repositorio en GitHub, publicado en Vercel)</w:t>
       </w:r>
     </w:p>
     <w:tbl>
@@ -16564,190 +16668,214 @@
               <w:rPr>
                 <w:sz w:val="18"/>
               </w:rPr>
-              <w:t>go</w:t>
+              <w:t>go, renderOrg, renderPuestos, showPuesto, aprobar, addOrg, addPuesto, generateAI (llama a /api/generate), saveAI, copyAI, sendChat, resetChat, updateStats, resetOrg, collapseAll, delPuesto, save</w:t>
             </w:r>
             <w:proofErr w:type="spellEnd"/>
+            <w:proofErr w:type="spellStart"/>
+            <w:proofErr w:type="spellEnd"/>
+            <w:proofErr w:type="spellStart"/>
+            <w:proofErr w:type="spellEnd"/>
+            <w:proofErr w:type="spellStart"/>
+            <w:proofErr w:type="spellEnd"/>
+            <w:proofErr w:type="spellStart"/>
+            <w:proofErr w:type="spellEnd"/>
+            <w:proofErr w:type="spellStart"/>
+            <w:proofErr w:type="spellEnd"/>
+            <w:proofErr w:type="spellStart"/>
+            <w:proofErr w:type="spellEnd"/>
+            <w:proofErr w:type="spellStart"/>
+            <w:proofErr w:type="spellEnd"/>
+            <w:proofErr w:type="spellStart"/>
+            <w:proofErr w:type="spellEnd"/>
+            <w:proofErr w:type="spellStart"/>
+            <w:proofErr w:type="spellEnd"/>
+            <w:proofErr w:type="spellStart"/>
+            <w:proofErr w:type="spellEnd"/>
+            <w:proofErr w:type="spellStart"/>
+            <w:proofErr w:type="spellEnd"/>
+            <w:proofErr w:type="spellStart"/>
+            <w:proofErr w:type="spellEnd"/>
+            <w:proofErr w:type="spellStart"/>
+            <w:proofErr w:type="spellEnd"/>
+          </w:p>
+        </w:tc>
+      </w:tr>
+      <w:tr>
+        <w:trPr>
+          <w:cantSplit/>
+        </w:trPr>
+        <w:tc>
+          <w:tcPr>
+            <w:tcW w:w="2200" w:type="dxa"/>
+            <w:tcBorders>
+              <w:top w:val="single" w:sz="4" w:space="0" w:color="D1D5DB"/>
+              <w:left w:val="single" w:sz="4" w:space="0" w:color="D1D5DB"/>
+              <w:bottom w:val="single" w:sz="4" w:space="0" w:color="D1D5DB"/>
+              <w:right w:val="single" w:sz="4" w:space="0" w:color="D1D5DB"/>
+            </w:tcBorders>
+            <w:tcMar>
+              <w:top w:w="70" w:type="dxa"/>
+              <w:left w:w="100" w:type="dxa"/>
+              <w:bottom w:w="70" w:type="dxa"/>
+              <w:right w:w="100" w:type="dxa"/>
+            </w:tcMar>
+          </w:tcPr>
+          <w:p>
+            <w:pPr>
+              <w:spacing w:after="20"/>
+            </w:pPr>
+            <w:r>
+              <w:rPr>
+                <w:b/>
+                <w:bCs/>
+                <w:color w:val="172033"/>
+                <w:sz w:val="19"/>
+                <w:szCs w:val="19"/>
+              </w:rPr>
+              <w:t>Servidor (/api)</w:t>
+            </w:r>
+          </w:p>
+        </w:tc>
+        <w:tc>
+          <w:tcPr>
+            <w:tcW w:w="7160" w:type="dxa"/>
+            <w:tcBorders>
+              <w:top w:val="single" w:sz="4" w:space="0" w:color="D1D5DB"/>
+              <w:left w:val="single" w:sz="4" w:space="0" w:color="D1D5DB"/>
+              <w:bottom w:val="single" w:sz="4" w:space="0" w:color="D1D5DB"/>
+              <w:right w:val="single" w:sz="4" w:space="0" w:color="D1D5DB"/>
+            </w:tcBorders>
+            <w:tcMar>
+              <w:top w:w="70" w:type="dxa"/>
+              <w:left w:w="100" w:type="dxa"/>
+              <w:bottom w:w="70" w:type="dxa"/>
+              <w:right w:w="100" w:type="dxa"/>
+            </w:tcMar>
+          </w:tcPr>
+          <w:p>
+            <w:proofErr w:type="spellStart"/>
             <w:r>
               <w:rPr>
                 <w:sz w:val="18"/>
               </w:rPr>
-              <w:t xml:space="preserve">, </w:t>
-            </w:r>
+              <w:t>api/generate.js (borrador estructurado), api/chat.js (chat con contexto del organigrama), lib/gemini.js (cliente de Gemini, errores, reintentos y modelos de respaldo)</w:t>
+            </w:r>
+            <w:proofErr w:type="spellEnd"/>
             <w:proofErr w:type="spellStart"/>
+            <w:proofErr w:type="spellEnd"/>
+            <w:proofErr w:type="spellStart"/>
+            <w:proofErr w:type="spellEnd"/>
+            <w:proofErr w:type="spellStart"/>
+            <w:proofErr w:type="spellEnd"/>
+            <w:proofErr w:type="spellStart"/>
+            <w:proofErr w:type="spellEnd"/>
+            <w:proofErr w:type="spellStart"/>
+            <w:proofErr w:type="spellEnd"/>
+            <w:proofErr w:type="spellStart"/>
+            <w:proofErr w:type="spellEnd"/>
+            <w:proofErr w:type="spellStart"/>
+            <w:proofErr w:type="spellEnd"/>
+            <w:proofErr w:type="spellStart"/>
+            <w:proofErr w:type="spellEnd"/>
+            <w:proofErr w:type="spellStart"/>
+            <w:proofErr w:type="spellEnd"/>
+            <w:proofErr w:type="spellStart"/>
+            <w:proofErr w:type="spellEnd"/>
+            <w:proofErr w:type="spellStart"/>
+            <w:proofErr w:type="spellEnd"/>
+            <w:proofErr w:type="spellStart"/>
+            <w:proofErr w:type="spellEnd"/>
+            <w:proofErr w:type="spellStart"/>
+            <w:proofErr w:type="spellEnd"/>
+          </w:p>
+        </w:tc>
+      </w:tr>
+      <w:tr>
+        <w:trPr>
+          <w:cantSplit/>
+        </w:trPr>
+        <w:tc>
+          <w:tcPr>
+            <w:tcW w:w="2200" w:type="dxa"/>
+            <w:tcBorders>
+              <w:top w:val="single" w:sz="4" w:space="0" w:color="D1D5DB"/>
+              <w:left w:val="single" w:sz="4" w:space="0" w:color="D1D5DB"/>
+              <w:bottom w:val="single" w:sz="4" w:space="0" w:color="D1D5DB"/>
+              <w:right w:val="single" w:sz="4" w:space="0" w:color="D1D5DB"/>
+            </w:tcBorders>
+            <w:tcMar>
+              <w:top w:w="70" w:type="dxa"/>
+              <w:left w:w="100" w:type="dxa"/>
+              <w:bottom w:w="70" w:type="dxa"/>
+              <w:right w:w="100" w:type="dxa"/>
+            </w:tcMar>
+          </w:tcPr>
+          <w:p>
+            <w:pPr>
+              <w:spacing w:after="20"/>
+            </w:pPr>
+            <w:r>
+              <w:rPr>
+                <w:b/>
+                <w:bCs/>
+                <w:color w:val="172033"/>
+                <w:sz w:val="19"/>
+                <w:szCs w:val="19"/>
+              </w:rPr>
+              <w:t>Configuración</w:t>
+            </w:r>
+          </w:p>
+        </w:tc>
+        <w:tc>
+          <w:tcPr>
+            <w:tcW w:w="7160" w:type="dxa"/>
+            <w:tcBorders>
+              <w:top w:val="single" w:sz="4" w:space="0" w:color="D1D5DB"/>
+              <w:left w:val="single" w:sz="4" w:space="0" w:color="D1D5DB"/>
+              <w:bottom w:val="single" w:sz="4" w:space="0" w:color="D1D5DB"/>
+              <w:right w:val="single" w:sz="4" w:space="0" w:color="D1D5DB"/>
+            </w:tcBorders>
+            <w:tcMar>
+              <w:top w:w="70" w:type="dxa"/>
+              <w:left w:w="100" w:type="dxa"/>
+              <w:bottom w:w="70" w:type="dxa"/>
+              <w:right w:w="100" w:type="dxa"/>
+            </w:tcMar>
+          </w:tcPr>
+          <w:p>
+            <w:proofErr w:type="spellStart"/>
             <w:r>
               <w:rPr>
                 <w:sz w:val="18"/>
               </w:rPr>
-              <w:t>renderOrg</w:t>
+              <w:t>package.json, .env.example (GEMINI_API_KEY) y .gitignore; la clave real solo se guarda en las variables de entorno de Vercel</w:t>
             </w:r>
             <w:proofErr w:type="spellEnd"/>
-            <w:r>
-              <w:rPr>
-                <w:sz w:val="18"/>
-              </w:rPr>
-              <w:t xml:space="preserve">, </w:t>
-            </w:r>
             <w:proofErr w:type="spellStart"/>
-            <w:r>
-              <w:rPr>
-                <w:sz w:val="18"/>
-              </w:rPr>
-              <w:t>renderPuestos</w:t>
-            </w:r>
             <w:proofErr w:type="spellEnd"/>
-            <w:r>
-              <w:rPr>
-                <w:sz w:val="18"/>
-              </w:rPr>
-              <w:t xml:space="preserve">, </w:t>
-            </w:r>
             <w:proofErr w:type="spellStart"/>
-            <w:r>
-              <w:rPr>
-                <w:sz w:val="18"/>
-              </w:rPr>
-              <w:t>showPuesto</w:t>
-            </w:r>
             <w:proofErr w:type="spellEnd"/>
-            <w:r>
-              <w:rPr>
-                <w:sz w:val="18"/>
-              </w:rPr>
-              <w:t xml:space="preserve">, aprobar, </w:t>
-            </w:r>
             <w:proofErr w:type="spellStart"/>
-            <w:r>
-              <w:rPr>
-                <w:sz w:val="18"/>
-              </w:rPr>
-              <w:t>addOrg</w:t>
-            </w:r>
             <w:proofErr w:type="spellEnd"/>
-            <w:r>
-              <w:rPr>
-                <w:sz w:val="18"/>
-              </w:rPr>
-              <w:t xml:space="preserve">, </w:t>
-            </w:r>
             <w:proofErr w:type="spellStart"/>
-            <w:r>
-              <w:rPr>
-                <w:sz w:val="18"/>
-              </w:rPr>
-              <w:t>addPuesto</w:t>
-            </w:r>
             <w:proofErr w:type="spellEnd"/>
-            <w:r>
-              <w:rPr>
-                <w:sz w:val="18"/>
-              </w:rPr>
-              <w:t xml:space="preserve">, </w:t>
-            </w:r>
             <w:proofErr w:type="spellStart"/>
-            <w:r>
-              <w:rPr>
-                <w:sz w:val="18"/>
-              </w:rPr>
-              <w:t>generateAI</w:t>
-            </w:r>
             <w:proofErr w:type="spellEnd"/>
-            <w:r>
-              <w:rPr>
-                <w:sz w:val="18"/>
-              </w:rPr>
-              <w:t xml:space="preserve">, </w:t>
-            </w:r>
             <w:proofErr w:type="spellStart"/>
-            <w:r>
-              <w:rPr>
-                <w:sz w:val="18"/>
-              </w:rPr>
-              <w:t>saveAI</w:t>
-            </w:r>
             <w:proofErr w:type="spellEnd"/>
-            <w:r>
-              <w:rPr>
-                <w:sz w:val="18"/>
-              </w:rPr>
-              <w:t xml:space="preserve">, </w:t>
-            </w:r>
             <w:proofErr w:type="spellStart"/>
-            <w:r>
-              <w:rPr>
-                <w:sz w:val="18"/>
-              </w:rPr>
-              <w:t>copyAI</w:t>
-            </w:r>
             <w:proofErr w:type="spellEnd"/>
-            <w:r>
-              <w:rPr>
-                <w:sz w:val="18"/>
-              </w:rPr>
-              <w:t xml:space="preserve">, </w:t>
-            </w:r>
             <w:proofErr w:type="spellStart"/>
-            <w:r>
-              <w:rPr>
-                <w:sz w:val="18"/>
-              </w:rPr>
-              <w:t>updateStats</w:t>
-            </w:r>
             <w:proofErr w:type="spellEnd"/>
-            <w:r>
-              <w:rPr>
-                <w:sz w:val="18"/>
-              </w:rPr>
-              <w:t xml:space="preserve">, </w:t>
-            </w:r>
             <w:proofErr w:type="spellStart"/>
-            <w:r>
-              <w:rPr>
-                <w:sz w:val="18"/>
-              </w:rPr>
-              <w:t>resetOrg</w:t>
-            </w:r>
             <w:proofErr w:type="spellEnd"/>
-            <w:r>
-              <w:rPr>
-                <w:sz w:val="18"/>
-              </w:rPr>
-              <w:t xml:space="preserve">, </w:t>
-            </w:r>
             <w:proofErr w:type="spellStart"/>
-            <w:r>
-              <w:rPr>
-                <w:sz w:val="18"/>
-              </w:rPr>
-              <w:t>collapseAll</w:t>
-            </w:r>
             <w:proofErr w:type="spellEnd"/>
-            <w:r>
-              <w:rPr>
-                <w:sz w:val="18"/>
-              </w:rPr>
-              <w:t xml:space="preserve">, </w:t>
-            </w:r>
             <w:proofErr w:type="spellStart"/>
-            <w:r>
-              <w:rPr>
-                <w:sz w:val="18"/>
-              </w:rPr>
-              <w:t>delPuesto</w:t>
-            </w:r>
             <w:proofErr w:type="spellEnd"/>
-            <w:r>
-              <w:rPr>
-                <w:sz w:val="18"/>
-              </w:rPr>
-              <w:t xml:space="preserve">, </w:t>
-            </w:r>
             <w:proofErr w:type="spellStart"/>
-            <w:r>
-              <w:rPr>
-                <w:sz w:val="18"/>
-              </w:rPr>
-              <w:t>save</w:t>
-            </w:r>
+            <w:proofErr w:type="spellEnd"/>
+            <w:proofErr w:type="spellStart"/>
             <w:proofErr w:type="spellEnd"/>
           </w:p>
         </w:tc>
@@ -25461,7 +25589,7 @@
         <w:rPr>
           <w:color w:val="172033"/>
         </w:rPr>
-        <w:t>Pedir a la persona de Calidad o RH que realice estas tareas sin ayuda y anotar dudas, tiempos y comentarios:</w:t>
+        <w:t>La validación de la Fase 1 la realiza el ingeniero a cargo del proyecto. Pedirle que realice estas tareas sin ayuda (si es posible, también a una persona de Calidad o RH) y anotar dudas, tiempos y comentarios:</w:t>
       </w:r>
     </w:p>
     <w:p>
@@ -25772,7 +25900,7 @@
         <w:rPr>
           <w:color w:val="172033"/>
         </w:rPr>
-        <w:t>Mockup de generación de contenido por IA con revisión humana.</w:t>
+        <w:t>Generación de contenido por IA con revisión humana (cumplido con IA real provisional; el requisito solo pedía un mockup).</w:t>
       </w:r>
     </w:p>
     <w:p>
@@ -25788,7 +25916,7 @@
         <w:rPr>
           <w:color w:val="172033"/>
         </w:rPr>
-        <w:t>Probado y comentado por al menos 1 persona real, idealmente de Calidad o RH.</w:t>
+        <w:t>Probado y comentado por el ingeniero a cargo del proyecto, que funge como validador de la Fase 1.</w:t>
       </w:r>
     </w:p>
     <w:p>
@@ -25820,7 +25948,7 @@
         <w:rPr>
           <w:color w:val="172033"/>
         </w:rPr>
-        <w:t>Decisión de Carlos/coordinador sobre el paso a la Fase 2.</w:t>
+        <w:t>Aprobación explícita (luz verde) del ingeniero a cargo para el paso a la Fase 2.</w:t>
       </w:r>
     </w:p>
     <w:p>
@@ -26483,7 +26611,7 @@
         <w:rPr>
           <w:color w:val="172033"/>
         </w:rPr>
-        <w:t>Corregir las brechas del MVP listadas en la sección 15 antes de la validación.</w:t>
+        <w:t>Brechas previas a la revisión: atendidas o documentadas (ver sección 23).</w:t>
       </w:r>
     </w:p>
     <w:p>
@@ -26499,7 +26627,7 @@
         <w:rPr>
           <w:color w:val="172033"/>
         </w:rPr>
-        <w:t>Conseguir a la persona validadora (idealmente de la cartera de IOT Technologies).</w:t>
+        <w:t>Validador definido: el ingeniero a cargo del proyecto.</w:t>
       </w:r>
     </w:p>
     <w:p>
@@ -26515,8 +26643,7 @@
         <w:rPr>
           <w:color w:val="172033"/>
         </w:rPr>
-        <w:lastRenderedPageBreak/>
-        <w:t>Realizar la validación y registrarla en la ficha del proyecto.</w:t>
+        <w:t>Realizar la revisión con el ingeniero y registrarla en la sección 23.3 y en la ficha del proyecto.</w:t>
       </w:r>
     </w:p>
     <w:p>
@@ -26548,7 +26675,7 @@
         <w:rPr>
           <w:color w:val="172033"/>
         </w:rPr>
-        <w:t>Presentar la evidencia a Carlos y solicitar la aprobación de la Fase 2.</w:t>
+        <w:t>Presentar la evidencia al ingeniero y solicitar la aprobación de la Fase 2.</w:t>
       </w:r>
     </w:p>
     <w:p>
@@ -26574,7 +26701,7 @@
         <w:rPr>
           <w:color w:val="172033"/>
         </w:rPr>
-        <w:t>Revisión del archivo plataforma_iot.html frente a los requerimientos. Las brechas 1 a 4 conviene corregirlas antes de la validación, porque una persona real las notará.</w:t>
+        <w:t>Revisión del MVP (index.html y funciones /api) frente a los requerimientos. Actualizada el 6 de octubre de 2026: las brechas 6 y 10 quedaron atendidas; las demás corresponden a la Fase 2.</w:t>
       </w:r>
     </w:p>
     <w:tbl>
@@ -27036,7 +27163,7 @@
               <w:rPr>
                 <w:sz w:val="18"/>
               </w:rPr>
-              <w:t>La IA es simulada.</w:t>
+              <w:t>Resuelto en el MVP: IA real con Gemini (provisional).</w:t>
             </w:r>
           </w:p>
         </w:tc>
@@ -27062,13 +27189,7 @@
               <w:rPr>
                 <w:sz w:val="18"/>
               </w:rPr>
-              <w:t xml:space="preserve">Conectar API de LLM y registrar </w:t>
-            </w:r>
-            <w:r>
-              <w:rPr>
-                <w:sz w:val="18"/>
-              </w:rPr>
-              <w:t>borradores.</w:t>
+              <w:t>Falta registrar cada borrador para trazabilidad (IA-08) y confirmar el agente definitivo.</w:t>
             </w:r>
           </w:p>
         </w:tc>
@@ -27272,53 +27393,35 @@
               <w:rPr>
                 <w:sz w:val="18"/>
               </w:rPr>
-              <w:t xml:space="preserve">El HTML muestra </w:t>
-            </w:r>
+              <w:t>Resuelto: la página usa 2026-544-15, igual que el repositorio y esta documentación.</w:t>
+            </w:r>
+            <w:proofErr w:type="spellStart"/>
+            <w:proofErr w:type="spellEnd"/>
+          </w:p>
+        </w:tc>
+        <w:tc>
+          <w:tcPr>
+            <w:tcW w:w="1600" w:type="dxa"/>
+          </w:tcPr>
+          <w:p>
             <w:r>
               <w:rPr>
                 <w:sz w:val="18"/>
               </w:rPr>
-              <w:t xml:space="preserve">2026-549 / MERKATICS · </w:t>
-            </w:r>
-            <w:proofErr w:type="spellStart"/>
+              <w:t>Medio</w:t>
+            </w:r>
+          </w:p>
+        </w:tc>
+        <w:tc>
+          <w:tcPr>
+            <w:tcW w:w="3260" w:type="dxa"/>
+          </w:tcPr>
+          <w:p>
             <w:r>
               <w:rPr>
                 <w:sz w:val="18"/>
               </w:rPr>
-              <w:t>GrowthLab</w:t>
-            </w:r>
-            <w:proofErr w:type="spellEnd"/>
-            <w:r>
-              <w:rPr>
-                <w:sz w:val="18"/>
-              </w:rPr>
-              <w:t>, mientras el Word maneja 2026-544-15.</w:t>
-            </w:r>
-          </w:p>
-        </w:tc>
-        <w:tc>
-          <w:tcPr>
-            <w:tcW w:w="1600" w:type="dxa"/>
-          </w:tcPr>
-          <w:p>
-            <w:r>
-              <w:rPr>
-                <w:sz w:val="18"/>
-              </w:rPr>
-              <w:t>Medio</w:t>
-            </w:r>
-          </w:p>
-        </w:tc>
-        <w:tc>
-          <w:tcPr>
-            <w:tcW w:w="3260" w:type="dxa"/>
-          </w:tcPr>
-          <w:p>
-            <w:r>
-              <w:rPr>
-                <w:sz w:val="18"/>
-              </w:rPr>
-              <w:t>Confirmar el identificador y marca definitivos con el coordinador.</w:t>
+              <w:t>Confirmar con el coordinador que 2026-544-15 es el identificador oficial.</w:t>
             </w:r>
           </w:p>
         </w:tc>
@@ -28304,7 +28407,7 @@
                 <w:sz w:val="19"/>
                 <w:szCs w:val="19"/>
               </w:rPr>
-              <w:t>Límites por empresa, capa de servicio que permita cambiar de proveedor</w:t>
+              <w:t>Límites por empresa y capa de servicio que permita cambiar de proveedor. En el MVP se usa la cuenta gratuita de Gemini (cuota baja); activar facturación antes de usar datos reales.</w:t>
             </w:r>
           </w:p>
         </w:tc>
@@ -29116,7 +29219,7 @@
                 <w:sz w:val="19"/>
                 <w:szCs w:val="19"/>
               </w:rPr>
-              <w:t>Carlos / coordinador</w:t>
+              <w:t>Ingeniero a cargo</w:t>
             </w:r>
           </w:p>
         </w:tc>
@@ -29152,7 +29255,7 @@
                 <w:sz w:val="19"/>
                 <w:szCs w:val="19"/>
               </w:rPr>
-              <w:t>Elegir la empresa real para la validación y el piloto (interna o cliente externo)</w:t>
+              <w:t>Validación de Fase 1: la realiza el ingeniero (resuelto). Pendiente: elegir la empresa real para el piloto</w:t>
             </w:r>
           </w:p>
         </w:tc>
@@ -29302,7 +29405,7 @@
                 <w:sz w:val="19"/>
                 <w:szCs w:val="19"/>
               </w:rPr>
-              <w:t>Confirmar el proveedor y modelo de IA para la Fase 2, y quién asume el costo de la API</w:t>
+              <w:t>Asignar el agente de IA definitivo (el MVP usa Gemini de forma provisional) y quién asume el costo de la API</w:t>
             </w:r>
           </w:p>
         </w:tc>
@@ -29333,7 +29436,7 @@
                 <w:sz w:val="19"/>
                 <w:szCs w:val="19"/>
               </w:rPr>
-              <w:t>Carlos / mentor</w:t>
+              <w:t>Ingeniero a cargo</w:t>
             </w:r>
           </w:p>
         </w:tc>
@@ -29368,7 +29471,7 @@
                 <w:sz w:val="19"/>
                 <w:szCs w:val="19"/>
               </w:rPr>
-              <w:t>Confirmar el sitio de despliegue del MVP y del piloto</w:t>
+              <w:t>Despliegue del MVP en Vercel (resuelto). Pendiente: definir el despliegue del piloto</w:t>
             </w:r>
           </w:p>
         </w:tc>
@@ -29500,7 +29603,7 @@
                 <w:sz w:val="19"/>
                 <w:szCs w:val="19"/>
               </w:rPr>
-              <w:t>Aclarar el número de proyecto: el archivo de la asignación dice 2026-544-15 y el contenido dice 2026-549</w:t>
+              <w:t>Número de proyecto: se unificó a 2026-544-15 en la página (confirmar que es el oficial)</w:t>
             </w:r>
           </w:p>
         </w:tc>
@@ -31264,6 +31367,244 @@
     </w:p>
     <w:p>
       <w:pPr>
+        <w:pStyle w:val="Ttulo1"/>
+      </w:pPr>
+      <w:r>
+        <w:t>23. Actualización del MVP — versión 3 (6 de octubre de 2026)</w:t>
+      </w:r>
+    </w:p>
+    <w:p>
+      <w:pPr>
+        <w:spacing w:after="120" w:line="276" w:lineRule="auto"/>
+      </w:pPr>
+      <w:r>
+        <w:rPr>
+          <w:color w:val="172033"/>
+        </w:rPr>
+        <w:t>Esta versión convierte el asistente simulado en IA real, publica el MVP en internet y atiende las brechas que el ingeniero notaría en la revisión de la Fase 1. Sustituye lo dicho en la sección 21 sobre la IA simulada y el número de proyecto.</w:t>
+      </w:r>
+    </w:p>
+    <w:p>
+      <w:pPr>
+        <w:pStyle w:val="Ttulo2"/>
+      </w:pPr>
+      <w:r>
+        <w:t>23.1 Cambios implementados</w:t>
+      </w:r>
+    </w:p>
+    <w:p>
+      <w:pPr>
+        <w:pStyle w:val="Prrafodelista"/>
+      </w:pPr>
+      <w:r>
+        <w:t>Publicación del MVP en Vercel (plataforma-desarrollo-organizaciona.vercel.app) con despliegue automático desde GitHub; la página principal pasó a llamarse index.html.</w:t>
+      </w:r>
+    </w:p>
+    <w:p>
+      <w:pPr>
+        <w:pStyle w:val="Prrafodelista"/>
+      </w:pPr>
+      <w:r>
+        <w:t>Generador de descripciones con IA real: Google Gemini redacta objetivo, de 5 a 8 responsabilidades, de 4 a 6 competencias y perfil académico, en JSON estructurado y en campos editables.</w:t>
+      </w:r>
+    </w:p>
+    <w:p>
+      <w:pPr>
+        <w:pStyle w:val="Prrafodelista"/>
+      </w:pPr>
+      <w:r>
+        <w:t>La clave de la IA (GEMINI_API_KEY) vive solo en el servidor de Vercel; no llega al navegador ni al repositorio (.env excluido con .gitignore).</w:t>
+      </w:r>
+    </w:p>
+    <w:p>
+      <w:pPr>
+        <w:pStyle w:val="Prrafodelista"/>
+      </w:pPr>
+      <w:r>
+        <w:t>Manejo de errores de la IA: mensajes claros (clave inválida, cuota agotada, modelo saturado) y paso automático a modelos de respaldo si el principal está saturado.</w:t>
+      </w:r>
+    </w:p>
+    <w:p>
+      <w:pPr>
+        <w:pStyle w:val="Prrafodelista"/>
+      </w:pPr>
+      <w:r>
+        <w:t>Respuestas más rápidas configurando el nivel de razonamiento del modelo en bajo (thinkingLevel: low).</w:t>
+      </w:r>
+    </w:p>
+    <w:p>
+      <w:pPr>
+        <w:pStyle w:val="Prrafodelista"/>
+      </w:pPr>
+      <w:r>
+        <w:t>Chat con el asistente (extra, fuera del alcance original): responde preguntas usando los puestos registrados en la plataforma; muestra negritas y viñetas.</w:t>
+      </w:r>
+    </w:p>
+    <w:p>
+      <w:pPr>
+        <w:pStyle w:val="Prrafodelista"/>
+      </w:pPr>
+      <w:r>
+        <w:t>Aviso visible de que el prototipo está alineado a la estructura de ISO 9001 y no es un sistema certificado (Dashboard y pie de página).</w:t>
+      </w:r>
+    </w:p>
+    <w:p>
+      <w:pPr>
+        <w:pStyle w:val="Prrafodelista"/>
+      </w:pPr>
+      <w:r>
+        <w:t>Número de proyecto unificado a 2026-544-15 en la barra lateral y el pie de página.</w:t>
+      </w:r>
+    </w:p>
+    <w:p>
+      <w:pPr>
+        <w:pStyle w:val="Ttulo2"/>
+      </w:pPr>
+      <w:r>
+        <w:t>23.2 Evidencia de pruebas</w:t>
+      </w:r>
+    </w:p>
+    <w:p>
+      <w:pPr>
+        <w:pStyle w:val="Prrafodelista"/>
+      </w:pPr>
+      <w:r>
+        <w:t>6 de octubre de 2026, en el sitio publicado: el generador produjo un borrador completo para "Analista de Recursos Humanos" en unos 17 segundos.</w:t>
+      </w:r>
+    </w:p>
+    <w:p>
+      <w:pPr>
+        <w:pStyle w:val="Prrafodelista"/>
+      </w:pPr>
+      <w:r>
+        <w:t>El chat respondió en unos 6 segundos e identificó correctamente los 4 niveles jerárquicos y los 3 puestos con descripción pendiente.</w:t>
+      </w:r>
+    </w:p>
+    <w:p>
+      <w:pPr>
+        <w:pStyle w:val="Prrafodelista"/>
+      </w:pPr>
+      <w:r>
+        <w:t>5 de octubre de 2026: se observaron errores 503 (modelo saturado) y 429 (cuota agotada) de Gemini con la cuenta gratuita; motivaron los modelos de respaldo y los mensajes de error.</w:t>
+      </w:r>
+    </w:p>
+    <w:p>
+      <w:pPr>
+        <w:pStyle w:val="Prrafodelista"/>
+      </w:pPr>
+      <w:r>
+        <w:t>Casos verificados en esta versión: CP-01, CP-02 y CP-11 (con IA real). Los demás casos de la sección 12.1 deben volver a ejecutarse durante la revisión del ingeniero.</w:t>
+      </w:r>
+    </w:p>
+    <w:p>
+      <w:pPr>
+        <w:pStyle w:val="Ttulo2"/>
+      </w:pPr>
+      <w:r>
+        <w:t>23.3 Validación de la Fase 1</w:t>
+      </w:r>
+    </w:p>
+    <w:p>
+      <w:pPr>
+        <w:spacing w:after="120" w:line="276" w:lineRule="auto"/>
+      </w:pPr>
+      <w:r>
+        <w:rPr>
+          <w:color w:val="172033"/>
+        </w:rPr>
+        <w:t>La validación la realiza el ingeniero a cargo del proyecto, siguiendo el guion de la sección 12.2 sobre el sitio publicado. Registro (completar después de la revisión):</w:t>
+      </w:r>
+    </w:p>
+    <w:p>
+      <w:pPr>
+        <w:pStyle w:val="Prrafodelista"/>
+      </w:pPr>
+      <w:r>
+        <w:t>Validador: ingeniero a cargo del proyecto. Fecha: pendiente.</w:t>
+      </w:r>
+    </w:p>
+    <w:p>
+      <w:pPr>
+        <w:pStyle w:val="Prrafodelista"/>
+      </w:pPr>
+      <w:r>
+        <w:t>Observaciones: pendiente.</w:t>
+      </w:r>
+    </w:p>
+    <w:p>
+      <w:pPr>
+        <w:pStyle w:val="Prrafodelista"/>
+      </w:pPr>
+      <w:r>
+        <w:t>Ajustes realizados: pendiente.</w:t>
+      </w:r>
+    </w:p>
+    <w:p>
+      <w:pPr>
+        <w:pStyle w:val="Prrafodelista"/>
+      </w:pPr>
+      <w:r>
+        <w:t>Decisión sobre la Fase 2: pendiente de luz verde.</w:t>
+      </w:r>
+    </w:p>
+    <w:p>
+      <w:pPr>
+        <w:pStyle w:val="Ttulo2"/>
+      </w:pPr>
+      <w:r>
+        <w:t>23.4 Pendientes y limitaciones conocidas</w:t>
+      </w:r>
+    </w:p>
+    <w:p>
+      <w:pPr>
+        <w:pStyle w:val="Prrafodelista"/>
+      </w:pPr>
+      <w:r>
+        <w:t>El agente de IA definitivo está pendiente de asignación por el ingeniero; la integración con Gemini es provisional y el proveedor se puede cambiar en lib/gemini.js.</w:t>
+      </w:r>
+    </w:p>
+    <w:p>
+      <w:pPr>
+        <w:pStyle w:val="Prrafodelista"/>
+      </w:pPr>
+      <w:r>
+        <w:t>El chat es un extra fuera del alcance (un solo agente); se mantiene sujeto a la aprobación del ingeniero.</w:t>
+      </w:r>
+    </w:p>
+    <w:p>
+      <w:pPr>
+        <w:pStyle w:val="Prrafodelista"/>
+      </w:pPr>
+      <w:r>
+        <w:t>Cuenta gratuita de Gemini: cuota baja, menor prioridad en horas de alta demanda y posible uso de los datos por Google; activar facturación antes de capturar datos reales.</w:t>
+      </w:r>
+    </w:p>
+    <w:p>
+      <w:pPr>
+        <w:pStyle w:val="Prrafodelista"/>
+      </w:pPr>
+      <w:r>
+        <w:t>El generador tarda entre 17 y 35 segundos; la meta de la Fase 2 es menos de 15 segundos.</w:t>
+      </w:r>
+    </w:p>
+    <w:p>
+      <w:pPr>
+        <w:pStyle w:val="Prrafodelista"/>
+      </w:pPr>
+      <w:r>
+        <w:t>Las funciones /api no requieren inicio de sesión ni tienen límite de uso; deben protegerse en la Fase 2.</w:t>
+      </w:r>
+    </w:p>
+    <w:p>
+      <w:pPr>
+        <w:pStyle w:val="Prrafodelista"/>
+      </w:pPr>
+      <w:r>
+        <w:t>Identidad visual: falta alinear con el manual de IOT Technologies la tipografía de títulos (Manrope a Open Sans/Roboto), el color de texto (#231F20), los colores de departamentos del organigrama y el espacio de protección del logo.</w:t>
+      </w:r>
+    </w:p>
+    <w:p>
+      <w:pPr>
         <w:jc w:val="center"/>
       </w:pPr>
       <w:r>
@@ -31271,7 +31612,7 @@
           <w:i/>
           <w:sz w:val="18"/>
         </w:rPr>
-        <w:t>Documento actualizado a partir del MVP HTML entregado el 2 de octubre de 2026.</w:t>
+        <w:t>Documento actualizado el 6 de octubre de 2026 (versión 3), a partir del MVP publicado en Vercel.</w:t>
       </w:r>
     </w:p>
     <w:sectPr>

</xml_diff>

<commit_message>
Documentación versión 5: backend con base de datos, login y permisos por rol
Co-Authored-By: Claude Opus 5.5 <noreply@anthropic.com>
</commit_message>
<xml_diff>
--- a/Documentacion_MVP_Plataforma.docx
+++ b/Documentacion_MVP_Plataforma.docx
@@ -497,7 +497,7 @@
                 <w:sz w:val="19"/>
                 <w:szCs w:val="19"/>
               </w:rPr>
-              <w:t>Vibe coding (HTML/CSS/JS), datos de ejemplo genéricos</w:t>
+              <w:t>Vibe coding (HTML/CSS/JS) + backend Node.js en Vercel con PostgreSQL; datos de ejemplo genéricos</w:t>
             </w:r>
           </w:p>
         </w:tc>
@@ -1001,7 +1001,7 @@
                 <w:sz w:val="19"/>
                 <w:szCs w:val="19"/>
               </w:rPr>
-              <w:t>Único rol simulado ("Empresa Demo · Administrador")</w:t>
+              <w:t>Cuenta de prueba con todos los permisos</w:t>
             </w:r>
           </w:p>
         </w:tc>
@@ -1133,7 +1133,7 @@
                 <w:sz w:val="19"/>
                 <w:szCs w:val="19"/>
               </w:rPr>
-              <w:t>No diferenciado</w:t>
+              <w:t>Cuenta de prueba con permisos propios (sección 25.3)</w:t>
             </w:r>
           </w:p>
         </w:tc>
@@ -1260,7 +1260,7 @@
                 <w:sz w:val="19"/>
                 <w:szCs w:val="19"/>
               </w:rPr>
-              <w:t>No diferenciado</w:t>
+              <w:t>Cuenta de prueba con permisos propios (sección 25.3)</w:t>
             </w:r>
           </w:p>
         </w:tc>
@@ -1391,7 +1391,7 @@
                 <w:sz w:val="19"/>
                 <w:szCs w:val="19"/>
               </w:rPr>
-              <w:t>No diferenciado</w:t>
+              <w:t>Cuenta de prueba con permisos propios (sección 25.3)</w:t>
             </w:r>
           </w:p>
         </w:tc>
@@ -4049,25 +4049,25 @@
               <w:bottom w:val="single" w:sz="4" w:space="0" w:color="D1D5DB"/>
               <w:right w:val="single" w:sz="4" w:space="0" w:color="D1D5DB"/>
             </w:tcBorders>
-            <w:shd w:val="clear" w:color="auto" w:fill="FDE8E8"/>
-            <w:tcMar>
-              <w:top w:w="70" w:type="dxa"/>
-              <w:left w:w="100" w:type="dxa"/>
-              <w:bottom w:w="70" w:type="dxa"/>
-              <w:right w:w="100" w:type="dxa"/>
-            </w:tcMar>
-          </w:tcPr>
-          <w:p>
-            <w:pPr>
-              <w:spacing w:after="20"/>
-            </w:pPr>
-            <w:r>
-              <w:rPr>
-                <w:color w:val="172033"/>
-                <w:sz w:val="19"/>
-                <w:szCs w:val="19"/>
-              </w:rPr>
-              <w:t>No</w:t>
+            <w:shd w:val="clear" w:color="auto" w:fill="FEF3C7"/>
+            <w:tcMar>
+              <w:top w:w="70" w:type="dxa"/>
+              <w:left w:w="100" w:type="dxa"/>
+              <w:bottom w:w="70" w:type="dxa"/>
+              <w:right w:w="100" w:type="dxa"/>
+            </w:tcMar>
+          </w:tcPr>
+          <w:p>
+            <w:pPr>
+              <w:spacing w:after="20"/>
+            </w:pPr>
+            <w:r>
+              <w:rPr>
+                <w:color w:val="172033"/>
+                <w:sz w:val="19"/>
+                <w:szCs w:val="19"/>
+              </w:rPr>
+              <w:t>Parcial: la API permite editar y cambiar a quién reporta; falta la pantalla</w:t>
             </w:r>
           </w:p>
         </w:tc>
@@ -4684,25 +4684,25 @@
               <w:bottom w:val="single" w:sz="4" w:space="0" w:color="D1D5DB"/>
               <w:right w:val="single" w:sz="4" w:space="0" w:color="D1D5DB"/>
             </w:tcBorders>
-            <w:shd w:val="clear" w:color="auto" w:fill="FDE8E8"/>
-            <w:tcMar>
-              <w:top w:w="70" w:type="dxa"/>
-              <w:left w:w="100" w:type="dxa"/>
-              <w:bottom w:w="70" w:type="dxa"/>
-              <w:right w:w="100" w:type="dxa"/>
-            </w:tcMar>
-          </w:tcPr>
-          <w:p>
-            <w:pPr>
-              <w:spacing w:after="20"/>
-            </w:pPr>
-            <w:r>
-              <w:rPr>
-                <w:color w:val="172033"/>
-                <w:sz w:val="19"/>
-                <w:szCs w:val="19"/>
-              </w:rPr>
-              <w:t>No</w:t>
+            <w:shd w:val="clear" w:color="auto" w:fill="E6F4EC"/>
+            <w:tcMar>
+              <w:top w:w="70" w:type="dxa"/>
+              <w:left w:w="100" w:type="dxa"/>
+              <w:bottom w:w="70" w:type="dxa"/>
+              <w:right w:w="100" w:type="dxa"/>
+            </w:tcMar>
+          </w:tcPr>
+          <w:p>
+            <w:pPr>
+              <w:spacing w:after="20"/>
+            </w:pPr>
+            <w:r>
+              <w:rPr>
+                <w:color w:val="172033"/>
+                <w:sz w:val="19"/>
+                <w:szCs w:val="19"/>
+              </w:rPr>
+              <w:t>Implementado: el servidor rechaza cambios que crearían ciclos</w:t>
             </w:r>
           </w:p>
         </w:tc>
@@ -8082,25 +8082,25 @@
               <w:bottom w:val="single" w:sz="4" w:space="0" w:color="D1D5DB"/>
               <w:right w:val="single" w:sz="4" w:space="0" w:color="D1D5DB"/>
             </w:tcBorders>
-            <w:shd w:val="clear" w:color="auto" w:fill="FDE8E8"/>
-            <w:tcMar>
-              <w:top w:w="70" w:type="dxa"/>
-              <w:left w:w="100" w:type="dxa"/>
-              <w:bottom w:w="70" w:type="dxa"/>
-              <w:right w:w="100" w:type="dxa"/>
-            </w:tcMar>
-          </w:tcPr>
-          <w:p>
-            <w:pPr>
-              <w:spacing w:after="20"/>
-            </w:pPr>
-            <w:r>
-              <w:rPr>
-                <w:color w:val="172033"/>
-                <w:sz w:val="19"/>
-                <w:szCs w:val="19"/>
-              </w:rPr>
-              <w:t>No</w:t>
+            <w:shd w:val="clear" w:color="auto" w:fill="FEF3C7"/>
+            <w:tcMar>
+              <w:top w:w="70" w:type="dxa"/>
+              <w:left w:w="100" w:type="dxa"/>
+              <w:bottom w:w="70" w:type="dxa"/>
+              <w:right w:w="100" w:type="dxa"/>
+            </w:tcMar>
+          </w:tcPr>
+          <w:p>
+            <w:pPr>
+              <w:spacing w:after="20"/>
+            </w:pPr>
+            <w:r>
+              <w:rPr>
+                <w:color w:val="172033"/>
+                <w:sz w:val="19"/>
+                <w:szCs w:val="19"/>
+              </w:rPr>
+              <w:t>Parcial: el historial anota "con apoyo de IA"; no se guarda la entrada ni la salida del modelo</w:t>
             </w:r>
           </w:p>
         </w:tc>
@@ -10732,7 +10732,7 @@
               <w:bottom w:val="single" w:sz="4" w:space="0" w:color="D1D5DB"/>
               <w:right w:val="single" w:sz="4" w:space="0" w:color="D1D5DB"/>
             </w:tcBorders>
-            <w:shd w:val="clear" w:color="auto" w:fill="FDE8E8"/>
+            <w:shd w:val="clear" w:color="auto" w:fill="E6F4EC"/>
             <w:tcMar>
               <w:top w:w="70" w:type="dxa"/>
               <w:left w:w="100" w:type="dxa"/>
@@ -10745,7 +10745,7 @@
               <w:rPr>
                 <w:sz w:val="18"/>
               </w:rPr>
-              <w:t>Parcial / simulado (cuentas demo; sin autenticación real)</w:t>
+              <w:t>Implementado: login real, contraseñas cifradas (scrypt) y sesión de 8 horas</w:t>
             </w:r>
           </w:p>
         </w:tc>
@@ -10889,7 +10889,7 @@
               <w:bottom w:val="single" w:sz="4" w:space="0" w:color="D1D5DB"/>
               <w:right w:val="single" w:sz="4" w:space="0" w:color="D1D5DB"/>
             </w:tcBorders>
-            <w:shd w:val="clear" w:color="auto" w:fill="FDE8E8"/>
+            <w:shd w:val="clear" w:color="auto" w:fill="E6F4EC"/>
             <w:tcMar>
               <w:top w:w="70" w:type="dxa"/>
               <w:left w:w="100" w:type="dxa"/>
@@ -10902,7 +10902,7 @@
               <w:rPr>
                 <w:sz w:val="18"/>
               </w:rPr>
-              <w:t>No (roles demo sin permisos diferenciados)</w:t>
+              <w:t>Implementado por rol, validado en el servidor (sección 25.3); sin multiempresa</w:t>
             </w:r>
           </w:p>
         </w:tc>
@@ -11199,7 +11199,7 @@
               <w:bottom w:val="single" w:sz="4" w:space="0" w:color="D1D5DB"/>
               <w:right w:val="single" w:sz="4" w:space="0" w:color="D1D5DB"/>
             </w:tcBorders>
-            <w:shd w:val="clear" w:color="auto" w:fill="FDE8E8"/>
+            <w:shd w:val="clear" w:color="auto" w:fill="FEF3C7"/>
             <w:tcMar>
               <w:top w:w="70" w:type="dxa"/>
               <w:left w:w="100" w:type="dxa"/>
@@ -11212,7 +11212,7 @@
               <w:rPr>
                 <w:sz w:val="18"/>
               </w:rPr>
-              <w:t>No</w:t>
+              <w:t>Parcial: historial con autor y fecha en procesos, competencias, políticas y KPIs</w:t>
             </w:r>
           </w:p>
         </w:tc>
@@ -17509,7 +17509,7 @@
               <w:rPr>
                 <w:sz w:val="18"/>
               </w:rPr>
-              <w:t>El inicio de sesión del MVP es demostrativo: utiliza cuentas predefinidas y la contraseña de prueba "demo2026"; no sustituye la autenticación real de la Fase 2.</w:t>
+              <w:t>El MVP usa inicio de sesión real con cuentas de prueba (contraseña demo2026, guardada cifrada). En producción cada empresa tendrá sus propios usuarios.</w:t>
             </w:r>
           </w:p>
         </w:tc>
@@ -17644,6 +17644,73 @@
                 <w:szCs w:val="19"/>
               </w:rPr>
               <w:t>En el MVP la aprobación es un registro simulado (quién y cuándo); no constituye una firma electrónica con validez legal.</w:t>
+            </w:r>
+          </w:p>
+        </w:tc>
+      </w:tr>
+      <w:tr>
+        <w:trPr>
+          <w:cantSplit/>
+        </w:trPr>
+        <w:tc>
+          <w:tcPr>
+            <w:tcW w:w="1100" w:type="dxa"/>
+            <w:tcBorders>
+              <w:top w:val="single" w:sz="4" w:space="0" w:color="D1D5DB"/>
+              <w:left w:val="single" w:sz="4" w:space="0" w:color="D1D5DB"/>
+              <w:bottom w:val="single" w:sz="4" w:space="0" w:color="D1D5DB"/>
+              <w:right w:val="single" w:sz="4" w:space="0" w:color="D1D5DB"/>
+            </w:tcBorders>
+            <w:tcMar>
+              <w:top w:w="70" w:type="dxa"/>
+              <w:left w:w="100" w:type="dxa"/>
+              <w:bottom w:w="70" w:type="dxa"/>
+              <w:right w:w="100" w:type="dxa"/>
+            </w:tcMar>
+          </w:tcPr>
+          <w:p>
+            <w:pPr>
+              <w:spacing w:after="20"/>
+            </w:pPr>
+            <w:r>
+              <w:rPr>
+                <w:b/>
+                <w:bCs/>
+                <w:color w:val="172033"/>
+                <w:sz w:val="19"/>
+                <w:szCs w:val="19"/>
+              </w:rPr>
+              <w:t>RN-15</w:t>
+            </w:r>
+          </w:p>
+        </w:tc>
+        <w:tc>
+          <w:tcPr>
+            <w:tcW w:w="8260" w:type="dxa"/>
+            <w:tcBorders>
+              <w:top w:val="single" w:sz="4" w:space="0" w:color="D1D5DB"/>
+              <w:left w:val="single" w:sz="4" w:space="0" w:color="D1D5DB"/>
+              <w:bottom w:val="single" w:sz="4" w:space="0" w:color="D1D5DB"/>
+              <w:right w:val="single" w:sz="4" w:space="0" w:color="D1D5DB"/>
+            </w:tcBorders>
+            <w:tcMar>
+              <w:top w:w="70" w:type="dxa"/>
+              <w:left w:w="100" w:type="dxa"/>
+              <w:bottom w:w="70" w:type="dxa"/>
+              <w:right w:w="100" w:type="dxa"/>
+            </w:tcMar>
+          </w:tcPr>
+          <w:p>
+            <w:pPr>
+              <w:spacing w:after="20"/>
+            </w:pPr>
+            <w:r>
+              <w:rPr>
+                <w:color w:val="172033"/>
+                <w:sz w:val="19"/>
+                <w:szCs w:val="19"/>
+              </w:rPr>
+              <w:t>Toda operación que modifica datos valida en el servidor la sesión, el permiso del rol y los datos; la interfaz solo oculta lo que el rol no puede hacer.</w:t>
             </w:r>
           </w:p>
         </w:tc>
@@ -18191,7 +18258,7 @@
                 <w:sz w:val="19"/>
                 <w:szCs w:val="19"/>
               </w:rPr>
-              <w:t>2</w:t>
+              <w:t>1 (parcial) y 2</w:t>
             </w:r>
           </w:p>
         </w:tc>
@@ -19284,7 +19351,7 @@
                 <w:sz w:val="19"/>
                 <w:szCs w:val="19"/>
               </w:rPr>
-              <w:t>localStorage del navegador</w:t>
+              <w:t>PostgreSQL (Neon) vía Kysely</w:t>
             </w:r>
           </w:p>
         </w:tc>
@@ -19310,7 +19377,7 @@
               <w:rPr>
                 <w:sz w:val="18"/>
               </w:rPr>
-              <w:t>localStorage con las claves do_v2_puestos y do_v2_collapsed; sessionStorage para la sesión demo. Los datos no se comparten entre usuarios ni dispositivos.</w:t>
+              <w:t>Base de datos en Neon conectada a Vercel (DATABASE_URL). Kysely genera SQL portable: cambiar a MySQL es cambiar DATABASE_URL a mysql://. El navegador solo guarda el estado de contraer/expandir del organigrama.</w:t>
             </w:r>
           </w:p>
         </w:tc>
@@ -19686,6 +19753,196 @@
                 <w:sz w:val="18"/>
               </w:rPr>
               <w:t>Git + GitHub (repositorio 2026-544-15---Plataforma-Desarrollo-Organizacional).</w:t>
+            </w:r>
+          </w:p>
+        </w:tc>
+      </w:tr>
+      <w:tr>
+        <w:trPr>
+          <w:cantSplit/>
+        </w:trPr>
+        <w:tc>
+          <w:tcPr>
+            <w:tcW w:w="1900" w:type="dxa"/>
+            <w:tcBorders>
+              <w:top w:val="single" w:sz="4" w:space="0" w:color="D1D5DB"/>
+              <w:left w:val="single" w:sz="4" w:space="0" w:color="D1D5DB"/>
+              <w:bottom w:val="single" w:sz="4" w:space="0" w:color="D1D5DB"/>
+              <w:right w:val="single" w:sz="4" w:space="0" w:color="D1D5DB"/>
+            </w:tcBorders>
+            <w:shd w:val="clear" w:color="auto" w:fill="F3F4F6"/>
+            <w:tcMar>
+              <w:top w:w="70" w:type="dxa"/>
+              <w:left w:w="100" w:type="dxa"/>
+              <w:bottom w:w="70" w:type="dxa"/>
+              <w:right w:w="100" w:type="dxa"/>
+            </w:tcMar>
+          </w:tcPr>
+          <w:p>
+            <w:pPr>
+              <w:spacing w:after="20"/>
+            </w:pPr>
+            <w:r>
+              <w:rPr>
+                <w:b/>
+                <w:bCs/>
+                <w:color w:val="172033"/>
+                <w:sz w:val="19"/>
+                <w:szCs w:val="19"/>
+              </w:rPr>
+              <w:t>Backend</w:t>
+            </w:r>
+          </w:p>
+        </w:tc>
+        <w:tc>
+          <w:tcPr>
+            <w:tcW w:w="2500" w:type="dxa"/>
+            <w:tcBorders>
+              <w:top w:val="single" w:sz="4" w:space="0" w:color="D1D5DB"/>
+              <w:left w:val="single" w:sz="4" w:space="0" w:color="D1D5DB"/>
+              <w:bottom w:val="single" w:sz="4" w:space="0" w:color="D1D5DB"/>
+              <w:right w:val="single" w:sz="4" w:space="0" w:color="D1D5DB"/>
+            </w:tcBorders>
+            <w:shd w:val="clear" w:color="auto" w:fill="F3F4F6"/>
+            <w:tcMar>
+              <w:top w:w="70" w:type="dxa"/>
+              <w:left w:w="100" w:type="dxa"/>
+              <w:bottom w:w="70" w:type="dxa"/>
+              <w:right w:w="100" w:type="dxa"/>
+            </w:tcMar>
+          </w:tcPr>
+          <w:p>
+            <w:pPr>
+              <w:spacing w:after="20"/>
+            </w:pPr>
+            <w:r>
+              <w:rPr>
+                <w:color w:val="172033"/>
+                <w:sz w:val="19"/>
+                <w:szCs w:val="19"/>
+              </w:rPr>
+              <w:t>Node.js (funciones de Vercel)</w:t>
+            </w:r>
+          </w:p>
+        </w:tc>
+        <w:tc>
+          <w:tcPr>
+            <w:tcW w:w="4960" w:type="dxa"/>
+            <w:tcBorders>
+              <w:top w:val="single" w:sz="4" w:space="0" w:color="D1D5DB"/>
+              <w:left w:val="single" w:sz="4" w:space="0" w:color="D1D5DB"/>
+              <w:bottom w:val="single" w:sz="4" w:space="0" w:color="D1D5DB"/>
+              <w:right w:val="single" w:sz="4" w:space="0" w:color="D1D5DB"/>
+            </w:tcBorders>
+            <w:shd w:val="clear" w:color="auto" w:fill="F3F4F6"/>
+            <w:tcMar>
+              <w:top w:w="70" w:type="dxa"/>
+              <w:left w:w="100" w:type="dxa"/>
+              <w:bottom w:w="70" w:type="dxa"/>
+              <w:right w:w="100" w:type="dxa"/>
+            </w:tcMar>
+          </w:tcPr>
+          <w:p>
+            <w:r>
+              <w:rPr>
+                <w:sz w:val="18"/>
+              </w:rPr>
+              <w:t>Endpoints en /api: auth, data, items, generate, draft y chat. Validan sesión, rol y datos en el servidor.</w:t>
+            </w:r>
+          </w:p>
+        </w:tc>
+      </w:tr>
+      <w:tr>
+        <w:trPr>
+          <w:cantSplit/>
+        </w:trPr>
+        <w:tc>
+          <w:tcPr>
+            <w:tcW w:w="1900" w:type="dxa"/>
+            <w:tcBorders>
+              <w:top w:val="single" w:sz="4" w:space="0" w:color="D1D5DB"/>
+              <w:left w:val="single" w:sz="4" w:space="0" w:color="D1D5DB"/>
+              <w:bottom w:val="single" w:sz="4" w:space="0" w:color="D1D5DB"/>
+              <w:right w:val="single" w:sz="4" w:space="0" w:color="D1D5DB"/>
+            </w:tcBorders>
+            <w:shd w:val="clear" w:color="auto" w:fill="F3F4F6"/>
+            <w:tcMar>
+              <w:top w:w="70" w:type="dxa"/>
+              <w:left w:w="100" w:type="dxa"/>
+              <w:bottom w:w="70" w:type="dxa"/>
+              <w:right w:w="100" w:type="dxa"/>
+            </w:tcMar>
+          </w:tcPr>
+          <w:p>
+            <w:pPr>
+              <w:spacing w:after="20"/>
+            </w:pPr>
+            <w:r>
+              <w:rPr>
+                <w:b/>
+                <w:bCs/>
+                <w:color w:val="172033"/>
+                <w:sz w:val="19"/>
+                <w:szCs w:val="19"/>
+              </w:rPr>
+              <w:t>Autenticación</w:t>
+            </w:r>
+          </w:p>
+        </w:tc>
+        <w:tc>
+          <w:tcPr>
+            <w:tcW w:w="2500" w:type="dxa"/>
+            <w:tcBorders>
+              <w:top w:val="single" w:sz="4" w:space="0" w:color="D1D5DB"/>
+              <w:left w:val="single" w:sz="4" w:space="0" w:color="D1D5DB"/>
+              <w:bottom w:val="single" w:sz="4" w:space="0" w:color="D1D5DB"/>
+              <w:right w:val="single" w:sz="4" w:space="0" w:color="D1D5DB"/>
+            </w:tcBorders>
+            <w:shd w:val="clear" w:color="auto" w:fill="F3F4F6"/>
+            <w:tcMar>
+              <w:top w:w="70" w:type="dxa"/>
+              <w:left w:w="100" w:type="dxa"/>
+              <w:bottom w:w="70" w:type="dxa"/>
+              <w:right w:w="100" w:type="dxa"/>
+            </w:tcMar>
+          </w:tcPr>
+          <w:p>
+            <w:pPr>
+              <w:spacing w:after="20"/>
+            </w:pPr>
+            <w:r>
+              <w:rPr>
+                <w:color w:val="172033"/>
+                <w:sz w:val="19"/>
+                <w:szCs w:val="19"/>
+              </w:rPr>
+              <w:t>Cookie de sesión firmada + scrypt</w:t>
+            </w:r>
+          </w:p>
+        </w:tc>
+        <w:tc>
+          <w:tcPr>
+            <w:tcW w:w="4960" w:type="dxa"/>
+            <w:tcBorders>
+              <w:top w:val="single" w:sz="4" w:space="0" w:color="D1D5DB"/>
+              <w:left w:val="single" w:sz="4" w:space="0" w:color="D1D5DB"/>
+              <w:bottom w:val="single" w:sz="4" w:space="0" w:color="D1D5DB"/>
+              <w:right w:val="single" w:sz="4" w:space="0" w:color="D1D5DB"/>
+            </w:tcBorders>
+            <w:shd w:val="clear" w:color="auto" w:fill="F3F4F6"/>
+            <w:tcMar>
+              <w:top w:w="70" w:type="dxa"/>
+              <w:left w:w="100" w:type="dxa"/>
+              <w:bottom w:w="70" w:type="dxa"/>
+              <w:right w:w="100" w:type="dxa"/>
+            </w:tcMar>
+          </w:tcPr>
+          <w:p>
+            <w:r>
+              <w:rPr>
+                <w:sz w:val="18"/>
+              </w:rPr>
+              <w:t>Contraseñas cifradas, sesión de 8 horas, permisos por rol.</w:t>
             </w:r>
           </w:p>
         </w:tc>
@@ -20088,7 +20345,7 @@
                 <w:sz w:val="19"/>
                 <w:szCs w:val="19"/>
               </w:rPr>
-              <w:t>PostgreSQL 16 (SQLite solo en desarrollo)</w:t>
+              <w:t>PostgreSQL (ya usado en el MVP con Neon) o MySQL, por confirmar con el ingeniero</w:t>
             </w:r>
           </w:p>
         </w:tc>
@@ -20118,7 +20375,7 @@
                 <w:sz w:val="19"/>
                 <w:szCs w:val="19"/>
               </w:rPr>
-              <w:t>Robusta, adecuada para multiempresa y JSON</w:t>
+              <w:t>El backend del MVP es portable entre ambos; Django soporta los dos motores</w:t>
             </w:r>
           </w:p>
         </w:tc>
@@ -21565,7 +21822,7 @@
               <w:rPr>
                 <w:sz w:val="18"/>
               </w:rPr>
-              <w:t>seed (9 puestos de ejemplo) · puestos · collapsed · cuentas demo</w:t>
+              <w:t>Datos de ejemplo en lib/seed.js; se cargan en la base de datos la primera vez. La página los lee de /api/data.</w:t>
             </w:r>
           </w:p>
         </w:tc>
@@ -21751,7 +22008,7 @@
               <w:rPr>
                 <w:sz w:val="18"/>
               </w:rPr>
-              <w:t>package.json, .env.example (GEMINI_API_KEY) y .gitignore; la clave real solo se guarda en las variables de entorno de Vercel</w:t>
+              <w:t>package.json (dependencias kysely, pg y mysql2), .env.example y .gitignore; GEMINI_API_KEY y DATABASE_URL solo se guardan en las variables de entorno de Vercel</w:t>
             </w:r>
           </w:p>
         </w:tc>
@@ -21813,7 +22070,193 @@
               <w:rPr>
                 <w:sz w:val="18"/>
               </w:rPr>
-              <w:t>Configuración de los 4 módulos nuevos: listado, filtros, detalle, formulario con IA, flujo de aprobación, versiones, diagrama de flujo y gráfica de KPIs; datos en localStorage con claves do_v3_*</w:t>
+              <w:t>Configuración de los 4 módulos nuevos: listado, filtros, detalle, formulario con IA, flujo de aprobación, versiones, diagrama de flujo y gráfica de KPIs; lee y guarda los datos mediante /api/data y /api/items</w:t>
+            </w:r>
+          </w:p>
+        </w:tc>
+      </w:tr>
+      <w:tr>
+        <w:trPr>
+          <w:cantSplit/>
+        </w:trPr>
+        <w:tc>
+          <w:tcPr>
+            <w:tcW w:w="2200" w:type="dxa"/>
+            <w:tcBorders>
+              <w:top w:val="single" w:sz="4" w:space="0" w:color="D1D5DB"/>
+              <w:left w:val="single" w:sz="4" w:space="0" w:color="D1D5DB"/>
+              <w:bottom w:val="single" w:sz="4" w:space="0" w:color="D1D5DB"/>
+              <w:right w:val="single" w:sz="4" w:space="0" w:color="D1D5DB"/>
+            </w:tcBorders>
+            <w:tcMar>
+              <w:top w:w="70" w:type="dxa"/>
+              <w:left w:w="100" w:type="dxa"/>
+              <w:bottom w:w="70" w:type="dxa"/>
+              <w:right w:w="100" w:type="dxa"/>
+            </w:tcMar>
+          </w:tcPr>
+          <w:p>
+            <w:pPr>
+              <w:spacing w:after="20"/>
+            </w:pPr>
+            <w:r>
+              <w:rPr>
+                <w:b/>
+                <w:bCs/>
+                <w:color w:val="172033"/>
+                <w:sz w:val="19"/>
+                <w:szCs w:val="19"/>
+              </w:rPr>
+              <w:t>API de datos</w:t>
+            </w:r>
+          </w:p>
+        </w:tc>
+        <w:tc>
+          <w:tcPr>
+            <w:tcW w:w="7160" w:type="dxa"/>
+            <w:tcBorders>
+              <w:top w:val="single" w:sz="4" w:space="0" w:color="D1D5DB"/>
+              <w:left w:val="single" w:sz="4" w:space="0" w:color="D1D5DB"/>
+              <w:bottom w:val="single" w:sz="4" w:space="0" w:color="D1D5DB"/>
+              <w:right w:val="single" w:sz="4" w:space="0" w:color="D1D5DB"/>
+            </w:tcBorders>
+            <w:tcMar>
+              <w:top w:w="70" w:type="dxa"/>
+              <w:left w:w="100" w:type="dxa"/>
+              <w:bottom w:w="70" w:type="dxa"/>
+              <w:right w:w="100" w:type="dxa"/>
+            </w:tcMar>
+          </w:tcPr>
+          <w:p>
+            <w:r>
+              <w:rPr>
+                <w:sz w:val="18"/>
+              </w:rPr>
+              <w:t>api/auth.js (inicio y cierre de sesión), api/data.js (lectura de todos los módulos), api/items.js (altas, cambios, flujo de aprobación, bajas y restablecer)</w:t>
+            </w:r>
+          </w:p>
+        </w:tc>
+      </w:tr>
+      <w:tr>
+        <w:trPr>
+          <w:cantSplit/>
+        </w:trPr>
+        <w:tc>
+          <w:tcPr>
+            <w:tcW w:w="2200" w:type="dxa"/>
+            <w:tcBorders>
+              <w:top w:val="single" w:sz="4" w:space="0" w:color="D1D5DB"/>
+              <w:left w:val="single" w:sz="4" w:space="0" w:color="D1D5DB"/>
+              <w:bottom w:val="single" w:sz="4" w:space="0" w:color="D1D5DB"/>
+              <w:right w:val="single" w:sz="4" w:space="0" w:color="D1D5DB"/>
+            </w:tcBorders>
+            <w:tcMar>
+              <w:top w:w="70" w:type="dxa"/>
+              <w:left w:w="100" w:type="dxa"/>
+              <w:bottom w:w="70" w:type="dxa"/>
+              <w:right w:w="100" w:type="dxa"/>
+            </w:tcMar>
+          </w:tcPr>
+          <w:p>
+            <w:pPr>
+              <w:spacing w:after="20"/>
+            </w:pPr>
+            <w:r>
+              <w:rPr>
+                <w:b/>
+                <w:bCs/>
+                <w:color w:val="172033"/>
+                <w:sz w:val="19"/>
+                <w:szCs w:val="19"/>
+              </w:rPr>
+              <w:t>Librerías del servidor (lib)</w:t>
+            </w:r>
+          </w:p>
+        </w:tc>
+        <w:tc>
+          <w:tcPr>
+            <w:tcW w:w="7160" w:type="dxa"/>
+            <w:tcBorders>
+              <w:top w:val="single" w:sz="4" w:space="0" w:color="D1D5DB"/>
+              <w:left w:val="single" w:sz="4" w:space="0" w:color="D1D5DB"/>
+              <w:bottom w:val="single" w:sz="4" w:space="0" w:color="D1D5DB"/>
+              <w:right w:val="single" w:sz="4" w:space="0" w:color="D1D5DB"/>
+            </w:tcBorders>
+            <w:tcMar>
+              <w:top w:w="70" w:type="dxa"/>
+              <w:left w:w="100" w:type="dxa"/>
+              <w:bottom w:w="70" w:type="dxa"/>
+              <w:right w:w="100" w:type="dxa"/>
+            </w:tcMar>
+          </w:tcPr>
+          <w:p>
+            <w:r>
+              <w:rPr>
+                <w:sz w:val="18"/>
+              </w:rPr>
+              <w:t>db.js (conexión, tablas y datos de ejemplo), auth.js (sesión y permisos), password.js (scrypt), validar.js (validación por módulo), http.js, gemini.js, seed.js</w:t>
+            </w:r>
+          </w:p>
+        </w:tc>
+      </w:tr>
+      <w:tr>
+        <w:trPr>
+          <w:cantSplit/>
+        </w:trPr>
+        <w:tc>
+          <w:tcPr>
+            <w:tcW w:w="2200" w:type="dxa"/>
+            <w:tcBorders>
+              <w:top w:val="single" w:sz="4" w:space="0" w:color="D1D5DB"/>
+              <w:left w:val="single" w:sz="4" w:space="0" w:color="D1D5DB"/>
+              <w:bottom w:val="single" w:sz="4" w:space="0" w:color="D1D5DB"/>
+              <w:right w:val="single" w:sz="4" w:space="0" w:color="D1D5DB"/>
+            </w:tcBorders>
+            <w:tcMar>
+              <w:top w:w="70" w:type="dxa"/>
+              <w:left w:w="100" w:type="dxa"/>
+              <w:bottom w:w="70" w:type="dxa"/>
+              <w:right w:w="100" w:type="dxa"/>
+            </w:tcMar>
+          </w:tcPr>
+          <w:p>
+            <w:pPr>
+              <w:spacing w:after="20"/>
+            </w:pPr>
+            <w:r>
+              <w:rPr>
+                <w:b/>
+                <w:bCs/>
+                <w:color w:val="172033"/>
+                <w:sz w:val="19"/>
+                <w:szCs w:val="19"/>
+              </w:rPr>
+              <w:t>Desarrollo local</w:t>
+            </w:r>
+          </w:p>
+        </w:tc>
+        <w:tc>
+          <w:tcPr>
+            <w:tcW w:w="7160" w:type="dxa"/>
+            <w:tcBorders>
+              <w:top w:val="single" w:sz="4" w:space="0" w:color="D1D5DB"/>
+              <w:left w:val="single" w:sz="4" w:space="0" w:color="D1D5DB"/>
+              <w:bottom w:val="single" w:sz="4" w:space="0" w:color="D1D5DB"/>
+              <w:right w:val="single" w:sz="4" w:space="0" w:color="D1D5DB"/>
+            </w:tcBorders>
+            <w:tcMar>
+              <w:top w:w="70" w:type="dxa"/>
+              <w:left w:w="100" w:type="dxa"/>
+              <w:bottom w:w="70" w:type="dxa"/>
+              <w:right w:w="100" w:type="dxa"/>
+            </w:tcMar>
+          </w:tcPr>
+          <w:p>
+            <w:r>
+              <w:rPr>
+                <w:sz w:val="18"/>
+              </w:rPr>
+              <w:t>scripts/dev.mjs: npm run dev levanta la página y la API en http://localhost:3000 con PostgreSQL en memoria (PGlite) si no hay DATABASE_URL</w:t>
             </w:r>
           </w:p>
         </w:tc>
@@ -22208,7 +22651,7 @@
           <w:sz w:val="17"/>
           <w:szCs w:val="17"/>
         </w:rPr>
-        <w:t>// Puesto (arreglo "puestos")</w:t>
+        <w:t>// Tablas en PostgreSQL (Neon), creadas automáticamente por lib/db.js</w:t>
       </w:r>
     </w:p>
     <w:p>
@@ -22220,7 +22663,13 @@
         <w:ind w:left="120"/>
       </w:pPr>
       <w:r>
-        <w:t>{ id, parent, name, dept, resp, obj, comp[], perfil, status }</w:t>
+        <w:rPr>
+          <w:rFonts w:ascii="Consolas" w:eastAsia="Consolas" w:hAnsi="Consolas" w:cs="Consolas"/>
+          <w:color w:val="172033"/>
+          <w:sz w:val="17"/>
+          <w:szCs w:val="17"/>
+        </w:rPr>
+        <w:t>usuarios   (id, email, nombre, rol, pass_hash, activo, creado_el)</w:t>
       </w:r>
     </w:p>
     <w:p>
@@ -22232,7 +22681,67 @@
         <w:ind w:left="120"/>
       </w:pPr>
       <w:r>
-        <w:t>// status: "Completa" | "Pendiente"</w:t>
+        <w:rPr>
+          <w:rFonts w:ascii="Consolas" w:eastAsia="Consolas" w:hAnsi="Consolas" w:cs="Consolas"/>
+          <w:color w:val="172033"/>
+          <w:sz w:val="17"/>
+          <w:szCs w:val="17"/>
+        </w:rPr>
+        <w:t>puestos    (id, parent_id, nombre, dept, resp, obj, comp, perfil, estado, creado_por, actualizado_el)</w:t>
+      </w:r>
+    </w:p>
+    <w:p>
+      <w:pPr>
+        <w:pBdr>
+          <w:left w:val="single" w:sz="12" w:space="6" w:color="3157D5"/>
+        </w:pBdr>
+        <w:shd w:val="clear" w:color="auto" w:fill="F3F4F6"/>
+        <w:ind w:left="120"/>
+      </w:pPr>
+      <w:r>
+        <w:rPr>
+          <w:rFonts w:ascii="Consolas" w:eastAsia="Consolas" w:hAnsi="Consolas" w:cs="Consolas"/>
+          <w:color w:val="172033"/>
+          <w:sz w:val="17"/>
+          <w:szCs w:val="17"/>
+        </w:rPr>
+        <w:t>documentos (id, modulo, codigo, nombre, estado, version, datos, aprobado_por, aprobado_el, creado_por, actualizado_el)</w:t>
+      </w:r>
+    </w:p>
+    <w:p>
+      <w:pPr>
+        <w:pBdr>
+          <w:left w:val="single" w:sz="12" w:space="6" w:color="3157D5"/>
+        </w:pBdr>
+        <w:shd w:val="clear" w:color="auto" w:fill="F3F4F6"/>
+        <w:ind w:left="120"/>
+      </w:pPr>
+      <w:r>
+        <w:rPr>
+          <w:rFonts w:ascii="Consolas" w:eastAsia="Consolas" w:hAnsi="Consolas" w:cs="Consolas"/>
+          <w:color w:val="172033"/>
+          <w:sz w:val="17"/>
+          <w:szCs w:val="17"/>
+        </w:rPr>
+        <w:t>historial  (id, modulo, registro_id, version, fecha, autor, nota)</w:t>
+      </w:r>
+    </w:p>
+    <w:p>
+      <w:pPr>
+        <w:pBdr>
+          <w:left w:val="single" w:sz="12" w:space="6" w:color="3157D5"/>
+        </w:pBdr>
+        <w:shd w:val="clear" w:color="auto" w:fill="F3F4F6"/>
+        <w:ind w:left="120"/>
+      </w:pPr>
+      <w:r>
+        <w:rPr>
+          <w:rFonts w:ascii="Consolas" w:eastAsia="Consolas" w:hAnsi="Consolas" w:cs="Consolas"/>
+          <w:color w:val="172033"/>
+          <w:sz w:val="17"/>
+          <w:szCs w:val="17"/>
+        </w:rPr>
+        <w:t>config     (clave, valor)</w:t>
       </w:r>
     </w:p>
     <w:p>
@@ -22255,72 +22764,13 @@
     </w:p>
     <w:p>
       <w:pPr>
-        <w:pBdr>
-          <w:left w:val="single" w:sz="12" w:space="6" w:color="3157D5"/>
-        </w:pBdr>
-        <w:shd w:val="clear" w:color="auto" w:fill="F3F4F6"/>
-        <w:ind w:left="120"/>
-      </w:pPr>
-      <w:r>
-        <w:rPr>
-          <w:rFonts w:ascii="Consolas" w:eastAsia="Consolas" w:hAnsi="Consolas" w:cs="Consolas"/>
-          <w:color w:val="172033"/>
-          <w:sz w:val="17"/>
-          <w:szCs w:val="17"/>
-        </w:rPr>
-        <w:t>// Puesto agregado desde el organigrama (arreglo "orgExtra")</w:t>
-      </w:r>
-    </w:p>
-    <w:p>
-      <w:pPr>
-        <w:pBdr>
-          <w:left w:val="single" w:sz="12" w:space="6" w:color="3157D5"/>
-        </w:pBdr>
-        <w:shd w:val="clear" w:color="auto" w:fill="F3F4F6"/>
-        <w:ind w:left="120"/>
-      </w:pPr>
-      <w:r>
-        <w:rPr>
-          <w:rFonts w:ascii="Consolas" w:eastAsia="Consolas" w:hAnsi="Consolas" w:cs="Consolas"/>
-          <w:color w:val="172033"/>
-          <w:sz w:val="17"/>
-          <w:szCs w:val="17"/>
-        </w:rPr>
-        <w:t>{ id, name, dept, resp, status, reports }</w:t>
-      </w:r>
-    </w:p>
-    <w:p>
-      <w:pPr>
-        <w:pBdr>
-          <w:left w:val="single" w:sz="12" w:space="6" w:color="3157D5"/>
-        </w:pBdr>
-        <w:shd w:val="clear" w:color="auto" w:fill="F3F4F6"/>
-        <w:ind w:left="120"/>
-      </w:pPr>
-      <w:r>
-        <w:rPr>
-          <w:rFonts w:ascii="Consolas" w:eastAsia="Consolas" w:hAnsi="Consolas" w:cs="Consolas"/>
-          <w:color w:val="172033"/>
-          <w:sz w:val="17"/>
-          <w:szCs w:val="17"/>
-        </w:rPr>
-        <w:t xml:space="preserve"> </w:t>
-      </w:r>
-    </w:p>
-    <w:p>
-      <w:pPr>
-        <w:spacing w:after="80"/>
-      </w:pPr>
-    </w:p>
-    <w:p>
-      <w:pPr>
         <w:spacing w:after="120" w:line="276" w:lineRule="auto"/>
       </w:pPr>
       <w:r>
         <w:rPr>
           <w:color w:val="172033"/>
         </w:rPr>
-        <w:t>Módulos nuevos (modulos.js): arreglos procesos, competencias, politicas y kpis guardados en localStorage (claves do_v3_*). Todos comparten id, codigo, version, estado (Borrador / En revisión / Aprobado), aprobadoPor, aprobadoEl e historial [{v, fecha, autor, nota}]. Procesos guardan pasos [{actividad, responsable}]; competencias, niveles[4] y puestos[]; políticas, aplica[] y lineamientos[]; KPIs, formula, meta, sentido, frecuencia y valores[].</w:t>
+        <w:t>Procesos, competencias, políticas y KPIs comparten la tabla documentos (columna modulo); sus campos propios van en datos como JSON en texto, igual que las listas de competencias de un puesto. Así el mismo esquema funciona en PostgreSQL y en MySQL. La tabla historial guarda cada cambio con versión, fecha y autor. En la Fase 2 estas estructuras se normalizan en las tablas de la sección 8.2.</w:t>
       </w:r>
     </w:p>
     <w:p>
@@ -27781,7 +28231,7 @@
                 <w:sz w:val="19"/>
                 <w:szCs w:val="19"/>
               </w:rPr>
-              <w:t>Cookies seguras, protección CSRF de Django, HTTPS obligatorio</w:t>
+              <w:t>MVP: cookie de sesión firmada (HMAC), HttpOnly, Secure y SameSite=Lax, válida 8 horas; las peticiones que modifican datos exigen el encabezado X-Requested-With (implementado). Fase 2: protección CSRF de Django.</w:t>
             </w:r>
           </w:p>
         </w:tc>
@@ -27850,7 +28300,7 @@
                 <w:sz w:val="19"/>
                 <w:szCs w:val="19"/>
               </w:rPr>
-              <w:t>Hash con los algoritmos de Django; sin contraseñas en texto plano</w:t>
+              <w:t>MVP: scrypt con sal aleatoria, sin contraseñas en texto plano (implementado). Fase 2: algoritmos de Django.</w:t>
             </w:r>
           </w:p>
         </w:tc>
@@ -27917,7 +28367,7 @@
                 <w:sz w:val="19"/>
                 <w:szCs w:val="19"/>
               </w:rPr>
-              <w:t>Solo en variables de entorno del servidor; nunca en el navegador ni en el repositorio</w:t>
+              <w:t>Solo en variables de entorno del servidor (GEMINI_API_KEY, DATABASE_URL); nunca en el navegador ni en el repositorio (implementado).</w:t>
             </w:r>
           </w:p>
         </w:tc>
@@ -28054,6 +28504,75 @@
                 <w:szCs w:val="19"/>
               </w:rPr>
               <w:t>Respaldo diario y prueba de restauración</w:t>
+            </w:r>
+          </w:p>
+        </w:tc>
+      </w:tr>
+      <w:tr>
+        <w:trPr>
+          <w:cantSplit/>
+        </w:trPr>
+        <w:tc>
+          <w:tcPr>
+            <w:tcW w:w="2600" w:type="dxa"/>
+            <w:tcBorders>
+              <w:top w:val="single" w:sz="4" w:space="0" w:color="D1D5DB"/>
+              <w:left w:val="single" w:sz="4" w:space="0" w:color="D1D5DB"/>
+              <w:bottom w:val="single" w:sz="4" w:space="0" w:color="D1D5DB"/>
+              <w:right w:val="single" w:sz="4" w:space="0" w:color="D1D5DB"/>
+            </w:tcBorders>
+            <w:shd w:val="clear" w:color="auto" w:fill="F3F4F6"/>
+            <w:tcMar>
+              <w:top w:w="70" w:type="dxa"/>
+              <w:left w:w="100" w:type="dxa"/>
+              <w:bottom w:w="70" w:type="dxa"/>
+              <w:right w:w="100" w:type="dxa"/>
+            </w:tcMar>
+          </w:tcPr>
+          <w:p>
+            <w:pPr>
+              <w:spacing w:after="20"/>
+            </w:pPr>
+            <w:r>
+              <w:rPr>
+                <w:b/>
+                <w:bCs/>
+                <w:color w:val="172033"/>
+                <w:sz w:val="19"/>
+                <w:szCs w:val="19"/>
+              </w:rPr>
+              <w:t>Uso indebido de la IA</w:t>
+            </w:r>
+          </w:p>
+        </w:tc>
+        <w:tc>
+          <w:tcPr>
+            <w:tcW w:w="6760" w:type="dxa"/>
+            <w:tcBorders>
+              <w:top w:val="single" w:sz="4" w:space="0" w:color="D1D5DB"/>
+              <w:left w:val="single" w:sz="4" w:space="0" w:color="D1D5DB"/>
+              <w:bottom w:val="single" w:sz="4" w:space="0" w:color="D1D5DB"/>
+              <w:right w:val="single" w:sz="4" w:space="0" w:color="D1D5DB"/>
+            </w:tcBorders>
+            <w:shd w:val="clear" w:color="auto" w:fill="F3F4F6"/>
+            <w:tcMar>
+              <w:top w:w="70" w:type="dxa"/>
+              <w:left w:w="100" w:type="dxa"/>
+              <w:bottom w:w="70" w:type="dxa"/>
+              <w:right w:w="100" w:type="dxa"/>
+            </w:tcMar>
+          </w:tcPr>
+          <w:p>
+            <w:pPr>
+              <w:spacing w:after="20"/>
+            </w:pPr>
+            <w:r>
+              <w:rPr>
+                <w:color w:val="172033"/>
+                <w:sz w:val="19"/>
+                <w:szCs w:val="19"/>
+              </w:rPr>
+              <w:t>Los endpoints de IA exigen sesión iniciada (implementado). Pendiente: límite de solicitudes por usuario.</w:t>
             </w:r>
           </w:p>
         </w:tc>
@@ -29151,6 +29670,252 @@
                 <w:sz w:val="18"/>
               </w:rPr>
               <w:t>Se muestra la gráfica contra la meta y el semáforo.</w:t>
+            </w:r>
+          </w:p>
+        </w:tc>
+      </w:tr>
+      <w:tr>
+        <w:tc>
+          <w:tcPr>
+            <w:tcW w:w="900" w:type="dxa"/>
+          </w:tcPr>
+          <w:p>
+            <w:r>
+              <w:rPr>
+                <w:sz w:val="18"/>
+              </w:rPr>
+              <w:t>CP-24</w:t>
+            </w:r>
+          </w:p>
+        </w:tc>
+        <w:tc>
+          <w:tcPr>
+            <w:tcW w:w="3960" w:type="dxa"/>
+          </w:tcPr>
+          <w:p>
+            <w:r>
+              <w:rPr>
+                <w:sz w:val="18"/>
+              </w:rPr>
+              <w:t>Iniciar sesión con contraseña incorrecta</w:t>
+            </w:r>
+          </w:p>
+        </w:tc>
+        <w:tc>
+          <w:tcPr>
+            <w:tcW w:w="4500" w:type="dxa"/>
+          </w:tcPr>
+          <w:p>
+            <w:r>
+              <w:rPr>
+                <w:sz w:val="18"/>
+              </w:rPr>
+              <w:t>Se muestra "Correo o contraseña incorrectos" y no se entra.</w:t>
+            </w:r>
+          </w:p>
+        </w:tc>
+      </w:tr>
+      <w:tr>
+        <w:tc>
+          <w:tcPr>
+            <w:tcW w:w="900" w:type="dxa"/>
+          </w:tcPr>
+          <w:p>
+            <w:r>
+              <w:rPr>
+                <w:sz w:val="18"/>
+              </w:rPr>
+              <w:t>CP-25</w:t>
+            </w:r>
+          </w:p>
+        </w:tc>
+        <w:tc>
+          <w:tcPr>
+            <w:tcW w:w="3960" w:type="dxa"/>
+          </w:tcPr>
+          <w:p>
+            <w:r>
+              <w:rPr>
+                <w:sz w:val="18"/>
+              </w:rPr>
+              <w:t>Entrar como Recursos Humanos y abrir Procesos ISO</w:t>
+            </w:r>
+          </w:p>
+        </w:tc>
+        <w:tc>
+          <w:tcPr>
+            <w:tcW w:w="4500" w:type="dxa"/>
+          </w:tcPr>
+          <w:p>
+            <w:r>
+              <w:rPr>
+                <w:sz w:val="18"/>
+              </w:rPr>
+              <w:t>No aparece "Nuevo proceso" y el detalle es solo de consulta.</w:t>
+            </w:r>
+          </w:p>
+        </w:tc>
+      </w:tr>
+      <w:tr>
+        <w:tc>
+          <w:tcPr>
+            <w:tcW w:w="900" w:type="dxa"/>
+          </w:tcPr>
+          <w:p>
+            <w:r>
+              <w:rPr>
+                <w:sz w:val="18"/>
+              </w:rPr>
+              <w:t>CP-26</w:t>
+            </w:r>
+          </w:p>
+        </w:tc>
+        <w:tc>
+          <w:tcPr>
+            <w:tcW w:w="3960" w:type="dxa"/>
+          </w:tcPr>
+          <w:p>
+            <w:r>
+              <w:rPr>
+                <w:sz w:val="18"/>
+              </w:rPr>
+              <w:t>Entrar como Dirección y abrir una política en revisión</w:t>
+            </w:r>
+          </w:p>
+        </w:tc>
+        <w:tc>
+          <w:tcPr>
+            <w:tcW w:w="4500" w:type="dxa"/>
+          </w:tcPr>
+          <w:p>
+            <w:r>
+              <w:rPr>
+                <w:sz w:val="18"/>
+              </w:rPr>
+              <w:t>Aparece "Aprobar" y al aprobar se registra el nombre de Dirección.</w:t>
+            </w:r>
+          </w:p>
+        </w:tc>
+      </w:tr>
+      <w:tr>
+        <w:tc>
+          <w:tcPr>
+            <w:tcW w:w="900" w:type="dxa"/>
+          </w:tcPr>
+          <w:p>
+            <w:r>
+              <w:rPr>
+                <w:sz w:val="18"/>
+              </w:rPr>
+              <w:t>CP-27</w:t>
+            </w:r>
+          </w:p>
+        </w:tc>
+        <w:tc>
+          <w:tcPr>
+            <w:tcW w:w="3960" w:type="dxa"/>
+          </w:tcPr>
+          <w:p>
+            <w:r>
+              <w:rPr>
+                <w:sz w:val="18"/>
+              </w:rPr>
+              <w:t>Crear un registro, cerrar sesión y entrar desde otro navegador</w:t>
+            </w:r>
+          </w:p>
+        </w:tc>
+        <w:tc>
+          <w:tcPr>
+            <w:tcW w:w="4500" w:type="dxa"/>
+          </w:tcPr>
+          <w:p>
+            <w:r>
+              <w:rPr>
+                <w:sz w:val="18"/>
+              </w:rPr>
+              <w:t>El registro sigue ahí: los datos están en la base de datos.</w:t>
+            </w:r>
+          </w:p>
+        </w:tc>
+      </w:tr>
+      <w:tr>
+        <w:tc>
+          <w:tcPr>
+            <w:tcW w:w="900" w:type="dxa"/>
+          </w:tcPr>
+          <w:p>
+            <w:r>
+              <w:rPr>
+                <w:sz w:val="18"/>
+              </w:rPr>
+              <w:t>CP-28</w:t>
+            </w:r>
+          </w:p>
+        </w:tc>
+        <w:tc>
+          <w:tcPr>
+            <w:tcW w:w="3960" w:type="dxa"/>
+          </w:tcPr>
+          <w:p>
+            <w:r>
+              <w:rPr>
+                <w:sz w:val="18"/>
+              </w:rPr>
+              <w:t>Recargar la página con sesión iniciada</w:t>
+            </w:r>
+          </w:p>
+        </w:tc>
+        <w:tc>
+          <w:tcPr>
+            <w:tcW w:w="4500" w:type="dxa"/>
+          </w:tcPr>
+          <w:p>
+            <w:r>
+              <w:rPr>
+                <w:sz w:val="18"/>
+              </w:rPr>
+              <w:t>Se mantiene la sesión sin volver a escribir la contraseña.</w:t>
+            </w:r>
+          </w:p>
+        </w:tc>
+      </w:tr>
+      <w:tr>
+        <w:tc>
+          <w:tcPr>
+            <w:tcW w:w="900" w:type="dxa"/>
+          </w:tcPr>
+          <w:p>
+            <w:r>
+              <w:rPr>
+                <w:sz w:val="18"/>
+              </w:rPr>
+              <w:t>CP-29</w:t>
+            </w:r>
+          </w:p>
+        </w:tc>
+        <w:tc>
+          <w:tcPr>
+            <w:tcW w:w="3960" w:type="dxa"/>
+          </w:tcPr>
+          <w:p>
+            <w:r>
+              <w:rPr>
+                <w:sz w:val="18"/>
+              </w:rPr>
+              <w:t>Intentar que un puesto reporte a alguien de su propio equipo (vía API)</w:t>
+            </w:r>
+          </w:p>
+        </w:tc>
+        <w:tc>
+          <w:tcPr>
+            <w:tcW w:w="4500" w:type="dxa"/>
+          </w:tcPr>
+          <w:p>
+            <w:r>
+              <w:rPr>
+                <w:sz w:val="18"/>
+              </w:rPr>
+              <w:t>El servidor lo rechaza por crear un ciclo.</w:t>
             </w:r>
           </w:p>
         </w:tc>
@@ -30443,7 +31208,7 @@
               <w:rPr>
                 <w:sz w:val="18"/>
               </w:rPr>
-              <w:t>Inicio de sesión demostrativo; cuentas y contraseña están integradas en el prototipo.</w:t>
+              <w:t>Resuelto: inicio de sesión real con contraseñas cifradas.</w:t>
             </w:r>
           </w:p>
         </w:tc>
@@ -30469,7 +31234,7 @@
               <w:rPr>
                 <w:sz w:val="18"/>
               </w:rPr>
-              <w:t>Implementar autenticación real en Django.</w:t>
+              <w:t>Fase 2: alta de usuarios por empresa y recuperación de contraseña.</w:t>
             </w:r>
           </w:p>
         </w:tc>
@@ -30497,7 +31262,7 @@
               <w:rPr>
                 <w:sz w:val="18"/>
               </w:rPr>
-              <w:t>Los roles demo no restringen acciones.</w:t>
+              <w:t>Resuelto: permisos por rol validados en el servidor.</w:t>
             </w:r>
           </w:p>
         </w:tc>
@@ -30523,7 +31288,7 @@
               <w:rPr>
                 <w:sz w:val="18"/>
               </w:rPr>
-              <w:t>Implementar permisos por rol y empresa.</w:t>
+              <w:t>Fase 2: permisos por empresa (multiempresa).</w:t>
             </w:r>
           </w:p>
         </w:tc>
@@ -30551,7 +31316,7 @@
               <w:rPr>
                 <w:sz w:val="18"/>
               </w:rPr>
-              <w:t>Los datos siguen almacenados localmente.</w:t>
+              <w:t>Resuelto: datos en PostgreSQL (Neon), compartidos entre usuarios.</w:t>
             </w:r>
           </w:p>
         </w:tc>
@@ -30577,7 +31342,7 @@
               <w:rPr>
                 <w:sz w:val="18"/>
               </w:rPr>
-              <w:t>Migrar a Django + PostgreSQL y multiempresa.</w:t>
+              <w:t>Fase 2: migrar a Django y agregar multiempresa.</w:t>
             </w:r>
           </w:p>
         </w:tc>
@@ -30767,7 +31532,7 @@
               <w:rPr>
                 <w:sz w:val="18"/>
               </w:rPr>
-              <w:t>No hay validación de ciclos en servidor.</w:t>
+              <w:t>Resuelto: el servidor valida la jerarquía y bloquea ciclos.</w:t>
             </w:r>
           </w:p>
         </w:tc>
@@ -30793,7 +31558,7 @@
               <w:rPr>
                 <w:sz w:val="18"/>
               </w:rPr>
-              <w:t>Validar jerarquía en backend.</w:t>
+              <w:t>Agregar la pantalla para editar a quién reporta un puesto.</w:t>
             </w:r>
           </w:p>
         </w:tc>
@@ -30821,7 +31586,7 @@
               <w:rPr>
                 <w:sz w:val="18"/>
               </w:rPr>
-              <w:t>No hay bitácora de auditoría.</w:t>
+              <w:t>Parcial: historial con autor y fecha por registro; sin bitácora general.</w:t>
             </w:r>
           </w:p>
         </w:tc>
@@ -33081,6 +33846,136 @@
           </w:p>
         </w:tc>
       </w:tr>
+      <w:tr>
+        <w:trPr>
+          <w:cantSplit/>
+        </w:trPr>
+        <w:tc>
+          <w:tcPr>
+            <w:tcW w:w="7000" w:type="dxa"/>
+            <w:tcBorders>
+              <w:top w:val="single" w:sz="4" w:space="0" w:color="D1D5DB"/>
+              <w:left w:val="single" w:sz="4" w:space="0" w:color="D1D5DB"/>
+              <w:bottom w:val="single" w:sz="4" w:space="0" w:color="D1D5DB"/>
+              <w:right w:val="single" w:sz="4" w:space="0" w:color="D1D5DB"/>
+            </w:tcBorders>
+            <w:tcMar>
+              <w:top w:w="70" w:type="dxa"/>
+              <w:left w:w="100" w:type="dxa"/>
+              <w:bottom w:w="70" w:type="dxa"/>
+              <w:right w:w="100" w:type="dxa"/>
+            </w:tcMar>
+          </w:tcPr>
+          <w:p>
+            <w:pPr>
+              <w:spacing w:after="20"/>
+            </w:pPr>
+            <w:r>
+              <w:rPr>
+                <w:color w:val="172033"/>
+                <w:sz w:val="19"/>
+                <w:szCs w:val="19"/>
+              </w:rPr>
+              <w:t>Confirmar el motor de base de datos para la Fase 2 (PostgreSQL actual o MySQL); el backend del MVP soporta ambos</w:t>
+            </w:r>
+          </w:p>
+        </w:tc>
+        <w:tc>
+          <w:tcPr>
+            <w:tcW w:w="2360" w:type="dxa"/>
+            <w:tcBorders>
+              <w:top w:val="single" w:sz="4" w:space="0" w:color="D1D5DB"/>
+              <w:left w:val="single" w:sz="4" w:space="0" w:color="D1D5DB"/>
+              <w:bottom w:val="single" w:sz="4" w:space="0" w:color="D1D5DB"/>
+              <w:right w:val="single" w:sz="4" w:space="0" w:color="D1D5DB"/>
+            </w:tcBorders>
+            <w:tcMar>
+              <w:top w:w="70" w:type="dxa"/>
+              <w:left w:w="100" w:type="dxa"/>
+              <w:bottom w:w="70" w:type="dxa"/>
+              <w:right w:w="100" w:type="dxa"/>
+            </w:tcMar>
+          </w:tcPr>
+          <w:p>
+            <w:pPr>
+              <w:spacing w:after="20"/>
+            </w:pPr>
+            <w:r>
+              <w:rPr>
+                <w:color w:val="172033"/>
+                <w:sz w:val="19"/>
+                <w:szCs w:val="19"/>
+              </w:rPr>
+              <w:t>Ingeniero a cargo</w:t>
+            </w:r>
+          </w:p>
+        </w:tc>
+      </w:tr>
+      <w:tr>
+        <w:trPr>
+          <w:cantSplit/>
+        </w:trPr>
+        <w:tc>
+          <w:tcPr>
+            <w:tcW w:w="7000" w:type="dxa"/>
+            <w:tcBorders>
+              <w:top w:val="single" w:sz="4" w:space="0" w:color="D1D5DB"/>
+              <w:left w:val="single" w:sz="4" w:space="0" w:color="D1D5DB"/>
+              <w:bottom w:val="single" w:sz="4" w:space="0" w:color="D1D5DB"/>
+              <w:right w:val="single" w:sz="4" w:space="0" w:color="D1D5DB"/>
+            </w:tcBorders>
+            <w:tcMar>
+              <w:top w:w="70" w:type="dxa"/>
+              <w:left w:w="100" w:type="dxa"/>
+              <w:bottom w:w="70" w:type="dxa"/>
+              <w:right w:w="100" w:type="dxa"/>
+            </w:tcMar>
+          </w:tcPr>
+          <w:p>
+            <w:pPr>
+              <w:spacing w:after="20"/>
+            </w:pPr>
+            <w:r>
+              <w:rPr>
+                <w:color w:val="172033"/>
+                <w:sz w:val="19"/>
+                <w:szCs w:val="19"/>
+              </w:rPr>
+              <w:t>Definir quién da de alta a los usuarios reales y con qué roles</w:t>
+            </w:r>
+          </w:p>
+        </w:tc>
+        <w:tc>
+          <w:tcPr>
+            <w:tcW w:w="2360" w:type="dxa"/>
+            <w:tcBorders>
+              <w:top w:val="single" w:sz="4" w:space="0" w:color="D1D5DB"/>
+              <w:left w:val="single" w:sz="4" w:space="0" w:color="D1D5DB"/>
+              <w:bottom w:val="single" w:sz="4" w:space="0" w:color="D1D5DB"/>
+              <w:right w:val="single" w:sz="4" w:space="0" w:color="D1D5DB"/>
+            </w:tcBorders>
+            <w:tcMar>
+              <w:top w:w="70" w:type="dxa"/>
+              <w:left w:w="100" w:type="dxa"/>
+              <w:bottom w:w="70" w:type="dxa"/>
+              <w:right w:w="100" w:type="dxa"/>
+            </w:tcMar>
+          </w:tcPr>
+          <w:p>
+            <w:pPr>
+              <w:spacing w:after="20"/>
+            </w:pPr>
+            <w:r>
+              <w:rPr>
+                <w:color w:val="172033"/>
+                <w:sz w:val="19"/>
+                <w:szCs w:val="19"/>
+              </w:rPr>
+              <w:t>Ingeniero a cargo</w:t>
+            </w:r>
+          </w:p>
+        </w:tc>
+      </w:tr>
     </w:tbl>
     <w:p>
       <w:pPr>
@@ -33936,6 +34831,274 @@
           </w:p>
         </w:tc>
       </w:tr>
+      <w:tr>
+        <w:trPr>
+          <w:cantSplit/>
+        </w:trPr>
+        <w:tc>
+          <w:tcPr>
+            <w:tcW w:w="2600" w:type="dxa"/>
+            <w:tcBorders>
+              <w:top w:val="single" w:sz="4" w:space="0" w:color="D1D5DB"/>
+              <w:left w:val="single" w:sz="4" w:space="0" w:color="D1D5DB"/>
+              <w:bottom w:val="single" w:sz="4" w:space="0" w:color="D1D5DB"/>
+              <w:right w:val="single" w:sz="4" w:space="0" w:color="D1D5DB"/>
+            </w:tcBorders>
+            <w:tcMar>
+              <w:top w:w="70" w:type="dxa"/>
+              <w:left w:w="100" w:type="dxa"/>
+              <w:bottom w:w="70" w:type="dxa"/>
+              <w:right w:w="100" w:type="dxa"/>
+            </w:tcMar>
+          </w:tcPr>
+          <w:p>
+            <w:pPr>
+              <w:spacing w:after="20"/>
+            </w:pPr>
+            <w:r>
+              <w:rPr>
+                <w:b/>
+                <w:bCs/>
+                <w:color w:val="172033"/>
+                <w:sz w:val="19"/>
+                <w:szCs w:val="19"/>
+              </w:rPr>
+              <w:t>Backend</w:t>
+            </w:r>
+          </w:p>
+        </w:tc>
+        <w:tc>
+          <w:tcPr>
+            <w:tcW w:w="6760" w:type="dxa"/>
+            <w:tcBorders>
+              <w:top w:val="single" w:sz="4" w:space="0" w:color="D1D5DB"/>
+              <w:left w:val="single" w:sz="4" w:space="0" w:color="D1D5DB"/>
+              <w:bottom w:val="single" w:sz="4" w:space="0" w:color="D1D5DB"/>
+              <w:right w:val="single" w:sz="4" w:space="0" w:color="D1D5DB"/>
+            </w:tcBorders>
+            <w:tcMar>
+              <w:top w:w="70" w:type="dxa"/>
+              <w:left w:w="100" w:type="dxa"/>
+              <w:bottom w:w="70" w:type="dxa"/>
+              <w:right w:w="100" w:type="dxa"/>
+            </w:tcMar>
+          </w:tcPr>
+          <w:p>
+            <w:pPr>
+              <w:spacing w:after="20"/>
+            </w:pPr>
+            <w:r>
+              <w:rPr>
+                <w:color w:val="172033"/>
+                <w:sz w:val="19"/>
+                <w:szCs w:val="19"/>
+              </w:rPr>
+              <w:t>Parte del sistema que corre en el servidor: guarda datos, valida y controla permisos</w:t>
+            </w:r>
+          </w:p>
+        </w:tc>
+      </w:tr>
+      <w:tr>
+        <w:trPr>
+          <w:cantSplit/>
+        </w:trPr>
+        <w:tc>
+          <w:tcPr>
+            <w:tcW w:w="2600" w:type="dxa"/>
+            <w:tcBorders>
+              <w:top w:val="single" w:sz="4" w:space="0" w:color="D1D5DB"/>
+              <w:left w:val="single" w:sz="4" w:space="0" w:color="D1D5DB"/>
+              <w:bottom w:val="single" w:sz="4" w:space="0" w:color="D1D5DB"/>
+              <w:right w:val="single" w:sz="4" w:space="0" w:color="D1D5DB"/>
+            </w:tcBorders>
+            <w:tcMar>
+              <w:top w:w="70" w:type="dxa"/>
+              <w:left w:w="100" w:type="dxa"/>
+              <w:bottom w:w="70" w:type="dxa"/>
+              <w:right w:w="100" w:type="dxa"/>
+            </w:tcMar>
+          </w:tcPr>
+          <w:p>
+            <w:pPr>
+              <w:spacing w:after="20"/>
+            </w:pPr>
+            <w:r>
+              <w:rPr>
+                <w:b/>
+                <w:bCs/>
+                <w:color w:val="172033"/>
+                <w:sz w:val="19"/>
+                <w:szCs w:val="19"/>
+              </w:rPr>
+              <w:t>Kysely</w:t>
+            </w:r>
+          </w:p>
+        </w:tc>
+        <w:tc>
+          <w:tcPr>
+            <w:tcW w:w="6760" w:type="dxa"/>
+            <w:tcBorders>
+              <w:top w:val="single" w:sz="4" w:space="0" w:color="D1D5DB"/>
+              <w:left w:val="single" w:sz="4" w:space="0" w:color="D1D5DB"/>
+              <w:bottom w:val="single" w:sz="4" w:space="0" w:color="D1D5DB"/>
+              <w:right w:val="single" w:sz="4" w:space="0" w:color="D1D5DB"/>
+            </w:tcBorders>
+            <w:tcMar>
+              <w:top w:w="70" w:type="dxa"/>
+              <w:left w:w="100" w:type="dxa"/>
+              <w:bottom w:w="70" w:type="dxa"/>
+              <w:right w:w="100" w:type="dxa"/>
+            </w:tcMar>
+          </w:tcPr>
+          <w:p>
+            <w:pPr>
+              <w:spacing w:after="20"/>
+            </w:pPr>
+            <w:r>
+              <w:rPr>
+                <w:color w:val="172033"/>
+                <w:sz w:val="19"/>
+                <w:szCs w:val="19"/>
+              </w:rPr>
+              <w:t>Librería que arma las consultas SQL; permite usar PostgreSQL o MySQL con el mismo código</w:t>
+            </w:r>
+          </w:p>
+        </w:tc>
+      </w:tr>
+      <w:tr>
+        <w:trPr>
+          <w:cantSplit/>
+        </w:trPr>
+        <w:tc>
+          <w:tcPr>
+            <w:tcW w:w="2600" w:type="dxa"/>
+            <w:tcBorders>
+              <w:top w:val="single" w:sz="4" w:space="0" w:color="D1D5DB"/>
+              <w:left w:val="single" w:sz="4" w:space="0" w:color="D1D5DB"/>
+              <w:bottom w:val="single" w:sz="4" w:space="0" w:color="D1D5DB"/>
+              <w:right w:val="single" w:sz="4" w:space="0" w:color="D1D5DB"/>
+            </w:tcBorders>
+            <w:tcMar>
+              <w:top w:w="70" w:type="dxa"/>
+              <w:left w:w="100" w:type="dxa"/>
+              <w:bottom w:w="70" w:type="dxa"/>
+              <w:right w:w="100" w:type="dxa"/>
+            </w:tcMar>
+          </w:tcPr>
+          <w:p>
+            <w:pPr>
+              <w:spacing w:after="20"/>
+            </w:pPr>
+            <w:r>
+              <w:rPr>
+                <w:b/>
+                <w:bCs/>
+                <w:color w:val="172033"/>
+                <w:sz w:val="19"/>
+                <w:szCs w:val="19"/>
+              </w:rPr>
+              <w:t>Neon</w:t>
+            </w:r>
+          </w:p>
+        </w:tc>
+        <w:tc>
+          <w:tcPr>
+            <w:tcW w:w="6760" w:type="dxa"/>
+            <w:tcBorders>
+              <w:top w:val="single" w:sz="4" w:space="0" w:color="D1D5DB"/>
+              <w:left w:val="single" w:sz="4" w:space="0" w:color="D1D5DB"/>
+              <w:bottom w:val="single" w:sz="4" w:space="0" w:color="D1D5DB"/>
+              <w:right w:val="single" w:sz="4" w:space="0" w:color="D1D5DB"/>
+            </w:tcBorders>
+            <w:tcMar>
+              <w:top w:w="70" w:type="dxa"/>
+              <w:left w:w="100" w:type="dxa"/>
+              <w:bottom w:w="70" w:type="dxa"/>
+              <w:right w:w="100" w:type="dxa"/>
+            </w:tcMar>
+          </w:tcPr>
+          <w:p>
+            <w:pPr>
+              <w:spacing w:after="20"/>
+            </w:pPr>
+            <w:r>
+              <w:rPr>
+                <w:color w:val="172033"/>
+                <w:sz w:val="19"/>
+                <w:szCs w:val="19"/>
+              </w:rPr>
+              <w:t>Servicio de PostgreSQL en la nube, conectado al proyecto desde Vercel</w:t>
+            </w:r>
+          </w:p>
+        </w:tc>
+      </w:tr>
+      <w:tr>
+        <w:trPr>
+          <w:cantSplit/>
+        </w:trPr>
+        <w:tc>
+          <w:tcPr>
+            <w:tcW w:w="2600" w:type="dxa"/>
+            <w:tcBorders>
+              <w:top w:val="single" w:sz="4" w:space="0" w:color="D1D5DB"/>
+              <w:left w:val="single" w:sz="4" w:space="0" w:color="D1D5DB"/>
+              <w:bottom w:val="single" w:sz="4" w:space="0" w:color="D1D5DB"/>
+              <w:right w:val="single" w:sz="4" w:space="0" w:color="D1D5DB"/>
+            </w:tcBorders>
+            <w:tcMar>
+              <w:top w:w="70" w:type="dxa"/>
+              <w:left w:w="100" w:type="dxa"/>
+              <w:bottom w:w="70" w:type="dxa"/>
+              <w:right w:w="100" w:type="dxa"/>
+            </w:tcMar>
+          </w:tcPr>
+          <w:p>
+            <w:pPr>
+              <w:spacing w:after="20"/>
+            </w:pPr>
+            <w:r>
+              <w:rPr>
+                <w:b/>
+                <w:bCs/>
+                <w:color w:val="172033"/>
+                <w:sz w:val="19"/>
+                <w:szCs w:val="19"/>
+              </w:rPr>
+              <w:t>scrypt</w:t>
+            </w:r>
+          </w:p>
+        </w:tc>
+        <w:tc>
+          <w:tcPr>
+            <w:tcW w:w="6760" w:type="dxa"/>
+            <w:tcBorders>
+              <w:top w:val="single" w:sz="4" w:space="0" w:color="D1D5DB"/>
+              <w:left w:val="single" w:sz="4" w:space="0" w:color="D1D5DB"/>
+              <w:bottom w:val="single" w:sz="4" w:space="0" w:color="D1D5DB"/>
+              <w:right w:val="single" w:sz="4" w:space="0" w:color="D1D5DB"/>
+            </w:tcBorders>
+            <w:tcMar>
+              <w:top w:w="70" w:type="dxa"/>
+              <w:left w:w="100" w:type="dxa"/>
+              <w:bottom w:w="70" w:type="dxa"/>
+              <w:right w:w="100" w:type="dxa"/>
+            </w:tcMar>
+          </w:tcPr>
+          <w:p>
+            <w:pPr>
+              <w:spacing w:after="20"/>
+            </w:pPr>
+            <w:r>
+              <w:rPr>
+                <w:color w:val="172033"/>
+                <w:sz w:val="19"/>
+                <w:szCs w:val="19"/>
+              </w:rPr>
+              <w:t>Algoritmo para guardar contraseñas cifradas de forma segura</w:t>
+            </w:r>
+          </w:p>
+        </w:tc>
+      </w:tr>
     </w:tbl>
     <w:p/>
     <w:p>
@@ -34962,6 +36125,1787 @@
     </w:p>
     <w:p>
       <w:pPr>
+        <w:pStyle w:val="Ttulo1"/>
+      </w:pPr>
+      <w:r>
+        <w:t>25. Actualización del MVP — versión 5: backend (12 de octubre de 2026)</w:t>
+      </w:r>
+    </w:p>
+    <w:p>
+      <w:pPr>
+        <w:spacing w:after="120" w:line="276" w:lineRule="auto"/>
+      </w:pPr>
+      <w:r>
+        <w:rPr>
+          <w:color w:val="172033"/>
+        </w:rPr>
+        <w:t>Por indicación del ingeniero, el MVP ya trabaja con backend, todavía sin Django. Los datos dejan de guardarse en el navegador: se guardan en una base de datos PostgreSQL y se comparten entre usuarios, con inicio de sesión real y permisos por rol.</w:t>
+      </w:r>
+    </w:p>
+    <w:p>
+      <w:pPr>
+        <w:pStyle w:val="Ttulo2"/>
+      </w:pPr>
+      <w:r>
+        <w:t>25.1 Arquitectura</w:t>
+      </w:r>
+    </w:p>
+    <w:p>
+      <w:pPr>
+        <w:pStyle w:val="Prrafodelista"/>
+      </w:pPr>
+      <w:r>
+        <w:t>Página (index.html + modulos.js) → API en Vercel (funciones Node.js en /api) → PostgreSQL en Neon. Las funciones de IA llaman a Google Gemini desde el servidor.</w:t>
+      </w:r>
+    </w:p>
+    <w:p>
+      <w:pPr>
+        <w:pStyle w:val="Prrafodelista"/>
+      </w:pPr>
+      <w:r>
+        <w:t>Kysely arma las consultas SQL de forma portable: con DATABASE_URL postgres:// se usa PostgreSQL; con mysql:// se usa MySQL sin cambiar el código.</w:t>
+      </w:r>
+    </w:p>
+    <w:p>
+      <w:pPr>
+        <w:pStyle w:val="Prrafodelista"/>
+      </w:pPr>
+      <w:r>
+        <w:t>La primera vez que se usa, el servidor crea las tablas y carga los datos de ejemplo de lib/seed.js.</w:t>
+      </w:r>
+    </w:p>
+    <w:p>
+      <w:pPr>
+        <w:pStyle w:val="Prrafodelista"/>
+      </w:pPr>
+      <w:r>
+        <w:t>Para desarrollo local, npm run dev levanta todo en http://localhost:3000 con un PostgreSQL en memoria (PGlite).</w:t>
+      </w:r>
+    </w:p>
+    <w:p>
+      <w:pPr>
+        <w:pStyle w:val="Ttulo2"/>
+      </w:pPr>
+      <w:r>
+        <w:t>25.2 Endpoints de la API</w:t>
+      </w:r>
+    </w:p>
+    <w:tbl>
+      <w:tblPr>
+        <w:tblW w:w="9360" w:type="dxa"/>
+        <w:tblBorders>
+          <w:top w:val="single" w:sz="4" w:space="0" w:color="auto"/>
+          <w:left w:val="single" w:sz="4" w:space="0" w:color="auto"/>
+          <w:bottom w:val="single" w:sz="4" w:space="0" w:color="auto"/>
+          <w:right w:val="single" w:sz="4" w:space="0" w:color="auto"/>
+          <w:insideH w:val="single" w:sz="4" w:space="0" w:color="auto"/>
+          <w:insideV w:val="single" w:sz="4" w:space="0" w:color="auto"/>
+        </w:tblBorders>
+        <w:tblCellMar>
+          <w:left w:w="10" w:type="dxa"/>
+          <w:right w:w="10" w:type="dxa"/>
+        </w:tblCellMar>
+        <w:tblLook w:val="04A0" w:firstRow="1" w:lastRow="0" w:firstColumn="1" w:lastColumn="0" w:noHBand="0" w:noVBand="1"/>
+      </w:tblPr>
+      <w:tblGrid>
+        <w:gridCol w:w="1900"/>
+        <w:gridCol w:w="1800"/>
+        <w:gridCol w:w="3660"/>
+        <w:gridCol w:w="2000"/>
+      </w:tblGrid>
+      <w:tr>
+        <w:trPr>
+          <w:tblHeader/>
+        </w:trPr>
+        <w:tc>
+          <w:tcPr>
+            <w:tcW w:w="1900" w:type="dxa"/>
+            <w:tcBorders>
+              <w:top w:val="single" w:sz="4" w:space="0" w:color="D1D5DB"/>
+              <w:left w:val="single" w:sz="4" w:space="0" w:color="D1D5DB"/>
+              <w:bottom w:val="single" w:sz="4" w:space="0" w:color="D1D5DB"/>
+              <w:right w:val="single" w:sz="4" w:space="0" w:color="D1D5DB"/>
+            </w:tcBorders>
+            <w:shd w:val="clear" w:color="auto" w:fill="233FA8"/>
+            <w:tcMar>
+              <w:top w:w="70" w:type="dxa"/>
+              <w:left w:w="100" w:type="dxa"/>
+              <w:bottom w:w="70" w:type="dxa"/>
+              <w:right w:w="100" w:type="dxa"/>
+            </w:tcMar>
+          </w:tcPr>
+          <w:p>
+            <w:pPr>
+              <w:spacing w:after="20"/>
+            </w:pPr>
+            <w:r>
+              <w:rPr>
+                <w:b/>
+                <w:bCs/>
+                <w:color w:val="FFFFFF"/>
+                <w:sz w:val="19"/>
+                <w:szCs w:val="19"/>
+              </w:rPr>
+              <w:t>Endpoint</w:t>
+            </w:r>
+          </w:p>
+        </w:tc>
+        <w:tc>
+          <w:tcPr>
+            <w:tcW w:w="1800" w:type="dxa"/>
+            <w:tcBorders>
+              <w:top w:val="single" w:sz="4" w:space="0" w:color="D1D5DB"/>
+              <w:left w:val="single" w:sz="4" w:space="0" w:color="D1D5DB"/>
+              <w:bottom w:val="single" w:sz="4" w:space="0" w:color="D1D5DB"/>
+              <w:right w:val="single" w:sz="4" w:space="0" w:color="D1D5DB"/>
+            </w:tcBorders>
+            <w:shd w:val="clear" w:color="auto" w:fill="233FA8"/>
+            <w:tcMar>
+              <w:top w:w="70" w:type="dxa"/>
+              <w:left w:w="100" w:type="dxa"/>
+              <w:bottom w:w="70" w:type="dxa"/>
+              <w:right w:w="100" w:type="dxa"/>
+            </w:tcMar>
+          </w:tcPr>
+          <w:p>
+            <w:pPr>
+              <w:spacing w:after="20"/>
+            </w:pPr>
+            <w:r>
+              <w:rPr>
+                <w:b/>
+                <w:bCs/>
+                <w:color w:val="FFFFFF"/>
+                <w:sz w:val="19"/>
+                <w:szCs w:val="19"/>
+              </w:rPr>
+              <w:t>Método</w:t>
+            </w:r>
+          </w:p>
+        </w:tc>
+        <w:tc>
+          <w:tcPr>
+            <w:tcW w:w="3660" w:type="dxa"/>
+            <w:tcBorders>
+              <w:top w:val="single" w:sz="4" w:space="0" w:color="D1D5DB"/>
+              <w:left w:val="single" w:sz="4" w:space="0" w:color="D1D5DB"/>
+              <w:bottom w:val="single" w:sz="4" w:space="0" w:color="D1D5DB"/>
+              <w:right w:val="single" w:sz="4" w:space="0" w:color="D1D5DB"/>
+            </w:tcBorders>
+            <w:shd w:val="clear" w:color="auto" w:fill="233FA8"/>
+            <w:tcMar>
+              <w:top w:w="70" w:type="dxa"/>
+              <w:left w:w="100" w:type="dxa"/>
+              <w:bottom w:w="70" w:type="dxa"/>
+              <w:right w:w="100" w:type="dxa"/>
+            </w:tcMar>
+          </w:tcPr>
+          <w:p>
+            <w:pPr>
+              <w:spacing w:after="20"/>
+            </w:pPr>
+            <w:r>
+              <w:rPr>
+                <w:b/>
+                <w:bCs/>
+                <w:color w:val="FFFFFF"/>
+                <w:sz w:val="19"/>
+                <w:szCs w:val="19"/>
+              </w:rPr>
+              <w:t>Qué hace</w:t>
+            </w:r>
+          </w:p>
+        </w:tc>
+        <w:tc>
+          <w:tcPr>
+            <w:tcW w:w="2000" w:type="dxa"/>
+            <w:tcBorders>
+              <w:top w:val="single" w:sz="4" w:space="0" w:color="D1D5DB"/>
+              <w:left w:val="single" w:sz="4" w:space="0" w:color="D1D5DB"/>
+              <w:bottom w:val="single" w:sz="4" w:space="0" w:color="D1D5DB"/>
+              <w:right w:val="single" w:sz="4" w:space="0" w:color="D1D5DB"/>
+            </w:tcBorders>
+            <w:shd w:val="clear" w:color="auto" w:fill="233FA8"/>
+            <w:tcMar>
+              <w:top w:w="70" w:type="dxa"/>
+              <w:left w:w="100" w:type="dxa"/>
+              <w:bottom w:w="70" w:type="dxa"/>
+              <w:right w:w="100" w:type="dxa"/>
+            </w:tcMar>
+          </w:tcPr>
+          <w:p>
+            <w:pPr>
+              <w:spacing w:after="20"/>
+            </w:pPr>
+            <w:r>
+              <w:rPr>
+                <w:b/>
+                <w:bCs/>
+                <w:color w:val="FFFFFF"/>
+                <w:sz w:val="19"/>
+                <w:szCs w:val="19"/>
+              </w:rPr>
+              <w:t>Quién</w:t>
+            </w:r>
+          </w:p>
+        </w:tc>
+      </w:tr>
+      <w:tr>
+        <w:trPr>
+          <w:cantSplit/>
+        </w:trPr>
+        <w:tc>
+          <w:tcPr>
+            <w:tcW w:w="1900" w:type="dxa"/>
+            <w:tcBorders>
+              <w:top w:val="single" w:sz="4" w:space="0" w:color="D1D5DB"/>
+              <w:left w:val="single" w:sz="4" w:space="0" w:color="D1D5DB"/>
+              <w:bottom w:val="single" w:sz="4" w:space="0" w:color="D1D5DB"/>
+              <w:right w:val="single" w:sz="4" w:space="0" w:color="D1D5DB"/>
+            </w:tcBorders>
+            <w:tcMar>
+              <w:top w:w="70" w:type="dxa"/>
+              <w:left w:w="100" w:type="dxa"/>
+              <w:bottom w:w="70" w:type="dxa"/>
+              <w:right w:w="100" w:type="dxa"/>
+            </w:tcMar>
+          </w:tcPr>
+          <w:p>
+            <w:pPr>
+              <w:spacing w:after="20"/>
+            </w:pPr>
+            <w:r>
+              <w:rPr>
+                <w:b/>
+                <w:bCs/>
+                <w:color w:val="172033"/>
+                <w:sz w:val="19"/>
+                <w:szCs w:val="19"/>
+              </w:rPr>
+              <w:t>/api/auth</w:t>
+            </w:r>
+          </w:p>
+        </w:tc>
+        <w:tc>
+          <w:tcPr>
+            <w:tcW w:w="1800" w:type="dxa"/>
+            <w:tcBorders>
+              <w:top w:val="single" w:sz="4" w:space="0" w:color="D1D5DB"/>
+              <w:left w:val="single" w:sz="4" w:space="0" w:color="D1D5DB"/>
+              <w:bottom w:val="single" w:sz="4" w:space="0" w:color="D1D5DB"/>
+              <w:right w:val="single" w:sz="4" w:space="0" w:color="D1D5DB"/>
+            </w:tcBorders>
+            <w:tcMar>
+              <w:top w:w="70" w:type="dxa"/>
+              <w:left w:w="100" w:type="dxa"/>
+              <w:bottom w:w="70" w:type="dxa"/>
+              <w:right w:w="100" w:type="dxa"/>
+            </w:tcMar>
+          </w:tcPr>
+          <w:p>
+            <w:pPr>
+              <w:spacing w:after="20"/>
+            </w:pPr>
+            <w:r>
+              <w:rPr>
+                <w:color w:val="172033"/>
+                <w:sz w:val="19"/>
+                <w:szCs w:val="19"/>
+              </w:rPr>
+              <w:t>GET / POST</w:t>
+            </w:r>
+          </w:p>
+        </w:tc>
+        <w:tc>
+          <w:tcPr>
+            <w:tcW w:w="3660" w:type="dxa"/>
+            <w:tcBorders>
+              <w:top w:val="single" w:sz="4" w:space="0" w:color="D1D5DB"/>
+              <w:left w:val="single" w:sz="4" w:space="0" w:color="D1D5DB"/>
+              <w:bottom w:val="single" w:sz="4" w:space="0" w:color="D1D5DB"/>
+              <w:right w:val="single" w:sz="4" w:space="0" w:color="D1D5DB"/>
+            </w:tcBorders>
+            <w:tcMar>
+              <w:top w:w="70" w:type="dxa"/>
+              <w:left w:w="100" w:type="dxa"/>
+              <w:bottom w:w="70" w:type="dxa"/>
+              <w:right w:w="100" w:type="dxa"/>
+            </w:tcMar>
+          </w:tcPr>
+          <w:p>
+            <w:pPr>
+              <w:spacing w:after="20"/>
+            </w:pPr>
+            <w:r>
+              <w:rPr>
+                <w:color w:val="172033"/>
+                <w:sz w:val="19"/>
+                <w:szCs w:val="19"/>
+              </w:rPr>
+              <w:t>Consulta la sesión actual; inicia sesión (login) o la cierra (logout)</w:t>
+            </w:r>
+          </w:p>
+        </w:tc>
+        <w:tc>
+          <w:tcPr>
+            <w:tcW w:w="2000" w:type="dxa"/>
+            <w:tcBorders>
+              <w:top w:val="single" w:sz="4" w:space="0" w:color="D1D5DB"/>
+              <w:left w:val="single" w:sz="4" w:space="0" w:color="D1D5DB"/>
+              <w:bottom w:val="single" w:sz="4" w:space="0" w:color="D1D5DB"/>
+              <w:right w:val="single" w:sz="4" w:space="0" w:color="D1D5DB"/>
+            </w:tcBorders>
+            <w:tcMar>
+              <w:top w:w="70" w:type="dxa"/>
+              <w:left w:w="100" w:type="dxa"/>
+              <w:bottom w:w="70" w:type="dxa"/>
+              <w:right w:w="100" w:type="dxa"/>
+            </w:tcMar>
+          </w:tcPr>
+          <w:p>
+            <w:pPr>
+              <w:spacing w:after="20"/>
+            </w:pPr>
+            <w:r>
+              <w:rPr>
+                <w:color w:val="172033"/>
+                <w:sz w:val="19"/>
+                <w:szCs w:val="19"/>
+              </w:rPr>
+              <w:t>Todos</w:t>
+            </w:r>
+          </w:p>
+        </w:tc>
+      </w:tr>
+      <w:tr>
+        <w:trPr>
+          <w:cantSplit/>
+        </w:trPr>
+        <w:tc>
+          <w:tcPr>
+            <w:tcW w:w="1900" w:type="dxa"/>
+            <w:tcBorders>
+              <w:top w:val="single" w:sz="4" w:space="0" w:color="D1D5DB"/>
+              <w:left w:val="single" w:sz="4" w:space="0" w:color="D1D5DB"/>
+              <w:bottom w:val="single" w:sz="4" w:space="0" w:color="D1D5DB"/>
+              <w:right w:val="single" w:sz="4" w:space="0" w:color="D1D5DB"/>
+            </w:tcBorders>
+            <w:tcMar>
+              <w:top w:w="70" w:type="dxa"/>
+              <w:left w:w="100" w:type="dxa"/>
+              <w:bottom w:w="70" w:type="dxa"/>
+              <w:right w:w="100" w:type="dxa"/>
+            </w:tcMar>
+          </w:tcPr>
+          <w:p>
+            <w:pPr>
+              <w:spacing w:after="20"/>
+            </w:pPr>
+            <w:r>
+              <w:rPr>
+                <w:b/>
+                <w:bCs/>
+                <w:color w:val="172033"/>
+                <w:sz w:val="19"/>
+                <w:szCs w:val="19"/>
+              </w:rPr>
+              <w:t>/api/data</w:t>
+            </w:r>
+          </w:p>
+        </w:tc>
+        <w:tc>
+          <w:tcPr>
+            <w:tcW w:w="1800" w:type="dxa"/>
+            <w:tcBorders>
+              <w:top w:val="single" w:sz="4" w:space="0" w:color="D1D5DB"/>
+              <w:left w:val="single" w:sz="4" w:space="0" w:color="D1D5DB"/>
+              <w:bottom w:val="single" w:sz="4" w:space="0" w:color="D1D5DB"/>
+              <w:right w:val="single" w:sz="4" w:space="0" w:color="D1D5DB"/>
+            </w:tcBorders>
+            <w:tcMar>
+              <w:top w:w="70" w:type="dxa"/>
+              <w:left w:w="100" w:type="dxa"/>
+              <w:bottom w:w="70" w:type="dxa"/>
+              <w:right w:w="100" w:type="dxa"/>
+            </w:tcMar>
+          </w:tcPr>
+          <w:p>
+            <w:pPr>
+              <w:spacing w:after="20"/>
+            </w:pPr>
+            <w:r>
+              <w:rPr>
+                <w:color w:val="172033"/>
+                <w:sz w:val="19"/>
+                <w:szCs w:val="19"/>
+              </w:rPr>
+              <w:t>GET</w:t>
+            </w:r>
+          </w:p>
+        </w:tc>
+        <w:tc>
+          <w:tcPr>
+            <w:tcW w:w="3660" w:type="dxa"/>
+            <w:tcBorders>
+              <w:top w:val="single" w:sz="4" w:space="0" w:color="D1D5DB"/>
+              <w:left w:val="single" w:sz="4" w:space="0" w:color="D1D5DB"/>
+              <w:bottom w:val="single" w:sz="4" w:space="0" w:color="D1D5DB"/>
+              <w:right w:val="single" w:sz="4" w:space="0" w:color="D1D5DB"/>
+            </w:tcBorders>
+            <w:tcMar>
+              <w:top w:w="70" w:type="dxa"/>
+              <w:left w:w="100" w:type="dxa"/>
+              <w:bottom w:w="70" w:type="dxa"/>
+              <w:right w:w="100" w:type="dxa"/>
+            </w:tcMar>
+          </w:tcPr>
+          <w:p>
+            <w:pPr>
+              <w:spacing w:after="20"/>
+            </w:pPr>
+            <w:r>
+              <w:rPr>
+                <w:color w:val="172033"/>
+                <w:sz w:val="19"/>
+                <w:szCs w:val="19"/>
+              </w:rPr>
+              <w:t>Devuelve puestos, procesos, competencias, políticas y KPIs</w:t>
+            </w:r>
+          </w:p>
+        </w:tc>
+        <w:tc>
+          <w:tcPr>
+            <w:tcW w:w="2000" w:type="dxa"/>
+            <w:tcBorders>
+              <w:top w:val="single" w:sz="4" w:space="0" w:color="D1D5DB"/>
+              <w:left w:val="single" w:sz="4" w:space="0" w:color="D1D5DB"/>
+              <w:bottom w:val="single" w:sz="4" w:space="0" w:color="D1D5DB"/>
+              <w:right w:val="single" w:sz="4" w:space="0" w:color="D1D5DB"/>
+            </w:tcBorders>
+            <w:tcMar>
+              <w:top w:w="70" w:type="dxa"/>
+              <w:left w:w="100" w:type="dxa"/>
+              <w:bottom w:w="70" w:type="dxa"/>
+              <w:right w:w="100" w:type="dxa"/>
+            </w:tcMar>
+          </w:tcPr>
+          <w:p>
+            <w:pPr>
+              <w:spacing w:after="20"/>
+            </w:pPr>
+            <w:r>
+              <w:rPr>
+                <w:color w:val="172033"/>
+                <w:sz w:val="19"/>
+                <w:szCs w:val="19"/>
+              </w:rPr>
+              <w:t>Con sesión</w:t>
+            </w:r>
+          </w:p>
+        </w:tc>
+      </w:tr>
+      <w:tr>
+        <w:trPr>
+          <w:cantSplit/>
+        </w:trPr>
+        <w:tc>
+          <w:tcPr>
+            <w:tcW w:w="1900" w:type="dxa"/>
+            <w:tcBorders>
+              <w:top w:val="single" w:sz="4" w:space="0" w:color="D1D5DB"/>
+              <w:left w:val="single" w:sz="4" w:space="0" w:color="D1D5DB"/>
+              <w:bottom w:val="single" w:sz="4" w:space="0" w:color="D1D5DB"/>
+              <w:right w:val="single" w:sz="4" w:space="0" w:color="D1D5DB"/>
+            </w:tcBorders>
+            <w:tcMar>
+              <w:top w:w="70" w:type="dxa"/>
+              <w:left w:w="100" w:type="dxa"/>
+              <w:bottom w:w="70" w:type="dxa"/>
+              <w:right w:w="100" w:type="dxa"/>
+            </w:tcMar>
+          </w:tcPr>
+          <w:p>
+            <w:pPr>
+              <w:spacing w:after="20"/>
+            </w:pPr>
+            <w:r>
+              <w:rPr>
+                <w:b/>
+                <w:bCs/>
+                <w:color w:val="172033"/>
+                <w:sz w:val="19"/>
+                <w:szCs w:val="19"/>
+              </w:rPr>
+              <w:t>/api/items</w:t>
+            </w:r>
+          </w:p>
+        </w:tc>
+        <w:tc>
+          <w:tcPr>
+            <w:tcW w:w="1800" w:type="dxa"/>
+            <w:tcBorders>
+              <w:top w:val="single" w:sz="4" w:space="0" w:color="D1D5DB"/>
+              <w:left w:val="single" w:sz="4" w:space="0" w:color="D1D5DB"/>
+              <w:bottom w:val="single" w:sz="4" w:space="0" w:color="D1D5DB"/>
+              <w:right w:val="single" w:sz="4" w:space="0" w:color="D1D5DB"/>
+            </w:tcBorders>
+            <w:tcMar>
+              <w:top w:w="70" w:type="dxa"/>
+              <w:left w:w="100" w:type="dxa"/>
+              <w:bottom w:w="70" w:type="dxa"/>
+              <w:right w:w="100" w:type="dxa"/>
+            </w:tcMar>
+          </w:tcPr>
+          <w:p>
+            <w:pPr>
+              <w:spacing w:after="20"/>
+            </w:pPr>
+            <w:r>
+              <w:rPr>
+                <w:color w:val="172033"/>
+                <w:sz w:val="19"/>
+                <w:szCs w:val="19"/>
+              </w:rPr>
+              <w:t>POST</w:t>
+            </w:r>
+          </w:p>
+        </w:tc>
+        <w:tc>
+          <w:tcPr>
+            <w:tcW w:w="3660" w:type="dxa"/>
+            <w:tcBorders>
+              <w:top w:val="single" w:sz="4" w:space="0" w:color="D1D5DB"/>
+              <w:left w:val="single" w:sz="4" w:space="0" w:color="D1D5DB"/>
+              <w:bottom w:val="single" w:sz="4" w:space="0" w:color="D1D5DB"/>
+              <w:right w:val="single" w:sz="4" w:space="0" w:color="D1D5DB"/>
+            </w:tcBorders>
+            <w:tcMar>
+              <w:top w:w="70" w:type="dxa"/>
+              <w:left w:w="100" w:type="dxa"/>
+              <w:bottom w:w="70" w:type="dxa"/>
+              <w:right w:w="100" w:type="dxa"/>
+            </w:tcMar>
+          </w:tcPr>
+          <w:p>
+            <w:pPr>
+              <w:spacing w:after="20"/>
+            </w:pPr>
+            <w:r>
+              <w:rPr>
+                <w:color w:val="172033"/>
+                <w:sz w:val="19"/>
+                <w:szCs w:val="19"/>
+              </w:rPr>
+              <w:t>Crear, editar, enviar a revisión, regresar, aprobar y eliminar en cualquier módulo</w:t>
+            </w:r>
+          </w:p>
+        </w:tc>
+        <w:tc>
+          <w:tcPr>
+            <w:tcW w:w="2000" w:type="dxa"/>
+            <w:tcBorders>
+              <w:top w:val="single" w:sz="4" w:space="0" w:color="D1D5DB"/>
+              <w:left w:val="single" w:sz="4" w:space="0" w:color="D1D5DB"/>
+              <w:bottom w:val="single" w:sz="4" w:space="0" w:color="D1D5DB"/>
+              <w:right w:val="single" w:sz="4" w:space="0" w:color="D1D5DB"/>
+            </w:tcBorders>
+            <w:tcMar>
+              <w:top w:w="70" w:type="dxa"/>
+              <w:left w:w="100" w:type="dxa"/>
+              <w:bottom w:w="70" w:type="dxa"/>
+              <w:right w:w="100" w:type="dxa"/>
+            </w:tcMar>
+          </w:tcPr>
+          <w:p>
+            <w:pPr>
+              <w:spacing w:after="20"/>
+            </w:pPr>
+            <w:r>
+              <w:rPr>
+                <w:color w:val="172033"/>
+                <w:sz w:val="19"/>
+                <w:szCs w:val="19"/>
+              </w:rPr>
+              <w:t>Según permisos del rol</w:t>
+            </w:r>
+          </w:p>
+        </w:tc>
+      </w:tr>
+      <w:tr>
+        <w:trPr>
+          <w:cantSplit/>
+        </w:trPr>
+        <w:tc>
+          <w:tcPr>
+            <w:tcW w:w="1900" w:type="dxa"/>
+            <w:tcBorders>
+              <w:top w:val="single" w:sz="4" w:space="0" w:color="D1D5DB"/>
+              <w:left w:val="single" w:sz="4" w:space="0" w:color="D1D5DB"/>
+              <w:bottom w:val="single" w:sz="4" w:space="0" w:color="D1D5DB"/>
+              <w:right w:val="single" w:sz="4" w:space="0" w:color="D1D5DB"/>
+            </w:tcBorders>
+            <w:tcMar>
+              <w:top w:w="70" w:type="dxa"/>
+              <w:left w:w="100" w:type="dxa"/>
+              <w:bottom w:w="70" w:type="dxa"/>
+              <w:right w:w="100" w:type="dxa"/>
+            </w:tcMar>
+          </w:tcPr>
+          <w:p>
+            <w:pPr>
+              <w:spacing w:after="20"/>
+            </w:pPr>
+            <w:r>
+              <w:rPr>
+                <w:b/>
+                <w:bCs/>
+                <w:color w:val="172033"/>
+                <w:sz w:val="19"/>
+                <w:szCs w:val="19"/>
+              </w:rPr>
+              <w:t>/api/items (reset)</w:t>
+            </w:r>
+          </w:p>
+        </w:tc>
+        <w:tc>
+          <w:tcPr>
+            <w:tcW w:w="1800" w:type="dxa"/>
+            <w:tcBorders>
+              <w:top w:val="single" w:sz="4" w:space="0" w:color="D1D5DB"/>
+              <w:left w:val="single" w:sz="4" w:space="0" w:color="D1D5DB"/>
+              <w:bottom w:val="single" w:sz="4" w:space="0" w:color="D1D5DB"/>
+              <w:right w:val="single" w:sz="4" w:space="0" w:color="D1D5DB"/>
+            </w:tcBorders>
+            <w:tcMar>
+              <w:top w:w="70" w:type="dxa"/>
+              <w:left w:w="100" w:type="dxa"/>
+              <w:bottom w:w="70" w:type="dxa"/>
+              <w:right w:w="100" w:type="dxa"/>
+            </w:tcMar>
+          </w:tcPr>
+          <w:p>
+            <w:pPr>
+              <w:spacing w:after="20"/>
+            </w:pPr>
+            <w:r>
+              <w:rPr>
+                <w:color w:val="172033"/>
+                <w:sz w:val="19"/>
+                <w:szCs w:val="19"/>
+              </w:rPr>
+              <w:t>POST</w:t>
+            </w:r>
+          </w:p>
+        </w:tc>
+        <w:tc>
+          <w:tcPr>
+            <w:tcW w:w="3660" w:type="dxa"/>
+            <w:tcBorders>
+              <w:top w:val="single" w:sz="4" w:space="0" w:color="D1D5DB"/>
+              <w:left w:val="single" w:sz="4" w:space="0" w:color="D1D5DB"/>
+              <w:bottom w:val="single" w:sz="4" w:space="0" w:color="D1D5DB"/>
+              <w:right w:val="single" w:sz="4" w:space="0" w:color="D1D5DB"/>
+            </w:tcBorders>
+            <w:tcMar>
+              <w:top w:w="70" w:type="dxa"/>
+              <w:left w:w="100" w:type="dxa"/>
+              <w:bottom w:w="70" w:type="dxa"/>
+              <w:right w:w="100" w:type="dxa"/>
+            </w:tcMar>
+          </w:tcPr>
+          <w:p>
+            <w:pPr>
+              <w:spacing w:after="20"/>
+            </w:pPr>
+            <w:r>
+              <w:rPr>
+                <w:color w:val="172033"/>
+                <w:sz w:val="19"/>
+                <w:szCs w:val="19"/>
+              </w:rPr>
+              <w:t>Restablecer los datos de ejemplo</w:t>
+            </w:r>
+          </w:p>
+        </w:tc>
+        <w:tc>
+          <w:tcPr>
+            <w:tcW w:w="2000" w:type="dxa"/>
+            <w:tcBorders>
+              <w:top w:val="single" w:sz="4" w:space="0" w:color="D1D5DB"/>
+              <w:left w:val="single" w:sz="4" w:space="0" w:color="D1D5DB"/>
+              <w:bottom w:val="single" w:sz="4" w:space="0" w:color="D1D5DB"/>
+              <w:right w:val="single" w:sz="4" w:space="0" w:color="D1D5DB"/>
+            </w:tcBorders>
+            <w:tcMar>
+              <w:top w:w="70" w:type="dxa"/>
+              <w:left w:w="100" w:type="dxa"/>
+              <w:bottom w:w="70" w:type="dxa"/>
+              <w:right w:w="100" w:type="dxa"/>
+            </w:tcMar>
+          </w:tcPr>
+          <w:p>
+            <w:pPr>
+              <w:spacing w:after="20"/>
+            </w:pPr>
+            <w:r>
+              <w:rPr>
+                <w:color w:val="172033"/>
+                <w:sz w:val="19"/>
+                <w:szCs w:val="19"/>
+              </w:rPr>
+              <w:t>Solo Administrador</w:t>
+            </w:r>
+          </w:p>
+        </w:tc>
+      </w:tr>
+      <w:tr>
+        <w:trPr>
+          <w:cantSplit/>
+        </w:trPr>
+        <w:tc>
+          <w:tcPr>
+            <w:tcW w:w="1900" w:type="dxa"/>
+            <w:tcBorders>
+              <w:top w:val="single" w:sz="4" w:space="0" w:color="D1D5DB"/>
+              <w:left w:val="single" w:sz="4" w:space="0" w:color="D1D5DB"/>
+              <w:bottom w:val="single" w:sz="4" w:space="0" w:color="D1D5DB"/>
+              <w:right w:val="single" w:sz="4" w:space="0" w:color="D1D5DB"/>
+            </w:tcBorders>
+            <w:tcMar>
+              <w:top w:w="70" w:type="dxa"/>
+              <w:left w:w="100" w:type="dxa"/>
+              <w:bottom w:w="70" w:type="dxa"/>
+              <w:right w:w="100" w:type="dxa"/>
+            </w:tcMar>
+          </w:tcPr>
+          <w:p>
+            <w:pPr>
+              <w:spacing w:after="20"/>
+            </w:pPr>
+            <w:r>
+              <w:rPr>
+                <w:b/>
+                <w:bCs/>
+                <w:color w:val="172033"/>
+                <w:sz w:val="19"/>
+                <w:szCs w:val="19"/>
+              </w:rPr>
+              <w:t>/api/generate, /api/draft</w:t>
+            </w:r>
+          </w:p>
+        </w:tc>
+        <w:tc>
+          <w:tcPr>
+            <w:tcW w:w="1800" w:type="dxa"/>
+            <w:tcBorders>
+              <w:top w:val="single" w:sz="4" w:space="0" w:color="D1D5DB"/>
+              <w:left w:val="single" w:sz="4" w:space="0" w:color="D1D5DB"/>
+              <w:bottom w:val="single" w:sz="4" w:space="0" w:color="D1D5DB"/>
+              <w:right w:val="single" w:sz="4" w:space="0" w:color="D1D5DB"/>
+            </w:tcBorders>
+            <w:tcMar>
+              <w:top w:w="70" w:type="dxa"/>
+              <w:left w:w="100" w:type="dxa"/>
+              <w:bottom w:w="70" w:type="dxa"/>
+              <w:right w:w="100" w:type="dxa"/>
+            </w:tcMar>
+          </w:tcPr>
+          <w:p>
+            <w:pPr>
+              <w:spacing w:after="20"/>
+            </w:pPr>
+            <w:r>
+              <w:rPr>
+                <w:color w:val="172033"/>
+                <w:sz w:val="19"/>
+                <w:szCs w:val="19"/>
+              </w:rPr>
+              <w:t>POST</w:t>
+            </w:r>
+          </w:p>
+        </w:tc>
+        <w:tc>
+          <w:tcPr>
+            <w:tcW w:w="3660" w:type="dxa"/>
+            <w:tcBorders>
+              <w:top w:val="single" w:sz="4" w:space="0" w:color="D1D5DB"/>
+              <w:left w:val="single" w:sz="4" w:space="0" w:color="D1D5DB"/>
+              <w:bottom w:val="single" w:sz="4" w:space="0" w:color="D1D5DB"/>
+              <w:right w:val="single" w:sz="4" w:space="0" w:color="D1D5DB"/>
+            </w:tcBorders>
+            <w:tcMar>
+              <w:top w:w="70" w:type="dxa"/>
+              <w:left w:w="100" w:type="dxa"/>
+              <w:bottom w:w="70" w:type="dxa"/>
+              <w:right w:w="100" w:type="dxa"/>
+            </w:tcMar>
+          </w:tcPr>
+          <w:p>
+            <w:pPr>
+              <w:spacing w:after="20"/>
+            </w:pPr>
+            <w:r>
+              <w:rPr>
+                <w:color w:val="172033"/>
+                <w:sz w:val="19"/>
+                <w:szCs w:val="19"/>
+              </w:rPr>
+              <w:t>Borradores con IA (puestos, procesos, competencias, políticas y KPIs)</w:t>
+            </w:r>
+          </w:p>
+        </w:tc>
+        <w:tc>
+          <w:tcPr>
+            <w:tcW w:w="2000" w:type="dxa"/>
+            <w:tcBorders>
+              <w:top w:val="single" w:sz="4" w:space="0" w:color="D1D5DB"/>
+              <w:left w:val="single" w:sz="4" w:space="0" w:color="D1D5DB"/>
+              <w:bottom w:val="single" w:sz="4" w:space="0" w:color="D1D5DB"/>
+              <w:right w:val="single" w:sz="4" w:space="0" w:color="D1D5DB"/>
+            </w:tcBorders>
+            <w:tcMar>
+              <w:top w:w="70" w:type="dxa"/>
+              <w:left w:w="100" w:type="dxa"/>
+              <w:bottom w:w="70" w:type="dxa"/>
+              <w:right w:w="100" w:type="dxa"/>
+            </w:tcMar>
+          </w:tcPr>
+          <w:p>
+            <w:pPr>
+              <w:spacing w:after="20"/>
+            </w:pPr>
+            <w:r>
+              <w:rPr>
+                <w:color w:val="172033"/>
+                <w:sz w:val="19"/>
+                <w:szCs w:val="19"/>
+              </w:rPr>
+              <w:t>Con sesión</w:t>
+            </w:r>
+          </w:p>
+        </w:tc>
+      </w:tr>
+      <w:tr>
+        <w:trPr>
+          <w:cantSplit/>
+        </w:trPr>
+        <w:tc>
+          <w:tcPr>
+            <w:tcW w:w="1900" w:type="dxa"/>
+            <w:tcBorders>
+              <w:top w:val="single" w:sz="4" w:space="0" w:color="D1D5DB"/>
+              <w:left w:val="single" w:sz="4" w:space="0" w:color="D1D5DB"/>
+              <w:bottom w:val="single" w:sz="4" w:space="0" w:color="D1D5DB"/>
+              <w:right w:val="single" w:sz="4" w:space="0" w:color="D1D5DB"/>
+            </w:tcBorders>
+            <w:tcMar>
+              <w:top w:w="70" w:type="dxa"/>
+              <w:left w:w="100" w:type="dxa"/>
+              <w:bottom w:w="70" w:type="dxa"/>
+              <w:right w:w="100" w:type="dxa"/>
+            </w:tcMar>
+          </w:tcPr>
+          <w:p>
+            <w:pPr>
+              <w:spacing w:after="20"/>
+            </w:pPr>
+            <w:r>
+              <w:rPr>
+                <w:b/>
+                <w:bCs/>
+                <w:color w:val="172033"/>
+                <w:sz w:val="19"/>
+                <w:szCs w:val="19"/>
+              </w:rPr>
+              <w:t>/api/chat</w:t>
+            </w:r>
+          </w:p>
+        </w:tc>
+        <w:tc>
+          <w:tcPr>
+            <w:tcW w:w="1800" w:type="dxa"/>
+            <w:tcBorders>
+              <w:top w:val="single" w:sz="4" w:space="0" w:color="D1D5DB"/>
+              <w:left w:val="single" w:sz="4" w:space="0" w:color="D1D5DB"/>
+              <w:bottom w:val="single" w:sz="4" w:space="0" w:color="D1D5DB"/>
+              <w:right w:val="single" w:sz="4" w:space="0" w:color="D1D5DB"/>
+            </w:tcBorders>
+            <w:tcMar>
+              <w:top w:w="70" w:type="dxa"/>
+              <w:left w:w="100" w:type="dxa"/>
+              <w:bottom w:w="70" w:type="dxa"/>
+              <w:right w:w="100" w:type="dxa"/>
+            </w:tcMar>
+          </w:tcPr>
+          <w:p>
+            <w:pPr>
+              <w:spacing w:after="20"/>
+            </w:pPr>
+            <w:r>
+              <w:rPr>
+                <w:color w:val="172033"/>
+                <w:sz w:val="19"/>
+                <w:szCs w:val="19"/>
+              </w:rPr>
+              <w:t>POST</w:t>
+            </w:r>
+          </w:p>
+        </w:tc>
+        <w:tc>
+          <w:tcPr>
+            <w:tcW w:w="3660" w:type="dxa"/>
+            <w:tcBorders>
+              <w:top w:val="single" w:sz="4" w:space="0" w:color="D1D5DB"/>
+              <w:left w:val="single" w:sz="4" w:space="0" w:color="D1D5DB"/>
+              <w:bottom w:val="single" w:sz="4" w:space="0" w:color="D1D5DB"/>
+              <w:right w:val="single" w:sz="4" w:space="0" w:color="D1D5DB"/>
+            </w:tcBorders>
+            <w:tcMar>
+              <w:top w:w="70" w:type="dxa"/>
+              <w:left w:w="100" w:type="dxa"/>
+              <w:bottom w:w="70" w:type="dxa"/>
+              <w:right w:w="100" w:type="dxa"/>
+            </w:tcMar>
+          </w:tcPr>
+          <w:p>
+            <w:pPr>
+              <w:spacing w:after="20"/>
+            </w:pPr>
+            <w:r>
+              <w:rPr>
+                <w:color w:val="172033"/>
+                <w:sz w:val="19"/>
+                <w:szCs w:val="19"/>
+              </w:rPr>
+              <w:t>Chat con el asistente</w:t>
+            </w:r>
+          </w:p>
+        </w:tc>
+        <w:tc>
+          <w:tcPr>
+            <w:tcW w:w="2000" w:type="dxa"/>
+            <w:tcBorders>
+              <w:top w:val="single" w:sz="4" w:space="0" w:color="D1D5DB"/>
+              <w:left w:val="single" w:sz="4" w:space="0" w:color="D1D5DB"/>
+              <w:bottom w:val="single" w:sz="4" w:space="0" w:color="D1D5DB"/>
+              <w:right w:val="single" w:sz="4" w:space="0" w:color="D1D5DB"/>
+            </w:tcBorders>
+            <w:tcMar>
+              <w:top w:w="70" w:type="dxa"/>
+              <w:left w:w="100" w:type="dxa"/>
+              <w:bottom w:w="70" w:type="dxa"/>
+              <w:right w:w="100" w:type="dxa"/>
+            </w:tcMar>
+          </w:tcPr>
+          <w:p>
+            <w:pPr>
+              <w:spacing w:after="20"/>
+            </w:pPr>
+            <w:r>
+              <w:rPr>
+                <w:color w:val="172033"/>
+                <w:sz w:val="19"/>
+                <w:szCs w:val="19"/>
+              </w:rPr>
+              <w:t>Con sesión</w:t>
+            </w:r>
+          </w:p>
+        </w:tc>
+      </w:tr>
+    </w:tbl>
+    <w:p>
+      <w:pPr>
+        <w:pStyle w:val="Ttulo2"/>
+      </w:pPr>
+      <w:r>
+        <w:t>25.3 Permisos por rol</w:t>
+      </w:r>
+    </w:p>
+    <w:tbl>
+      <w:tblPr>
+        <w:tblW w:w="9360" w:type="dxa"/>
+        <w:tblBorders>
+          <w:top w:val="single" w:sz="4" w:space="0" w:color="auto"/>
+          <w:left w:val="single" w:sz="4" w:space="0" w:color="auto"/>
+          <w:bottom w:val="single" w:sz="4" w:space="0" w:color="auto"/>
+          <w:right w:val="single" w:sz="4" w:space="0" w:color="auto"/>
+          <w:insideH w:val="single" w:sz="4" w:space="0" w:color="auto"/>
+          <w:insideV w:val="single" w:sz="4" w:space="0" w:color="auto"/>
+        </w:tblBorders>
+        <w:tblCellMar>
+          <w:left w:w="10" w:type="dxa"/>
+          <w:right w:w="10" w:type="dxa"/>
+        </w:tblCellMar>
+        <w:tblLook w:val="04A0" w:firstRow="1" w:lastRow="0" w:firstColumn="1" w:lastColumn="0" w:noHBand="0" w:noVBand="1"/>
+      </w:tblPr>
+      <w:tblGrid>
+        <w:gridCol w:w="1900"/>
+        <w:gridCol w:w="4560"/>
+        <w:gridCol w:w="2900"/>
+      </w:tblGrid>
+      <w:tr>
+        <w:trPr>
+          <w:tblHeader/>
+        </w:trPr>
+        <w:tc>
+          <w:tcPr>
+            <w:tcW w:w="1900" w:type="dxa"/>
+            <w:tcBorders>
+              <w:top w:val="single" w:sz="4" w:space="0" w:color="D1D5DB"/>
+              <w:left w:val="single" w:sz="4" w:space="0" w:color="D1D5DB"/>
+              <w:bottom w:val="single" w:sz="4" w:space="0" w:color="D1D5DB"/>
+              <w:right w:val="single" w:sz="4" w:space="0" w:color="D1D5DB"/>
+            </w:tcBorders>
+            <w:shd w:val="clear" w:color="auto" w:fill="233FA8"/>
+            <w:tcMar>
+              <w:top w:w="70" w:type="dxa"/>
+              <w:left w:w="100" w:type="dxa"/>
+              <w:bottom w:w="70" w:type="dxa"/>
+              <w:right w:w="100" w:type="dxa"/>
+            </w:tcMar>
+          </w:tcPr>
+          <w:p>
+            <w:pPr>
+              <w:spacing w:after="20"/>
+            </w:pPr>
+            <w:r>
+              <w:rPr>
+                <w:b/>
+                <w:bCs/>
+                <w:color w:val="FFFFFF"/>
+                <w:sz w:val="19"/>
+                <w:szCs w:val="19"/>
+              </w:rPr>
+              <w:t>Módulo</w:t>
+            </w:r>
+          </w:p>
+        </w:tc>
+        <w:tc>
+          <w:tcPr>
+            <w:tcW w:w="4560" w:type="dxa"/>
+            <w:tcBorders>
+              <w:top w:val="single" w:sz="4" w:space="0" w:color="D1D5DB"/>
+              <w:left w:val="single" w:sz="4" w:space="0" w:color="D1D5DB"/>
+              <w:bottom w:val="single" w:sz="4" w:space="0" w:color="D1D5DB"/>
+              <w:right w:val="single" w:sz="4" w:space="0" w:color="D1D5DB"/>
+            </w:tcBorders>
+            <w:shd w:val="clear" w:color="auto" w:fill="233FA8"/>
+            <w:tcMar>
+              <w:top w:w="70" w:type="dxa"/>
+              <w:left w:w="100" w:type="dxa"/>
+              <w:bottom w:w="70" w:type="dxa"/>
+              <w:right w:w="100" w:type="dxa"/>
+            </w:tcMar>
+          </w:tcPr>
+          <w:p>
+            <w:pPr>
+              <w:spacing w:after="20"/>
+            </w:pPr>
+            <w:r>
+              <w:rPr>
+                <w:b/>
+                <w:bCs/>
+                <w:color w:val="FFFFFF"/>
+                <w:sz w:val="19"/>
+                <w:szCs w:val="19"/>
+              </w:rPr>
+              <w:t>Editar (crear, modificar, enviar, eliminar)</w:t>
+            </w:r>
+          </w:p>
+        </w:tc>
+        <w:tc>
+          <w:tcPr>
+            <w:tcW w:w="2900" w:type="dxa"/>
+            <w:tcBorders>
+              <w:top w:val="single" w:sz="4" w:space="0" w:color="D1D5DB"/>
+              <w:left w:val="single" w:sz="4" w:space="0" w:color="D1D5DB"/>
+              <w:bottom w:val="single" w:sz="4" w:space="0" w:color="D1D5DB"/>
+              <w:right w:val="single" w:sz="4" w:space="0" w:color="D1D5DB"/>
+            </w:tcBorders>
+            <w:shd w:val="clear" w:color="auto" w:fill="233FA8"/>
+            <w:tcMar>
+              <w:top w:w="70" w:type="dxa"/>
+              <w:left w:w="100" w:type="dxa"/>
+              <w:bottom w:w="70" w:type="dxa"/>
+              <w:right w:w="100" w:type="dxa"/>
+            </w:tcMar>
+          </w:tcPr>
+          <w:p>
+            <w:pPr>
+              <w:spacing w:after="20"/>
+            </w:pPr>
+            <w:r>
+              <w:rPr>
+                <w:b/>
+                <w:bCs/>
+                <w:color w:val="FFFFFF"/>
+                <w:sz w:val="19"/>
+                <w:szCs w:val="19"/>
+              </w:rPr>
+              <w:t>Aprobar</w:t>
+            </w:r>
+          </w:p>
+        </w:tc>
+      </w:tr>
+      <w:tr>
+        <w:trPr>
+          <w:cantSplit/>
+        </w:trPr>
+        <w:tc>
+          <w:tcPr>
+            <w:tcW w:w="1900" w:type="dxa"/>
+            <w:tcBorders>
+              <w:top w:val="single" w:sz="4" w:space="0" w:color="D1D5DB"/>
+              <w:left w:val="single" w:sz="4" w:space="0" w:color="D1D5DB"/>
+              <w:bottom w:val="single" w:sz="4" w:space="0" w:color="D1D5DB"/>
+              <w:right w:val="single" w:sz="4" w:space="0" w:color="D1D5DB"/>
+            </w:tcBorders>
+            <w:tcMar>
+              <w:top w:w="70" w:type="dxa"/>
+              <w:left w:w="100" w:type="dxa"/>
+              <w:bottom w:w="70" w:type="dxa"/>
+              <w:right w:w="100" w:type="dxa"/>
+            </w:tcMar>
+          </w:tcPr>
+          <w:p>
+            <w:pPr>
+              <w:spacing w:after="20"/>
+            </w:pPr>
+            <w:r>
+              <w:rPr>
+                <w:b/>
+                <w:bCs/>
+                <w:color w:val="172033"/>
+                <w:sz w:val="19"/>
+                <w:szCs w:val="19"/>
+              </w:rPr>
+              <w:t>Puestos y organigrama</w:t>
+            </w:r>
+          </w:p>
+        </w:tc>
+        <w:tc>
+          <w:tcPr>
+            <w:tcW w:w="4560" w:type="dxa"/>
+            <w:tcBorders>
+              <w:top w:val="single" w:sz="4" w:space="0" w:color="D1D5DB"/>
+              <w:left w:val="single" w:sz="4" w:space="0" w:color="D1D5DB"/>
+              <w:bottom w:val="single" w:sz="4" w:space="0" w:color="D1D5DB"/>
+              <w:right w:val="single" w:sz="4" w:space="0" w:color="D1D5DB"/>
+            </w:tcBorders>
+            <w:tcMar>
+              <w:top w:w="70" w:type="dxa"/>
+              <w:left w:w="100" w:type="dxa"/>
+              <w:bottom w:w="70" w:type="dxa"/>
+              <w:right w:w="100" w:type="dxa"/>
+            </w:tcMar>
+          </w:tcPr>
+          <w:p>
+            <w:pPr>
+              <w:spacing w:after="20"/>
+            </w:pPr>
+            <w:r>
+              <w:rPr>
+                <w:color w:val="172033"/>
+                <w:sz w:val="19"/>
+                <w:szCs w:val="19"/>
+              </w:rPr>
+              <w:t>Administrador, Recursos Humanos</w:t>
+            </w:r>
+          </w:p>
+        </w:tc>
+        <w:tc>
+          <w:tcPr>
+            <w:tcW w:w="2900" w:type="dxa"/>
+            <w:tcBorders>
+              <w:top w:val="single" w:sz="4" w:space="0" w:color="D1D5DB"/>
+              <w:left w:val="single" w:sz="4" w:space="0" w:color="D1D5DB"/>
+              <w:bottom w:val="single" w:sz="4" w:space="0" w:color="D1D5DB"/>
+              <w:right w:val="single" w:sz="4" w:space="0" w:color="D1D5DB"/>
+            </w:tcBorders>
+            <w:tcMar>
+              <w:top w:w="70" w:type="dxa"/>
+              <w:left w:w="100" w:type="dxa"/>
+              <w:bottom w:w="70" w:type="dxa"/>
+              <w:right w:w="100" w:type="dxa"/>
+            </w:tcMar>
+          </w:tcPr>
+          <w:p>
+            <w:pPr>
+              <w:spacing w:after="20"/>
+            </w:pPr>
+            <w:r>
+              <w:rPr>
+                <w:color w:val="172033"/>
+                <w:sz w:val="19"/>
+                <w:szCs w:val="19"/>
+              </w:rPr>
+              <w:t>Administrador, Calidad</w:t>
+            </w:r>
+          </w:p>
+        </w:tc>
+      </w:tr>
+      <w:tr>
+        <w:trPr>
+          <w:cantSplit/>
+        </w:trPr>
+        <w:tc>
+          <w:tcPr>
+            <w:tcW w:w="1900" w:type="dxa"/>
+            <w:tcBorders>
+              <w:top w:val="single" w:sz="4" w:space="0" w:color="D1D5DB"/>
+              <w:left w:val="single" w:sz="4" w:space="0" w:color="D1D5DB"/>
+              <w:bottom w:val="single" w:sz="4" w:space="0" w:color="D1D5DB"/>
+              <w:right w:val="single" w:sz="4" w:space="0" w:color="D1D5DB"/>
+            </w:tcBorders>
+            <w:tcMar>
+              <w:top w:w="70" w:type="dxa"/>
+              <w:left w:w="100" w:type="dxa"/>
+              <w:bottom w:w="70" w:type="dxa"/>
+              <w:right w:w="100" w:type="dxa"/>
+            </w:tcMar>
+          </w:tcPr>
+          <w:p>
+            <w:pPr>
+              <w:spacing w:after="20"/>
+            </w:pPr>
+            <w:r>
+              <w:rPr>
+                <w:b/>
+                <w:bCs/>
+                <w:color w:val="172033"/>
+                <w:sz w:val="19"/>
+                <w:szCs w:val="19"/>
+              </w:rPr>
+              <w:t>Procesos ISO</w:t>
+            </w:r>
+          </w:p>
+        </w:tc>
+        <w:tc>
+          <w:tcPr>
+            <w:tcW w:w="4560" w:type="dxa"/>
+            <w:tcBorders>
+              <w:top w:val="single" w:sz="4" w:space="0" w:color="D1D5DB"/>
+              <w:left w:val="single" w:sz="4" w:space="0" w:color="D1D5DB"/>
+              <w:bottom w:val="single" w:sz="4" w:space="0" w:color="D1D5DB"/>
+              <w:right w:val="single" w:sz="4" w:space="0" w:color="D1D5DB"/>
+            </w:tcBorders>
+            <w:tcMar>
+              <w:top w:w="70" w:type="dxa"/>
+              <w:left w:w="100" w:type="dxa"/>
+              <w:bottom w:w="70" w:type="dxa"/>
+              <w:right w:w="100" w:type="dxa"/>
+            </w:tcMar>
+          </w:tcPr>
+          <w:p>
+            <w:pPr>
+              <w:spacing w:after="20"/>
+            </w:pPr>
+            <w:r>
+              <w:rPr>
+                <w:color w:val="172033"/>
+                <w:sz w:val="19"/>
+                <w:szCs w:val="19"/>
+              </w:rPr>
+              <w:t>Administrador, Calidad</w:t>
+            </w:r>
+          </w:p>
+        </w:tc>
+        <w:tc>
+          <w:tcPr>
+            <w:tcW w:w="2900" w:type="dxa"/>
+            <w:tcBorders>
+              <w:top w:val="single" w:sz="4" w:space="0" w:color="D1D5DB"/>
+              <w:left w:val="single" w:sz="4" w:space="0" w:color="D1D5DB"/>
+              <w:bottom w:val="single" w:sz="4" w:space="0" w:color="D1D5DB"/>
+              <w:right w:val="single" w:sz="4" w:space="0" w:color="D1D5DB"/>
+            </w:tcBorders>
+            <w:tcMar>
+              <w:top w:w="70" w:type="dxa"/>
+              <w:left w:w="100" w:type="dxa"/>
+              <w:bottom w:w="70" w:type="dxa"/>
+              <w:right w:w="100" w:type="dxa"/>
+            </w:tcMar>
+          </w:tcPr>
+          <w:p>
+            <w:pPr>
+              <w:spacing w:after="20"/>
+            </w:pPr>
+            <w:r>
+              <w:rPr>
+                <w:color w:val="172033"/>
+                <w:sz w:val="19"/>
+                <w:szCs w:val="19"/>
+              </w:rPr>
+              <w:t>Administrador, Calidad</w:t>
+            </w:r>
+          </w:p>
+        </w:tc>
+      </w:tr>
+      <w:tr>
+        <w:trPr>
+          <w:cantSplit/>
+        </w:trPr>
+        <w:tc>
+          <w:tcPr>
+            <w:tcW w:w="1900" w:type="dxa"/>
+            <w:tcBorders>
+              <w:top w:val="single" w:sz="4" w:space="0" w:color="D1D5DB"/>
+              <w:left w:val="single" w:sz="4" w:space="0" w:color="D1D5DB"/>
+              <w:bottom w:val="single" w:sz="4" w:space="0" w:color="D1D5DB"/>
+              <w:right w:val="single" w:sz="4" w:space="0" w:color="D1D5DB"/>
+            </w:tcBorders>
+            <w:tcMar>
+              <w:top w:w="70" w:type="dxa"/>
+              <w:left w:w="100" w:type="dxa"/>
+              <w:bottom w:w="70" w:type="dxa"/>
+              <w:right w:w="100" w:type="dxa"/>
+            </w:tcMar>
+          </w:tcPr>
+          <w:p>
+            <w:pPr>
+              <w:spacing w:after="20"/>
+            </w:pPr>
+            <w:r>
+              <w:rPr>
+                <w:b/>
+                <w:bCs/>
+                <w:color w:val="172033"/>
+                <w:sz w:val="19"/>
+                <w:szCs w:val="19"/>
+              </w:rPr>
+              <w:t>Competencias</w:t>
+            </w:r>
+          </w:p>
+        </w:tc>
+        <w:tc>
+          <w:tcPr>
+            <w:tcW w:w="4560" w:type="dxa"/>
+            <w:tcBorders>
+              <w:top w:val="single" w:sz="4" w:space="0" w:color="D1D5DB"/>
+              <w:left w:val="single" w:sz="4" w:space="0" w:color="D1D5DB"/>
+              <w:bottom w:val="single" w:sz="4" w:space="0" w:color="D1D5DB"/>
+              <w:right w:val="single" w:sz="4" w:space="0" w:color="D1D5DB"/>
+            </w:tcBorders>
+            <w:tcMar>
+              <w:top w:w="70" w:type="dxa"/>
+              <w:left w:w="100" w:type="dxa"/>
+              <w:bottom w:w="70" w:type="dxa"/>
+              <w:right w:w="100" w:type="dxa"/>
+            </w:tcMar>
+          </w:tcPr>
+          <w:p>
+            <w:pPr>
+              <w:spacing w:after="20"/>
+            </w:pPr>
+            <w:r>
+              <w:rPr>
+                <w:color w:val="172033"/>
+                <w:sz w:val="19"/>
+                <w:szCs w:val="19"/>
+              </w:rPr>
+              <w:t>Administrador, Recursos Humanos</w:t>
+            </w:r>
+          </w:p>
+        </w:tc>
+        <w:tc>
+          <w:tcPr>
+            <w:tcW w:w="2900" w:type="dxa"/>
+            <w:tcBorders>
+              <w:top w:val="single" w:sz="4" w:space="0" w:color="D1D5DB"/>
+              <w:left w:val="single" w:sz="4" w:space="0" w:color="D1D5DB"/>
+              <w:bottom w:val="single" w:sz="4" w:space="0" w:color="D1D5DB"/>
+              <w:right w:val="single" w:sz="4" w:space="0" w:color="D1D5DB"/>
+            </w:tcBorders>
+            <w:tcMar>
+              <w:top w:w="70" w:type="dxa"/>
+              <w:left w:w="100" w:type="dxa"/>
+              <w:bottom w:w="70" w:type="dxa"/>
+              <w:right w:w="100" w:type="dxa"/>
+            </w:tcMar>
+          </w:tcPr>
+          <w:p>
+            <w:pPr>
+              <w:spacing w:after="20"/>
+            </w:pPr>
+            <w:r>
+              <w:rPr>
+                <w:color w:val="172033"/>
+                <w:sz w:val="19"/>
+                <w:szCs w:val="19"/>
+              </w:rPr>
+              <w:t>Administrador, Recursos Humanos</w:t>
+            </w:r>
+          </w:p>
+        </w:tc>
+      </w:tr>
+      <w:tr>
+        <w:trPr>
+          <w:cantSplit/>
+        </w:trPr>
+        <w:tc>
+          <w:tcPr>
+            <w:tcW w:w="1900" w:type="dxa"/>
+            <w:tcBorders>
+              <w:top w:val="single" w:sz="4" w:space="0" w:color="D1D5DB"/>
+              <w:left w:val="single" w:sz="4" w:space="0" w:color="D1D5DB"/>
+              <w:bottom w:val="single" w:sz="4" w:space="0" w:color="D1D5DB"/>
+              <w:right w:val="single" w:sz="4" w:space="0" w:color="D1D5DB"/>
+            </w:tcBorders>
+            <w:tcMar>
+              <w:top w:w="70" w:type="dxa"/>
+              <w:left w:w="100" w:type="dxa"/>
+              <w:bottom w:w="70" w:type="dxa"/>
+              <w:right w:w="100" w:type="dxa"/>
+            </w:tcMar>
+          </w:tcPr>
+          <w:p>
+            <w:pPr>
+              <w:spacing w:after="20"/>
+            </w:pPr>
+            <w:r>
+              <w:rPr>
+                <w:b/>
+                <w:bCs/>
+                <w:color w:val="172033"/>
+                <w:sz w:val="19"/>
+                <w:szCs w:val="19"/>
+              </w:rPr>
+              <w:t>Políticas</w:t>
+            </w:r>
+          </w:p>
+        </w:tc>
+        <w:tc>
+          <w:tcPr>
+            <w:tcW w:w="4560" w:type="dxa"/>
+            <w:tcBorders>
+              <w:top w:val="single" w:sz="4" w:space="0" w:color="D1D5DB"/>
+              <w:left w:val="single" w:sz="4" w:space="0" w:color="D1D5DB"/>
+              <w:bottom w:val="single" w:sz="4" w:space="0" w:color="D1D5DB"/>
+              <w:right w:val="single" w:sz="4" w:space="0" w:color="D1D5DB"/>
+            </w:tcBorders>
+            <w:tcMar>
+              <w:top w:w="70" w:type="dxa"/>
+              <w:left w:w="100" w:type="dxa"/>
+              <w:bottom w:w="70" w:type="dxa"/>
+              <w:right w:w="100" w:type="dxa"/>
+            </w:tcMar>
+          </w:tcPr>
+          <w:p>
+            <w:pPr>
+              <w:spacing w:after="20"/>
+            </w:pPr>
+            <w:r>
+              <w:rPr>
+                <w:color w:val="172033"/>
+                <w:sz w:val="19"/>
+                <w:szCs w:val="19"/>
+              </w:rPr>
+              <w:t>Administrador, Recursos Humanos, Calidad</w:t>
+            </w:r>
+          </w:p>
+        </w:tc>
+        <w:tc>
+          <w:tcPr>
+            <w:tcW w:w="2900" w:type="dxa"/>
+            <w:tcBorders>
+              <w:top w:val="single" w:sz="4" w:space="0" w:color="D1D5DB"/>
+              <w:left w:val="single" w:sz="4" w:space="0" w:color="D1D5DB"/>
+              <w:bottom w:val="single" w:sz="4" w:space="0" w:color="D1D5DB"/>
+              <w:right w:val="single" w:sz="4" w:space="0" w:color="D1D5DB"/>
+            </w:tcBorders>
+            <w:tcMar>
+              <w:top w:w="70" w:type="dxa"/>
+              <w:left w:w="100" w:type="dxa"/>
+              <w:bottom w:w="70" w:type="dxa"/>
+              <w:right w:w="100" w:type="dxa"/>
+            </w:tcMar>
+          </w:tcPr>
+          <w:p>
+            <w:pPr>
+              <w:spacing w:after="20"/>
+            </w:pPr>
+            <w:r>
+              <w:rPr>
+                <w:color w:val="172033"/>
+                <w:sz w:val="19"/>
+                <w:szCs w:val="19"/>
+              </w:rPr>
+              <w:t>Administrador, Dirección</w:t>
+            </w:r>
+          </w:p>
+        </w:tc>
+      </w:tr>
+      <w:tr>
+        <w:trPr>
+          <w:cantSplit/>
+        </w:trPr>
+        <w:tc>
+          <w:tcPr>
+            <w:tcW w:w="1900" w:type="dxa"/>
+            <w:tcBorders>
+              <w:top w:val="single" w:sz="4" w:space="0" w:color="D1D5DB"/>
+              <w:left w:val="single" w:sz="4" w:space="0" w:color="D1D5DB"/>
+              <w:bottom w:val="single" w:sz="4" w:space="0" w:color="D1D5DB"/>
+              <w:right w:val="single" w:sz="4" w:space="0" w:color="D1D5DB"/>
+            </w:tcBorders>
+            <w:tcMar>
+              <w:top w:w="70" w:type="dxa"/>
+              <w:left w:w="100" w:type="dxa"/>
+              <w:bottom w:w="70" w:type="dxa"/>
+              <w:right w:w="100" w:type="dxa"/>
+            </w:tcMar>
+          </w:tcPr>
+          <w:p>
+            <w:pPr>
+              <w:spacing w:after="20"/>
+            </w:pPr>
+            <w:r>
+              <w:rPr>
+                <w:b/>
+                <w:bCs/>
+                <w:color w:val="172033"/>
+                <w:sz w:val="19"/>
+                <w:szCs w:val="19"/>
+              </w:rPr>
+              <w:t>KPIs</w:t>
+            </w:r>
+          </w:p>
+        </w:tc>
+        <w:tc>
+          <w:tcPr>
+            <w:tcW w:w="4560" w:type="dxa"/>
+            <w:tcBorders>
+              <w:top w:val="single" w:sz="4" w:space="0" w:color="D1D5DB"/>
+              <w:left w:val="single" w:sz="4" w:space="0" w:color="D1D5DB"/>
+              <w:bottom w:val="single" w:sz="4" w:space="0" w:color="D1D5DB"/>
+              <w:right w:val="single" w:sz="4" w:space="0" w:color="D1D5DB"/>
+            </w:tcBorders>
+            <w:tcMar>
+              <w:top w:w="70" w:type="dxa"/>
+              <w:left w:w="100" w:type="dxa"/>
+              <w:bottom w:w="70" w:type="dxa"/>
+              <w:right w:w="100" w:type="dxa"/>
+            </w:tcMar>
+          </w:tcPr>
+          <w:p>
+            <w:pPr>
+              <w:spacing w:after="20"/>
+            </w:pPr>
+            <w:r>
+              <w:rPr>
+                <w:color w:val="172033"/>
+                <w:sz w:val="19"/>
+                <w:szCs w:val="19"/>
+              </w:rPr>
+              <w:t>Administrador, Recursos Humanos, Calidad</w:t>
+            </w:r>
+          </w:p>
+        </w:tc>
+        <w:tc>
+          <w:tcPr>
+            <w:tcW w:w="2900" w:type="dxa"/>
+            <w:tcBorders>
+              <w:top w:val="single" w:sz="4" w:space="0" w:color="D1D5DB"/>
+              <w:left w:val="single" w:sz="4" w:space="0" w:color="D1D5DB"/>
+              <w:bottom w:val="single" w:sz="4" w:space="0" w:color="D1D5DB"/>
+              <w:right w:val="single" w:sz="4" w:space="0" w:color="D1D5DB"/>
+            </w:tcBorders>
+            <w:tcMar>
+              <w:top w:w="70" w:type="dxa"/>
+              <w:left w:w="100" w:type="dxa"/>
+              <w:bottom w:w="70" w:type="dxa"/>
+              <w:right w:w="100" w:type="dxa"/>
+            </w:tcMar>
+          </w:tcPr>
+          <w:p>
+            <w:pPr>
+              <w:spacing w:after="20"/>
+            </w:pPr>
+            <w:r>
+              <w:rPr>
+                <w:color w:val="172033"/>
+                <w:sz w:val="19"/>
+                <w:szCs w:val="19"/>
+              </w:rPr>
+              <w:t>Administrador, Calidad, Dirección</w:t>
+            </w:r>
+          </w:p>
+        </w:tc>
+      </w:tr>
+    </w:tbl>
+    <w:p>
+      <w:pPr>
+        <w:spacing w:after="120" w:line="276" w:lineRule="auto"/>
+      </w:pPr>
+      <w:r>
+        <w:rPr>
+          <w:color w:val="172033"/>
+        </w:rPr>
+        <w:t>Cuentas de prueba (contraseña demo2026): admin@empresademo.mx, rh@empresademo.mx, calidad@empresademo.mx y direccion@empresademo.mx (nueva en esta versión). Todos los roles pueden consultar todos los módulos.</w:t>
+      </w:r>
+    </w:p>
+    <w:p>
+      <w:pPr>
+        <w:pStyle w:val="Ttulo2"/>
+      </w:pPr>
+      <w:r>
+        <w:t>25.4 Cambios implementados</w:t>
+      </w:r>
+    </w:p>
+    <w:p>
+      <w:pPr>
+        <w:pStyle w:val="Prrafodelista"/>
+      </w:pPr>
+      <w:r>
+        <w:t>Base de datos PostgreSQL (Neon) con tablas usuarios, puestos, documentos, historial y config.</w:t>
+      </w:r>
+    </w:p>
+    <w:p>
+      <w:pPr>
+        <w:pStyle w:val="Prrafodelista"/>
+      </w:pPr>
+      <w:r>
+        <w:t>Inicio de sesión real: contraseñas cifradas con scrypt y cookie de sesión firmada, HttpOnly y Secure, válida 8 horas; la sesión se mantiene al recargar.</w:t>
+      </w:r>
+    </w:p>
+    <w:p>
+      <w:pPr>
+        <w:pStyle w:val="Prrafodelista"/>
+      </w:pPr>
+      <w:r>
+        <w:t>Permisos por rol validados en el servidor; la página oculta los botones que el rol no puede usar y avisa cuando un rol solo puede consultar.</w:t>
+      </w:r>
+    </w:p>
+    <w:p>
+      <w:pPr>
+        <w:pStyle w:val="Prrafodelista"/>
+      </w:pPr>
+      <w:r>
+        <w:t>Validación en el servidor: campos obligatorios, números, opciones válidas, transiciones del flujo de aprobación y jerarquía sin ciclos.</w:t>
+      </w:r>
+    </w:p>
+    <w:p>
+      <w:pPr>
+        <w:pStyle w:val="Prrafodelista"/>
+      </w:pPr>
+      <w:r>
+        <w:t>El servidor asigna códigos, versiones e historial (autor y fecha) en lugar del navegador.</w:t>
+      </w:r>
+    </w:p>
+    <w:p>
+      <w:pPr>
+        <w:pStyle w:val="Prrafodelista"/>
+      </w:pPr>
+      <w:r>
+        <w:t>Los endpoints de IA solo responden con sesión iniciada, para proteger la cuota de Gemini.</w:t>
+      </w:r>
+    </w:p>
+    <w:p>
+      <w:pPr>
+        <w:pStyle w:val="Prrafodelista"/>
+      </w:pPr>
+      <w:r>
+        <w:t>Protección contra peticiones de otros sitios: cookie SameSite y encabezado obligatorio en las operaciones que modifican datos.</w:t>
+      </w:r>
+    </w:p>
+    <w:p>
+      <w:pPr>
+        <w:pStyle w:val="Ttulo2"/>
+      </w:pPr>
+      <w:r>
+        <w:t>25.5 Evidencia de pruebas</w:t>
+      </w:r>
+    </w:p>
+    <w:p>
+      <w:pPr>
+        <w:pStyle w:val="Prrafodelista"/>
+      </w:pPr>
+      <w:r>
+        <w:t>30 casos de la API probados en local con PostgreSQL en memoria: login correcto e incorrecto, protección de origen, permisos de los 4 roles, validaciones, flujo de aprobación, versiones, ciclos en la jerarquía, restablecer y cierre de sesión. Todos pasaron.</w:t>
+      </w:r>
+    </w:p>
+    <w:p>
+      <w:pPr>
+        <w:pStyle w:val="Prrafodelista"/>
+      </w:pPr>
+      <w:r>
+        <w:t>Recorrido en la página con los roles Recursos Humanos, Calidad y Administrador: botones según permisos, creación y aprobación, persistencia tras recargar y restablecer datos.</w:t>
+      </w:r>
+    </w:p>
+    <w:p>
+      <w:pPr>
+        <w:pStyle w:val="Prrafodelista"/>
+      </w:pPr>
+      <w:r>
+        <w:t>12 de octubre de 2026, en el sitio publicado con Neon: el primer inicio de sesión tardó unos 2 segundos (incluye crear las tablas y cargar los datos de ejemplo); se creó, leyó y eliminó una política de prueba, y la IA redactó una política en 7 segundos con sesión iniciada.</w:t>
+      </w:r>
+    </w:p>
+    <w:p>
+      <w:pPr>
+        <w:pStyle w:val="Prrafodelista"/>
+      </w:pPr>
+      <w:r>
+        <w:t>No se probó con un servidor MySQL real; la portabilidad se basa en Kysely y en evitar funciones exclusivas de PostgreSQL.</w:t>
+      </w:r>
+    </w:p>
+    <w:p>
+      <w:pPr>
+        <w:pStyle w:val="Ttulo2"/>
+      </w:pPr>
+      <w:r>
+        <w:t>25.6 Pendientes</w:t>
+      </w:r>
+    </w:p>
+    <w:p>
+      <w:pPr>
+        <w:pStyle w:val="Prrafodelista"/>
+      </w:pPr>
+      <w:r>
+        <w:t>Multiempresa: cada empresa con sus propios datos y usuarios (Fase 2).</w:t>
+      </w:r>
+    </w:p>
+    <w:p>
+      <w:pPr>
+        <w:pStyle w:val="Prrafodelista"/>
+      </w:pPr>
+      <w:r>
+        <w:t>Administración de usuarios desde la página (alta, baja, cambio de rol y de contraseña).</w:t>
+      </w:r>
+    </w:p>
+    <w:p>
+      <w:pPr>
+        <w:pStyle w:val="Prrafodelista"/>
+      </w:pPr>
+      <w:r>
+        <w:t>Límite de intentos de inicio de sesión y de solicitudes a la IA por usuario.</w:t>
+      </w:r>
+    </w:p>
+    <w:p>
+      <w:pPr>
+        <w:pStyle w:val="Prrafodelista"/>
+      </w:pPr>
+      <w:r>
+        <w:t>Pantalla para editar un puesto y a quién reporta (la API ya lo permite).</w:t>
+      </w:r>
+    </w:p>
+    <w:p>
+      <w:pPr>
+        <w:pStyle w:val="Prrafodelista"/>
+      </w:pPr>
+      <w:r>
+        <w:t>Guardar la entrada y la salida de cada borrador de IA para trazabilidad completa (IA-08).</w:t>
+      </w:r>
+    </w:p>
+    <w:p>
+      <w:pPr>
+        <w:pStyle w:val="Prrafodelista"/>
+      </w:pPr>
+      <w:r>
+        <w:t>Confirmar con el ingeniero el motor de base de datos de la Fase 2 y configurar respaldos en Neon.</w:t>
+      </w:r>
+    </w:p>
+    <w:p>
+      <w:pPr>
         <w:jc w:val="center"/>
       </w:pPr>
       <w:r>
@@ -34969,7 +37913,7 @@
           <w:i/>
           <w:sz w:val="18"/>
         </w:rPr>
-        <w:t>Documento actualizado el 7 de octubre de 2026 (versión 4), a partir del MVP publicado en Vercel.</w:t>
+        <w:t>Documento actualizado el 12 de octubre de 2026 (versión 5), a partir del MVP publicado en Vercel con backend y base de datos.</w:t>
       </w:r>
     </w:p>
     <w:sectPr>

</xml_diff>

<commit_message>
Documentación versión 6: diseño Señal, edición de puestos y bienvenida por rol
Co-Authored-By: Claude Opus 5.5 <noreply@anthropic.com>
</commit_message>
<xml_diff>
--- a/Documentacion_MVP_Plataforma.docx
+++ b/Documentacion_MVP_Plataforma.docx
@@ -4049,25 +4049,25 @@
               <w:bottom w:val="single" w:sz="4" w:space="0" w:color="D1D5DB"/>
               <w:right w:val="single" w:sz="4" w:space="0" w:color="D1D5DB"/>
             </w:tcBorders>
-            <w:shd w:val="clear" w:color="auto" w:fill="FEF3C7"/>
-            <w:tcMar>
-              <w:top w:w="70" w:type="dxa"/>
-              <w:left w:w="100" w:type="dxa"/>
-              <w:bottom w:w="70" w:type="dxa"/>
-              <w:right w:w="100" w:type="dxa"/>
-            </w:tcMar>
-          </w:tcPr>
-          <w:p>
-            <w:pPr>
-              <w:spacing w:after="20"/>
-            </w:pPr>
-            <w:r>
-              <w:rPr>
-                <w:color w:val="172033"/>
-                <w:sz w:val="19"/>
-                <w:szCs w:val="19"/>
-              </w:rPr>
-              <w:t>Parcial: la API permite editar y cambiar a quién reporta; falta la pantalla</w:t>
+            <w:shd w:val="clear" w:color="auto" w:fill="E6F4EC"/>
+            <w:tcMar>
+              <w:top w:w="70" w:type="dxa"/>
+              <w:left w:w="100" w:type="dxa"/>
+              <w:bottom w:w="70" w:type="dxa"/>
+              <w:right w:w="100" w:type="dxa"/>
+            </w:tcMar>
+          </w:tcPr>
+          <w:p>
+            <w:pPr>
+              <w:spacing w:after="20"/>
+            </w:pPr>
+            <w:r>
+              <w:rPr>
+                <w:color w:val="172033"/>
+                <w:sz w:val="19"/>
+                <w:szCs w:val="19"/>
+              </w:rPr>
+              <w:t>Implementado: pantalla "Editar puesto"; en "Reporta a" no aparecen el propio puesto ni su equipo</w:t>
             </w:r>
           </w:p>
         </w:tc>
@@ -5826,25 +5826,25 @@
               <w:bottom w:val="single" w:sz="4" w:space="0" w:color="D1D5DB"/>
               <w:right w:val="single" w:sz="4" w:space="0" w:color="D1D5DB"/>
             </w:tcBorders>
-            <w:shd w:val="clear" w:color="auto" w:fill="FDE8E8"/>
-            <w:tcMar>
-              <w:top w:w="70" w:type="dxa"/>
-              <w:left w:w="100" w:type="dxa"/>
-              <w:bottom w:w="70" w:type="dxa"/>
-              <w:right w:w="100" w:type="dxa"/>
-            </w:tcMar>
-          </w:tcPr>
-          <w:p>
-            <w:pPr>
-              <w:spacing w:after="20"/>
-            </w:pPr>
-            <w:r>
-              <w:rPr>
-                <w:color w:val="172033"/>
-                <w:sz w:val="19"/>
-                <w:szCs w:val="19"/>
-              </w:rPr>
-              <w:t>No</w:t>
+            <w:shd w:val="clear" w:color="auto" w:fill="E6F4EC"/>
+            <w:tcMar>
+              <w:top w:w="70" w:type="dxa"/>
+              <w:left w:w="100" w:type="dxa"/>
+              <w:bottom w:w="70" w:type="dxa"/>
+              <w:right w:w="100" w:type="dxa"/>
+            </w:tcMar>
+          </w:tcPr>
+          <w:p>
+            <w:pPr>
+              <w:spacing w:after="20"/>
+            </w:pPr>
+            <w:r>
+              <w:rPr>
+                <w:color w:val="172033"/>
+                <w:sz w:val="19"/>
+                <w:szCs w:val="19"/>
+              </w:rPr>
+              <w:t>Implementado: pantalla "Editar puesto" desde la tabla y desde el detalle</w:t>
             </w:r>
           </w:p>
         </w:tc>
@@ -11518,7 +11518,313 @@
               <w:rPr>
                 <w:sz w:val="18"/>
               </w:rPr>
-              <w:t>Implementado: logo oficial con espacio de protección, Open Sans y Roboto, negro #231F20 y solo colores del manual</w:t>
+              <w:t>Implementado: diseño "Señal" con logo oficial y espacio de protección, Open Sans y Roboto, negro #231F20 y solo colores del manual</w:t>
+            </w:r>
+          </w:p>
+        </w:tc>
+      </w:tr>
+      <w:tr>
+        <w:trPr>
+          <w:cantSplit/>
+        </w:trPr>
+        <w:tc>
+          <w:tcPr>
+            <w:tcW w:w="900" w:type="dxa"/>
+            <w:tcBorders>
+              <w:top w:val="single" w:sz="4" w:space="0" w:color="D1D5DB"/>
+              <w:left w:val="single" w:sz="4" w:space="0" w:color="D1D5DB"/>
+              <w:bottom w:val="single" w:sz="4" w:space="0" w:color="D1D5DB"/>
+              <w:right w:val="single" w:sz="4" w:space="0" w:color="D1D5DB"/>
+            </w:tcBorders>
+            <w:tcMar>
+              <w:top w:w="70" w:type="dxa"/>
+              <w:left w:w="100" w:type="dxa"/>
+              <w:bottom w:w="70" w:type="dxa"/>
+              <w:right w:w="100" w:type="dxa"/>
+            </w:tcMar>
+          </w:tcPr>
+          <w:p>
+            <w:pPr>
+              <w:spacing w:after="20"/>
+            </w:pPr>
+            <w:r>
+              <w:rPr>
+                <w:b/>
+                <w:bCs/>
+                <w:color w:val="172033"/>
+                <w:sz w:val="19"/>
+                <w:szCs w:val="19"/>
+              </w:rPr>
+              <w:t>GEN-11</w:t>
+            </w:r>
+          </w:p>
+        </w:tc>
+        <w:tc>
+          <w:tcPr>
+            <w:tcW w:w="4160" w:type="dxa"/>
+            <w:tcBorders>
+              <w:top w:val="single" w:sz="4" w:space="0" w:color="D1D5DB"/>
+              <w:left w:val="single" w:sz="4" w:space="0" w:color="D1D5DB"/>
+              <w:bottom w:val="single" w:sz="4" w:space="0" w:color="D1D5DB"/>
+              <w:right w:val="single" w:sz="4" w:space="0" w:color="D1D5DB"/>
+            </w:tcBorders>
+            <w:tcMar>
+              <w:top w:w="70" w:type="dxa"/>
+              <w:left w:w="100" w:type="dxa"/>
+              <w:bottom w:w="70" w:type="dxa"/>
+              <w:right w:w="100" w:type="dxa"/>
+            </w:tcMar>
+          </w:tcPr>
+          <w:p>
+            <w:pPr>
+              <w:spacing w:after="20"/>
+            </w:pPr>
+            <w:r>
+              <w:rPr>
+                <w:color w:val="172033"/>
+                <w:sz w:val="19"/>
+                <w:szCs w:val="19"/>
+              </w:rPr>
+              <w:t>Resaltar y agrandar ligeramente lo que se puede seleccionar al pasar el cursor</w:t>
+            </w:r>
+          </w:p>
+        </w:tc>
+        <w:tc>
+          <w:tcPr>
+            <w:tcW w:w="1000" w:type="dxa"/>
+            <w:tcBorders>
+              <w:top w:val="single" w:sz="4" w:space="0" w:color="D1D5DB"/>
+              <w:left w:val="single" w:sz="4" w:space="0" w:color="D1D5DB"/>
+              <w:bottom w:val="single" w:sz="4" w:space="0" w:color="D1D5DB"/>
+              <w:right w:val="single" w:sz="4" w:space="0" w:color="D1D5DB"/>
+            </w:tcBorders>
+            <w:tcMar>
+              <w:top w:w="70" w:type="dxa"/>
+              <w:left w:w="100" w:type="dxa"/>
+              <w:bottom w:w="70" w:type="dxa"/>
+              <w:right w:w="100" w:type="dxa"/>
+            </w:tcMar>
+          </w:tcPr>
+          <w:p>
+            <w:pPr>
+              <w:spacing w:after="20"/>
+            </w:pPr>
+            <w:r>
+              <w:rPr>
+                <w:color w:val="172033"/>
+                <w:sz w:val="19"/>
+                <w:szCs w:val="19"/>
+              </w:rPr>
+              <w:t>Media</w:t>
+            </w:r>
+          </w:p>
+        </w:tc>
+        <w:tc>
+          <w:tcPr>
+            <w:tcW w:w="700" w:type="dxa"/>
+            <w:tcBorders>
+              <w:top w:val="single" w:sz="4" w:space="0" w:color="D1D5DB"/>
+              <w:left w:val="single" w:sz="4" w:space="0" w:color="D1D5DB"/>
+              <w:bottom w:val="single" w:sz="4" w:space="0" w:color="D1D5DB"/>
+              <w:right w:val="single" w:sz="4" w:space="0" w:color="D1D5DB"/>
+            </w:tcBorders>
+            <w:tcMar>
+              <w:top w:w="70" w:type="dxa"/>
+              <w:left w:w="100" w:type="dxa"/>
+              <w:bottom w:w="70" w:type="dxa"/>
+              <w:right w:w="100" w:type="dxa"/>
+            </w:tcMar>
+          </w:tcPr>
+          <w:p>
+            <w:pPr>
+              <w:spacing w:after="20"/>
+            </w:pPr>
+            <w:r>
+              <w:rPr>
+                <w:color w:val="172033"/>
+                <w:sz w:val="19"/>
+                <w:szCs w:val="19"/>
+              </w:rPr>
+              <w:t>1</w:t>
+            </w:r>
+          </w:p>
+        </w:tc>
+        <w:tc>
+          <w:tcPr>
+            <w:tcW w:w="2600" w:type="dxa"/>
+            <w:tcBorders>
+              <w:top w:val="single" w:sz="4" w:space="0" w:color="D1D5DB"/>
+              <w:left w:val="single" w:sz="4" w:space="0" w:color="D1D5DB"/>
+              <w:bottom w:val="single" w:sz="4" w:space="0" w:color="D1D5DB"/>
+              <w:right w:val="single" w:sz="4" w:space="0" w:color="D1D5DB"/>
+            </w:tcBorders>
+            <w:shd w:val="clear" w:color="auto" w:fill="E6F4EC"/>
+            <w:tcMar>
+              <w:top w:w="70" w:type="dxa"/>
+              <w:left w:w="100" w:type="dxa"/>
+              <w:bottom w:w="70" w:type="dxa"/>
+              <w:right w:w="100" w:type="dxa"/>
+            </w:tcMar>
+          </w:tcPr>
+          <w:p>
+            <w:r>
+              <w:rPr>
+                <w:sz w:val="18"/>
+              </w:rPr>
+              <w:t>Implementado (crece 6 %, borde azul y sombra; sin animación si el equipo pide reducir movimiento)</w:t>
+            </w:r>
+          </w:p>
+        </w:tc>
+      </w:tr>
+      <w:tr>
+        <w:trPr>
+          <w:cantSplit/>
+        </w:trPr>
+        <w:tc>
+          <w:tcPr>
+            <w:tcW w:w="900" w:type="dxa"/>
+            <w:tcBorders>
+              <w:top w:val="single" w:sz="4" w:space="0" w:color="D1D5DB"/>
+              <w:left w:val="single" w:sz="4" w:space="0" w:color="D1D5DB"/>
+              <w:bottom w:val="single" w:sz="4" w:space="0" w:color="D1D5DB"/>
+              <w:right w:val="single" w:sz="4" w:space="0" w:color="D1D5DB"/>
+            </w:tcBorders>
+            <w:tcMar>
+              <w:top w:w="70" w:type="dxa"/>
+              <w:left w:w="100" w:type="dxa"/>
+              <w:bottom w:w="70" w:type="dxa"/>
+              <w:right w:w="100" w:type="dxa"/>
+            </w:tcMar>
+          </w:tcPr>
+          <w:p>
+            <w:pPr>
+              <w:spacing w:after="20"/>
+            </w:pPr>
+            <w:r>
+              <w:rPr>
+                <w:b/>
+                <w:bCs/>
+                <w:color w:val="172033"/>
+                <w:sz w:val="19"/>
+                <w:szCs w:val="19"/>
+              </w:rPr>
+              <w:t>GEN-12</w:t>
+            </w:r>
+          </w:p>
+        </w:tc>
+        <w:tc>
+          <w:tcPr>
+            <w:tcW w:w="4160" w:type="dxa"/>
+            <w:tcBorders>
+              <w:top w:val="single" w:sz="4" w:space="0" w:color="D1D5DB"/>
+              <w:left w:val="single" w:sz="4" w:space="0" w:color="D1D5DB"/>
+              <w:bottom w:val="single" w:sz="4" w:space="0" w:color="D1D5DB"/>
+              <w:right w:val="single" w:sz="4" w:space="0" w:color="D1D5DB"/>
+            </w:tcBorders>
+            <w:tcMar>
+              <w:top w:w="70" w:type="dxa"/>
+              <w:left w:w="100" w:type="dxa"/>
+              <w:bottom w:w="70" w:type="dxa"/>
+              <w:right w:w="100" w:type="dxa"/>
+            </w:tcMar>
+          </w:tcPr>
+          <w:p>
+            <w:pPr>
+              <w:spacing w:after="20"/>
+            </w:pPr>
+            <w:r>
+              <w:rPr>
+                <w:color w:val="172033"/>
+                <w:sz w:val="19"/>
+                <w:szCs w:val="19"/>
+              </w:rPr>
+              <w:t>Mostrar al iniciar sesión las funciones disponibles según el rol</w:t>
+            </w:r>
+          </w:p>
+        </w:tc>
+        <w:tc>
+          <w:tcPr>
+            <w:tcW w:w="1000" w:type="dxa"/>
+            <w:tcBorders>
+              <w:top w:val="single" w:sz="4" w:space="0" w:color="D1D5DB"/>
+              <w:left w:val="single" w:sz="4" w:space="0" w:color="D1D5DB"/>
+              <w:bottom w:val="single" w:sz="4" w:space="0" w:color="D1D5DB"/>
+              <w:right w:val="single" w:sz="4" w:space="0" w:color="D1D5DB"/>
+            </w:tcBorders>
+            <w:tcMar>
+              <w:top w:w="70" w:type="dxa"/>
+              <w:left w:w="100" w:type="dxa"/>
+              <w:bottom w:w="70" w:type="dxa"/>
+              <w:right w:w="100" w:type="dxa"/>
+            </w:tcMar>
+          </w:tcPr>
+          <w:p>
+            <w:pPr>
+              <w:spacing w:after="20"/>
+            </w:pPr>
+            <w:r>
+              <w:rPr>
+                <w:color w:val="172033"/>
+                <w:sz w:val="19"/>
+                <w:szCs w:val="19"/>
+              </w:rPr>
+              <w:t>Media</w:t>
+            </w:r>
+          </w:p>
+        </w:tc>
+        <w:tc>
+          <w:tcPr>
+            <w:tcW w:w="700" w:type="dxa"/>
+            <w:tcBorders>
+              <w:top w:val="single" w:sz="4" w:space="0" w:color="D1D5DB"/>
+              <w:left w:val="single" w:sz="4" w:space="0" w:color="D1D5DB"/>
+              <w:bottom w:val="single" w:sz="4" w:space="0" w:color="D1D5DB"/>
+              <w:right w:val="single" w:sz="4" w:space="0" w:color="D1D5DB"/>
+            </w:tcBorders>
+            <w:tcMar>
+              <w:top w:w="70" w:type="dxa"/>
+              <w:left w:w="100" w:type="dxa"/>
+              <w:bottom w:w="70" w:type="dxa"/>
+              <w:right w:w="100" w:type="dxa"/>
+            </w:tcMar>
+          </w:tcPr>
+          <w:p>
+            <w:pPr>
+              <w:spacing w:after="20"/>
+            </w:pPr>
+            <w:r>
+              <w:rPr>
+                <w:color w:val="172033"/>
+                <w:sz w:val="19"/>
+                <w:szCs w:val="19"/>
+              </w:rPr>
+              <w:t>1</w:t>
+            </w:r>
+          </w:p>
+        </w:tc>
+        <w:tc>
+          <w:tcPr>
+            <w:tcW w:w="2600" w:type="dxa"/>
+            <w:tcBorders>
+              <w:top w:val="single" w:sz="4" w:space="0" w:color="D1D5DB"/>
+              <w:left w:val="single" w:sz="4" w:space="0" w:color="D1D5DB"/>
+              <w:bottom w:val="single" w:sz="4" w:space="0" w:color="D1D5DB"/>
+              <w:right w:val="single" w:sz="4" w:space="0" w:color="D1D5DB"/>
+            </w:tcBorders>
+            <w:shd w:val="clear" w:color="auto" w:fill="E6F4EC"/>
+            <w:tcMar>
+              <w:top w:w="70" w:type="dxa"/>
+              <w:left w:w="100" w:type="dxa"/>
+              <w:bottom w:w="70" w:type="dxa"/>
+              <w:right w:w="100" w:type="dxa"/>
+            </w:tcMar>
+          </w:tcPr>
+          <w:p>
+            <w:r>
+              <w:rPr>
+                <w:sz w:val="18"/>
+              </w:rPr>
+              <w:t>Implementado (ventana de bienvenida; se reabre con clic en el nombre del usuario)</w:t>
             </w:r>
           </w:p>
         </w:tc>
@@ -17711,6 +18017,73 @@
                 <w:szCs w:val="19"/>
               </w:rPr>
               <w:t>Toda operación que modifica datos valida en el servidor la sesión, el permiso del rol y los datos; la interfaz solo oculta lo que el rol no puede hacer.</w:t>
+            </w:r>
+          </w:p>
+        </w:tc>
+      </w:tr>
+      <w:tr>
+        <w:trPr>
+          <w:cantSplit/>
+        </w:trPr>
+        <w:tc>
+          <w:tcPr>
+            <w:tcW w:w="1100" w:type="dxa"/>
+            <w:tcBorders>
+              <w:top w:val="single" w:sz="4" w:space="0" w:color="D1D5DB"/>
+              <w:left w:val="single" w:sz="4" w:space="0" w:color="D1D5DB"/>
+              <w:bottom w:val="single" w:sz="4" w:space="0" w:color="D1D5DB"/>
+              <w:right w:val="single" w:sz="4" w:space="0" w:color="D1D5DB"/>
+            </w:tcBorders>
+            <w:tcMar>
+              <w:top w:w="70" w:type="dxa"/>
+              <w:left w:w="100" w:type="dxa"/>
+              <w:bottom w:w="70" w:type="dxa"/>
+              <w:right w:w="100" w:type="dxa"/>
+            </w:tcMar>
+          </w:tcPr>
+          <w:p>
+            <w:pPr>
+              <w:spacing w:after="20"/>
+            </w:pPr>
+            <w:r>
+              <w:rPr>
+                <w:b/>
+                <w:bCs/>
+                <w:color w:val="172033"/>
+                <w:sz w:val="19"/>
+                <w:szCs w:val="19"/>
+              </w:rPr>
+              <w:t>RN-16</w:t>
+            </w:r>
+          </w:p>
+        </w:tc>
+        <w:tc>
+          <w:tcPr>
+            <w:tcW w:w="8260" w:type="dxa"/>
+            <w:tcBorders>
+              <w:top w:val="single" w:sz="4" w:space="0" w:color="D1D5DB"/>
+              <w:left w:val="single" w:sz="4" w:space="0" w:color="D1D5DB"/>
+              <w:bottom w:val="single" w:sz="4" w:space="0" w:color="D1D5DB"/>
+              <w:right w:val="single" w:sz="4" w:space="0" w:color="D1D5DB"/>
+            </w:tcBorders>
+            <w:tcMar>
+              <w:top w:w="70" w:type="dxa"/>
+              <w:left w:w="100" w:type="dxa"/>
+              <w:bottom w:w="70" w:type="dxa"/>
+              <w:right w:w="100" w:type="dxa"/>
+            </w:tcMar>
+          </w:tcPr>
+          <w:p>
+            <w:pPr>
+              <w:spacing w:after="20"/>
+            </w:pPr>
+            <w:r>
+              <w:rPr>
+                <w:color w:val="172033"/>
+                <w:sz w:val="19"/>
+                <w:szCs w:val="19"/>
+              </w:rPr>
+              <w:t>Al editar un puesto, cambiar objetivo, responsabilidades, competencias o perfil regresa la descripción a "Pendiente"; cambiar el nombre, el departamento o a quién reporta no la invalida.</w:t>
             </w:r>
           </w:p>
         </w:tc>
@@ -26640,6 +27013,260 @@
           </w:p>
         </w:tc>
       </w:tr>
+      <w:tr>
+        <w:trPr>
+          <w:cantSplit/>
+        </w:trPr>
+        <w:tc>
+          <w:tcPr>
+            <w:tcW w:w="1900" w:type="dxa"/>
+            <w:tcBorders>
+              <w:top w:val="single" w:sz="4" w:space="0" w:color="D1D5DB"/>
+              <w:left w:val="single" w:sz="4" w:space="0" w:color="D1D5DB"/>
+              <w:bottom w:val="single" w:sz="4" w:space="0" w:color="D1D5DB"/>
+              <w:right w:val="single" w:sz="4" w:space="0" w:color="D1D5DB"/>
+            </w:tcBorders>
+            <w:tcMar>
+              <w:top w:w="70" w:type="dxa"/>
+              <w:left w:w="100" w:type="dxa"/>
+              <w:bottom w:w="70" w:type="dxa"/>
+              <w:right w:w="100" w:type="dxa"/>
+            </w:tcMar>
+          </w:tcPr>
+          <w:p>
+            <w:pPr>
+              <w:spacing w:after="20"/>
+            </w:pPr>
+            <w:r>
+              <w:rPr>
+                <w:b/>
+                <w:bCs/>
+                <w:color w:val="172033"/>
+                <w:sz w:val="19"/>
+                <w:szCs w:val="19"/>
+              </w:rPr>
+              <w:t>Bienvenida (ventana)</w:t>
+            </w:r>
+          </w:p>
+        </w:tc>
+        <w:tc>
+          <w:tcPr>
+            <w:tcW w:w="1800" w:type="dxa"/>
+            <w:tcBorders>
+              <w:top w:val="single" w:sz="4" w:space="0" w:color="D1D5DB"/>
+              <w:left w:val="single" w:sz="4" w:space="0" w:color="D1D5DB"/>
+              <w:bottom w:val="single" w:sz="4" w:space="0" w:color="D1D5DB"/>
+              <w:right w:val="single" w:sz="4" w:space="0" w:color="D1D5DB"/>
+            </w:tcBorders>
+            <w:tcMar>
+              <w:top w:w="70" w:type="dxa"/>
+              <w:left w:w="100" w:type="dxa"/>
+              <w:bottom w:w="70" w:type="dxa"/>
+              <w:right w:w="100" w:type="dxa"/>
+            </w:tcMar>
+          </w:tcPr>
+          <w:p>
+            <w:pPr>
+              <w:spacing w:after="20"/>
+            </w:pPr>
+            <w:r>
+              <w:rPr>
+                <w:color w:val="172033"/>
+                <w:sz w:val="19"/>
+                <w:szCs w:val="19"/>
+              </w:rPr>
+              <w:t>Al iniciar sesión</w:t>
+            </w:r>
+          </w:p>
+        </w:tc>
+        <w:tc>
+          <w:tcPr>
+            <w:tcW w:w="3660" w:type="dxa"/>
+            <w:tcBorders>
+              <w:top w:val="single" w:sz="4" w:space="0" w:color="D1D5DB"/>
+              <w:left w:val="single" w:sz="4" w:space="0" w:color="D1D5DB"/>
+              <w:bottom w:val="single" w:sz="4" w:space="0" w:color="D1D5DB"/>
+              <w:right w:val="single" w:sz="4" w:space="0" w:color="D1D5DB"/>
+            </w:tcBorders>
+            <w:tcMar>
+              <w:top w:w="70" w:type="dxa"/>
+              <w:left w:w="100" w:type="dxa"/>
+              <w:bottom w:w="70" w:type="dxa"/>
+              <w:right w:w="100" w:type="dxa"/>
+            </w:tcMar>
+          </w:tcPr>
+          <w:p>
+            <w:pPr>
+              <w:spacing w:after="20"/>
+            </w:pPr>
+            <w:r>
+              <w:rPr>
+                <w:color w:val="172033"/>
+                <w:sz w:val="19"/>
+                <w:szCs w:val="19"/>
+              </w:rPr>
+              <w:t>Saludo, descripción del rol, tabla de permisos por módulo y atajos</w:t>
+            </w:r>
+          </w:p>
+        </w:tc>
+        <w:tc>
+          <w:tcPr>
+            <w:tcW w:w="2000" w:type="dxa"/>
+            <w:tcBorders>
+              <w:top w:val="single" w:sz="4" w:space="0" w:color="D1D5DB"/>
+              <w:left w:val="single" w:sz="4" w:space="0" w:color="D1D5DB"/>
+              <w:bottom w:val="single" w:sz="4" w:space="0" w:color="D1D5DB"/>
+              <w:right w:val="single" w:sz="4" w:space="0" w:color="D1D5DB"/>
+            </w:tcBorders>
+            <w:tcMar>
+              <w:top w:w="70" w:type="dxa"/>
+              <w:left w:w="100" w:type="dxa"/>
+              <w:bottom w:w="70" w:type="dxa"/>
+              <w:right w:w="100" w:type="dxa"/>
+            </w:tcMar>
+          </w:tcPr>
+          <w:p>
+            <w:pPr>
+              <w:spacing w:after="20"/>
+            </w:pPr>
+            <w:r>
+              <w:rPr>
+                <w:color w:val="172033"/>
+                <w:sz w:val="19"/>
+                <w:szCs w:val="19"/>
+              </w:rPr>
+              <w:t>Todos</w:t>
+            </w:r>
+          </w:p>
+        </w:tc>
+      </w:tr>
+      <w:tr>
+        <w:trPr>
+          <w:cantSplit/>
+        </w:trPr>
+        <w:tc>
+          <w:tcPr>
+            <w:tcW w:w="1900" w:type="dxa"/>
+            <w:tcBorders>
+              <w:top w:val="single" w:sz="4" w:space="0" w:color="D1D5DB"/>
+              <w:left w:val="single" w:sz="4" w:space="0" w:color="D1D5DB"/>
+              <w:bottom w:val="single" w:sz="4" w:space="0" w:color="D1D5DB"/>
+              <w:right w:val="single" w:sz="4" w:space="0" w:color="D1D5DB"/>
+            </w:tcBorders>
+            <w:tcMar>
+              <w:top w:w="70" w:type="dxa"/>
+              <w:left w:w="100" w:type="dxa"/>
+              <w:bottom w:w="70" w:type="dxa"/>
+              <w:right w:w="100" w:type="dxa"/>
+            </w:tcMar>
+          </w:tcPr>
+          <w:p>
+            <w:pPr>
+              <w:spacing w:after="20"/>
+            </w:pPr>
+            <w:r>
+              <w:rPr>
+                <w:b/>
+                <w:bCs/>
+                <w:color w:val="172033"/>
+                <w:sz w:val="19"/>
+                <w:szCs w:val="19"/>
+              </w:rPr>
+              <w:t>Editar puesto (ventana)</w:t>
+            </w:r>
+          </w:p>
+        </w:tc>
+        <w:tc>
+          <w:tcPr>
+            <w:tcW w:w="1800" w:type="dxa"/>
+            <w:tcBorders>
+              <w:top w:val="single" w:sz="4" w:space="0" w:color="D1D5DB"/>
+              <w:left w:val="single" w:sz="4" w:space="0" w:color="D1D5DB"/>
+              <w:bottom w:val="single" w:sz="4" w:space="0" w:color="D1D5DB"/>
+              <w:right w:val="single" w:sz="4" w:space="0" w:color="D1D5DB"/>
+            </w:tcBorders>
+            <w:tcMar>
+              <w:top w:w="70" w:type="dxa"/>
+              <w:left w:w="100" w:type="dxa"/>
+              <w:bottom w:w="70" w:type="dxa"/>
+              <w:right w:w="100" w:type="dxa"/>
+            </w:tcMar>
+          </w:tcPr>
+          <w:p>
+            <w:pPr>
+              <w:spacing w:after="20"/>
+            </w:pPr>
+            <w:r>
+              <w:rPr>
+                <w:color w:val="172033"/>
+                <w:sz w:val="19"/>
+                <w:szCs w:val="19"/>
+              </w:rPr>
+              <w:t>/organigrama, /puestos</w:t>
+            </w:r>
+          </w:p>
+        </w:tc>
+        <w:tc>
+          <w:tcPr>
+            <w:tcW w:w="3660" w:type="dxa"/>
+            <w:tcBorders>
+              <w:top w:val="single" w:sz="4" w:space="0" w:color="D1D5DB"/>
+              <w:left w:val="single" w:sz="4" w:space="0" w:color="D1D5DB"/>
+              <w:bottom w:val="single" w:sz="4" w:space="0" w:color="D1D5DB"/>
+              <w:right w:val="single" w:sz="4" w:space="0" w:color="D1D5DB"/>
+            </w:tcBorders>
+            <w:tcMar>
+              <w:top w:w="70" w:type="dxa"/>
+              <w:left w:w="100" w:type="dxa"/>
+              <w:bottom w:w="70" w:type="dxa"/>
+              <w:right w:w="100" w:type="dxa"/>
+            </w:tcMar>
+          </w:tcPr>
+          <w:p>
+            <w:pPr>
+              <w:spacing w:after="20"/>
+            </w:pPr>
+            <w:r>
+              <w:rPr>
+                <w:color w:val="172033"/>
+                <w:sz w:val="19"/>
+                <w:szCs w:val="19"/>
+              </w:rPr>
+              <w:t>Nombre, departamento, a quién reporta y descripción del puesto</w:t>
+            </w:r>
+          </w:p>
+        </w:tc>
+        <w:tc>
+          <w:tcPr>
+            <w:tcW w:w="2000" w:type="dxa"/>
+            <w:tcBorders>
+              <w:top w:val="single" w:sz="4" w:space="0" w:color="D1D5DB"/>
+              <w:left w:val="single" w:sz="4" w:space="0" w:color="D1D5DB"/>
+              <w:bottom w:val="single" w:sz="4" w:space="0" w:color="D1D5DB"/>
+              <w:right w:val="single" w:sz="4" w:space="0" w:color="D1D5DB"/>
+            </w:tcBorders>
+            <w:tcMar>
+              <w:top w:w="70" w:type="dxa"/>
+              <w:left w:w="100" w:type="dxa"/>
+              <w:bottom w:w="70" w:type="dxa"/>
+              <w:right w:w="100" w:type="dxa"/>
+            </w:tcMar>
+          </w:tcPr>
+          <w:p>
+            <w:pPr>
+              <w:spacing w:after="20"/>
+            </w:pPr>
+            <w:r>
+              <w:rPr>
+                <w:color w:val="172033"/>
+                <w:sz w:val="19"/>
+                <w:szCs w:val="19"/>
+              </w:rPr>
+              <w:t>Admin, RH</w:t>
+            </w:r>
+          </w:p>
+        </w:tc>
+      </w:tr>
     </w:tbl>
     <w:p>
       <w:pPr>
@@ -26985,7 +27612,7 @@
                 <w:sz w:val="19"/>
                 <w:szCs w:val="19"/>
               </w:rPr>
-              <w:t>#F4F7F8 / #FFFFFF; barra lateral blanca con el logo oficial</w:t>
+              <w:t>#F2F5F7 de fondo con tarjetas blancas flotantes; encabezado con degradado de #0032A0 a #1D7EAE; inicio de sesión con panel #0032A0</w:t>
             </w:r>
           </w:p>
         </w:tc>
@@ -27188,7 +27815,7 @@
                 <w:sz w:val="19"/>
                 <w:szCs w:val="19"/>
               </w:rPr>
-              <w:t>Tarjetas con radio 12 px, etiquetas (tag), modales, tablas con encabezado gris, mensajes flotantes; iconos lineales SVG (rejilla 24 px, trazo 1.75, un solo color); pie azul con la leyenda de derechos reservados</w:t>
+              <w:t>Tarjetas con radio 16 px y sombra suave, botones en píldora, menú lateral agrupado (Estructura, Gestión, Asistente) con la opción activa en azul oscuro, títulos con marca naranja, tablas con encabezado gris, iconos lineales SVG</w:t>
             </w:r>
           </w:p>
         </w:tc>
@@ -27255,7 +27882,141 @@
                 <w:sz w:val="19"/>
                 <w:szCs w:val="19"/>
               </w:rPr>
-              <w:t>Versión oficial positiva sobre fondo blanco; tamaño mínimo 1.0 pulgada de base</w:t>
+              <w:t>Versión oficial positiva siempre sobre fondo blanco: en el panel azul del inicio de sesión va dentro de una placa blanca; tamaño mínimo 1.0 pulgada y espacio de protección 2X</w:t>
+            </w:r>
+          </w:p>
+        </w:tc>
+      </w:tr>
+      <w:tr>
+        <w:trPr>
+          <w:cantSplit/>
+        </w:trPr>
+        <w:tc>
+          <w:tcPr>
+            <w:tcW w:w="2600" w:type="dxa"/>
+            <w:tcBorders>
+              <w:top w:val="single" w:sz="4" w:space="0" w:color="D1D5DB"/>
+              <w:left w:val="single" w:sz="4" w:space="0" w:color="D1D5DB"/>
+              <w:bottom w:val="single" w:sz="4" w:space="0" w:color="D1D5DB"/>
+              <w:right w:val="single" w:sz="4" w:space="0" w:color="D1D5DB"/>
+            </w:tcBorders>
+            <w:tcMar>
+              <w:top w:w="70" w:type="dxa"/>
+              <w:left w:w="100" w:type="dxa"/>
+              <w:bottom w:w="70" w:type="dxa"/>
+              <w:right w:w="100" w:type="dxa"/>
+            </w:tcMar>
+          </w:tcPr>
+          <w:p>
+            <w:pPr>
+              <w:spacing w:after="20"/>
+            </w:pPr>
+            <w:r>
+              <w:rPr>
+                <w:b/>
+                <w:bCs/>
+                <w:color w:val="172033"/>
+                <w:sz w:val="19"/>
+                <w:szCs w:val="19"/>
+              </w:rPr>
+              <w:t>Motivo gráfico</w:t>
+            </w:r>
+          </w:p>
+        </w:tc>
+        <w:tc>
+          <w:tcPr>
+            <w:tcW w:w="6760" w:type="dxa"/>
+            <w:tcBorders>
+              <w:top w:val="single" w:sz="4" w:space="0" w:color="D1D5DB"/>
+              <w:left w:val="single" w:sz="4" w:space="0" w:color="D1D5DB"/>
+              <w:bottom w:val="single" w:sz="4" w:space="0" w:color="D1D5DB"/>
+              <w:right w:val="single" w:sz="4" w:space="0" w:color="D1D5DB"/>
+            </w:tcBorders>
+            <w:tcMar>
+              <w:top w:w="70" w:type="dxa"/>
+              <w:left w:w="100" w:type="dxa"/>
+              <w:bottom w:w="70" w:type="dxa"/>
+              <w:right w:w="100" w:type="dxa"/>
+            </w:tcMar>
+          </w:tcPr>
+          <w:p>
+            <w:pPr>
+              <w:spacing w:after="20"/>
+            </w:pPr>
+            <w:r>
+              <w:rPr>
+                <w:color w:val="172033"/>
+                <w:sz w:val="19"/>
+                <w:szCs w:val="19"/>
+              </w:rPr>
+              <w:t>Ondas concéntricas inspiradas en el símbolo de antena del logo, usadas como elemento auxiliar en el encabezado, el inicio de sesión y la bienvenida; nunca sobre el logo ni alterándolo</w:t>
+            </w:r>
+          </w:p>
+        </w:tc>
+      </w:tr>
+      <w:tr>
+        <w:trPr>
+          <w:cantSplit/>
+        </w:trPr>
+        <w:tc>
+          <w:tcPr>
+            <w:tcW w:w="2600" w:type="dxa"/>
+            <w:tcBorders>
+              <w:top w:val="single" w:sz="4" w:space="0" w:color="D1D5DB"/>
+              <w:left w:val="single" w:sz="4" w:space="0" w:color="D1D5DB"/>
+              <w:bottom w:val="single" w:sz="4" w:space="0" w:color="D1D5DB"/>
+              <w:right w:val="single" w:sz="4" w:space="0" w:color="D1D5DB"/>
+            </w:tcBorders>
+            <w:tcMar>
+              <w:top w:w="70" w:type="dxa"/>
+              <w:left w:w="100" w:type="dxa"/>
+              <w:bottom w:w="70" w:type="dxa"/>
+              <w:right w:w="100" w:type="dxa"/>
+            </w:tcMar>
+          </w:tcPr>
+          <w:p>
+            <w:pPr>
+              <w:spacing w:after="20"/>
+            </w:pPr>
+            <w:r>
+              <w:rPr>
+                <w:b/>
+                <w:bCs/>
+                <w:color w:val="172033"/>
+                <w:sz w:val="19"/>
+                <w:szCs w:val="19"/>
+              </w:rPr>
+              <w:t>Interacción</w:t>
+            </w:r>
+          </w:p>
+        </w:tc>
+        <w:tc>
+          <w:tcPr>
+            <w:tcW w:w="6760" w:type="dxa"/>
+            <w:tcBorders>
+              <w:top w:val="single" w:sz="4" w:space="0" w:color="D1D5DB"/>
+              <w:left w:val="single" w:sz="4" w:space="0" w:color="D1D5DB"/>
+              <w:bottom w:val="single" w:sz="4" w:space="0" w:color="D1D5DB"/>
+              <w:right w:val="single" w:sz="4" w:space="0" w:color="D1D5DB"/>
+            </w:tcBorders>
+            <w:tcMar>
+              <w:top w:w="70" w:type="dxa"/>
+              <w:left w:w="100" w:type="dxa"/>
+              <w:bottom w:w="70" w:type="dxa"/>
+              <w:right w:w="100" w:type="dxa"/>
+            </w:tcMar>
+          </w:tcPr>
+          <w:p>
+            <w:pPr>
+              <w:spacing w:after="20"/>
+            </w:pPr>
+            <w:r>
+              <w:rPr>
+                <w:color w:val="172033"/>
+                <w:sz w:val="19"/>
+                <w:szCs w:val="19"/>
+              </w:rPr>
+              <w:t>Todo lo seleccionable se resalta en azul y crece ligeramente al pasar el cursor o al enfocarlo con el teclado</w:t>
             </w:r>
           </w:p>
         </w:tc>
@@ -29916,6 +30677,170 @@
                 <w:sz w:val="18"/>
               </w:rPr>
               <w:t>El servidor lo rechaza por crear un ciclo.</w:t>
+            </w:r>
+          </w:p>
+        </w:tc>
+      </w:tr>
+      <w:tr>
+        <w:tc>
+          <w:tcPr>
+            <w:tcW w:w="900" w:type="dxa"/>
+          </w:tcPr>
+          <w:p>
+            <w:r>
+              <w:rPr>
+                <w:sz w:val="18"/>
+              </w:rPr>
+              <w:t>CP-30</w:t>
+            </w:r>
+          </w:p>
+        </w:tc>
+        <w:tc>
+          <w:tcPr>
+            <w:tcW w:w="3960" w:type="dxa"/>
+          </w:tcPr>
+          <w:p>
+            <w:r>
+              <w:rPr>
+                <w:sz w:val="18"/>
+              </w:rPr>
+              <w:t>Editar un puesto y cambiar a quién reporta</w:t>
+            </w:r>
+          </w:p>
+        </w:tc>
+        <w:tc>
+          <w:tcPr>
+            <w:tcW w:w="4500" w:type="dxa"/>
+          </w:tcPr>
+          <w:p>
+            <w:r>
+              <w:rPr>
+                <w:sz w:val="18"/>
+              </w:rPr>
+              <w:t>El organigrama se redibuja con el nuevo jefe y la descripción conserva su estado.</w:t>
+            </w:r>
+          </w:p>
+        </w:tc>
+      </w:tr>
+      <w:tr>
+        <w:tc>
+          <w:tcPr>
+            <w:tcW w:w="900" w:type="dxa"/>
+          </w:tcPr>
+          <w:p>
+            <w:r>
+              <w:rPr>
+                <w:sz w:val="18"/>
+              </w:rPr>
+              <w:t>CP-31</w:t>
+            </w:r>
+          </w:p>
+        </w:tc>
+        <w:tc>
+          <w:tcPr>
+            <w:tcW w:w="3960" w:type="dxa"/>
+          </w:tcPr>
+          <w:p>
+            <w:r>
+              <w:rPr>
+                <w:sz w:val="18"/>
+              </w:rPr>
+              <w:t>Abrir "Editar puesto" de un gerente</w:t>
+            </w:r>
+          </w:p>
+        </w:tc>
+        <w:tc>
+          <w:tcPr>
+            <w:tcW w:w="4500" w:type="dxa"/>
+          </w:tcPr>
+          <w:p>
+            <w:r>
+              <w:rPr>
+                <w:sz w:val="18"/>
+              </w:rPr>
+              <w:t>En "Reporta a" no aparecen él mismo ni nadie de su equipo, con una nota que lo explica.</w:t>
+            </w:r>
+          </w:p>
+        </w:tc>
+      </w:tr>
+      <w:tr>
+        <w:tc>
+          <w:tcPr>
+            <w:tcW w:w="900" w:type="dxa"/>
+          </w:tcPr>
+          <w:p>
+            <w:r>
+              <w:rPr>
+                <w:sz w:val="18"/>
+              </w:rPr>
+              <w:t>CP-32</w:t>
+            </w:r>
+          </w:p>
+        </w:tc>
+        <w:tc>
+          <w:tcPr>
+            <w:tcW w:w="3960" w:type="dxa"/>
+          </w:tcPr>
+          <w:p>
+            <w:r>
+              <w:rPr>
+                <w:sz w:val="18"/>
+              </w:rPr>
+              <w:t>Iniciar sesión con cada rol</w:t>
+            </w:r>
+          </w:p>
+        </w:tc>
+        <w:tc>
+          <w:tcPr>
+            <w:tcW w:w="4500" w:type="dxa"/>
+          </w:tcPr>
+          <w:p>
+            <w:r>
+              <w:rPr>
+                <w:sz w:val="18"/>
+              </w:rPr>
+              <w:t>Aparece la bienvenida con la tabla de lo que el rol puede consultar, crear/editar y aprobar.</w:t>
+            </w:r>
+          </w:p>
+        </w:tc>
+      </w:tr>
+      <w:tr>
+        <w:tc>
+          <w:tcPr>
+            <w:tcW w:w="900" w:type="dxa"/>
+          </w:tcPr>
+          <w:p>
+            <w:r>
+              <w:rPr>
+                <w:sz w:val="18"/>
+              </w:rPr>
+              <w:t>CP-33</w:t>
+            </w:r>
+          </w:p>
+        </w:tc>
+        <w:tc>
+          <w:tcPr>
+            <w:tcW w:w="3960" w:type="dxa"/>
+          </w:tcPr>
+          <w:p>
+            <w:r>
+              <w:rPr>
+                <w:sz w:val="18"/>
+              </w:rPr>
+              <w:t>Pasar el cursor sobre botones, menú y puestos del organigrama</w:t>
+            </w:r>
+          </w:p>
+        </w:tc>
+        <w:tc>
+          <w:tcPr>
+            <w:tcW w:w="4500" w:type="dxa"/>
+          </w:tcPr>
+          <w:p>
+            <w:r>
+              <w:rPr>
+                <w:sz w:val="18"/>
+              </w:rPr>
+              <w:t>El elemento se resalta en azul y crece ligeramente.</w:t>
             </w:r>
           </w:p>
         </w:tc>
@@ -31424,7 +32349,7 @@
               <w:rPr>
                 <w:sz w:val="18"/>
               </w:rPr>
-              <w:t>No existe edición independiente de descripciones existentes.</w:t>
+              <w:t>Resuelto: pantalla para editar puestos y sus descripciones.</w:t>
             </w:r>
           </w:p>
         </w:tc>
@@ -31450,7 +32375,7 @@
               <w:rPr>
                 <w:sz w:val="18"/>
               </w:rPr>
-              <w:t>Agregar edición y control de versiones.</w:t>
+              <w:t>Fase 2: historial de versiones de cada descripción de puesto.</w:t>
             </w:r>
           </w:p>
         </w:tc>
@@ -31558,7 +32483,7 @@
               <w:rPr>
                 <w:sz w:val="18"/>
               </w:rPr>
-              <w:t>Agregar la pantalla para editar a quién reporta un puesto.</w:t>
+              <w:t>Resuelto también en la interfaz: la pantalla de edición no ofrece jefes que crearían un ciclo.</w:t>
             </w:r>
           </w:p>
         </w:tc>
@@ -37885,7 +38810,7 @@
         <w:pStyle w:val="Prrafodelista"/>
       </w:pPr>
       <w:r>
-        <w:t>Pantalla para editar un puesto y a quién reporta (la API ya lo permite).</w:t>
+        <w:t>Resuelto en la versión 6: pantalla para editar un puesto y a quién reporta.</w:t>
       </w:r>
     </w:p>
     <w:p>
@@ -37902,6 +38827,185 @@
       </w:pPr>
       <w:r>
         <w:t>Confirmar con el ingeniero el motor de base de datos de la Fase 2 y configurar respaldos en Neon.</w:t>
+      </w:r>
+    </w:p>
+    <w:p>
+      <w:pPr>
+        <w:pStyle w:val="Ttulo1"/>
+      </w:pPr>
+      <w:r>
+        <w:t>26. Actualización del MVP — versión 6: diseño, edición de puestos y bienvenida (12 de octubre de 2026)</w:t>
+      </w:r>
+    </w:p>
+    <w:p>
+      <w:pPr>
+        <w:spacing w:after="120" w:line="276" w:lineRule="auto"/>
+      </w:pPr>
+      <w:r>
+        <w:rPr>
+          <w:color w:val="172033"/>
+        </w:rPr>
+        <w:t>Esta versión da a la plataforma una identidad visual propia, distinta de otros proyectos de la generación, sin salir del manual de IOT Technologies; agrega la pantalla para editar puestos y a quién reportan, y explica a cada usuario qué puede hacer según su rol.</w:t>
+      </w:r>
+    </w:p>
+    <w:p>
+      <w:pPr>
+        <w:pStyle w:val="Ttulo2"/>
+      </w:pPr>
+      <w:r>
+        <w:t>26.1 Diseño "Señal"</w:t>
+      </w:r>
+    </w:p>
+    <w:p>
+      <w:pPr>
+        <w:pStyle w:val="Prrafodelista"/>
+      </w:pPr>
+      <w:r>
+        <w:t>Concepto: las ondas de la antena del logo de IOT Technologies, usadas como motivo gráfico auxiliar en el encabezado, el inicio de sesión y la bienvenida.</w:t>
+      </w:r>
+    </w:p>
+    <w:p>
+      <w:pPr>
+        <w:pStyle w:val="Prrafodelista"/>
+      </w:pPr>
+      <w:r>
+        <w:t>Encabezado en banda con degradado de los dos azules institucionales; menú lateral agrupado en Estructura, Gestión y Asistente, con la opción activa en píldora azul oscuro.</w:t>
+      </w:r>
+    </w:p>
+    <w:p>
+      <w:pPr>
+        <w:pStyle w:val="Prrafodelista"/>
+      </w:pPr>
+      <w:r>
+        <w:t>Fondo gris claro con tarjetas blancas flotantes, barras de color en los indicadores y marca naranja en los títulos de sección; botones en forma de píldora.</w:t>
+      </w:r>
+    </w:p>
+    <w:p>
+      <w:pPr>
+        <w:pStyle w:val="Prrafodelista"/>
+      </w:pPr>
+      <w:r>
+        <w:t>Inicio de sesión con panel azul oscuro y el logo dentro de una placa blanca, porque el manual no permite el logo sobre fondos oscuros.</w:t>
+      </w:r>
+    </w:p>
+    <w:p>
+      <w:pPr>
+        <w:pStyle w:val="Prrafodelista"/>
+      </w:pPr>
+      <w:r>
+        <w:t>Se mantienen: logo oficial sin alterar y con espacio de protección, Open Sans y Roboto, solo colores del manual y sus tonos claros, la leyenda de Social eThinking, la marca de Merkatics GrowthLab y el aviso de ISO 9001.</w:t>
+      </w:r>
+    </w:p>
+    <w:p>
+      <w:pPr>
+        <w:pStyle w:val="Ttulo2"/>
+      </w:pPr>
+      <w:r>
+        <w:t>26.2 Resaltado al pasar el cursor</w:t>
+      </w:r>
+    </w:p>
+    <w:p>
+      <w:pPr>
+        <w:pStyle w:val="Prrafodelista"/>
+      </w:pPr>
+      <w:r>
+        <w:t>Botones, opciones del menú, puestos del organigrama, filtros, casillas y el recuadro del usuario crecen un 6 %, toman borde azul y sombra al pasar el cursor o al enfocarlos con el teclado. Los campos de texto solo se resaltan, para no mover el formulario. Si el equipo tiene activada la reducción de movimiento, solo cambia el color.</w:t>
+      </w:r>
+    </w:p>
+    <w:p>
+      <w:pPr>
+        <w:pStyle w:val="Ttulo2"/>
+      </w:pPr>
+      <w:r>
+        <w:t>26.3 Edición de puestos y a quién reportan</w:t>
+      </w:r>
+    </w:p>
+    <w:p>
+      <w:pPr>
+        <w:pStyle w:val="Prrafodelista"/>
+      </w:pPr>
+      <w:r>
+        <w:t>Botón "Editar" en la tabla de Descripciones de puesto y "Editar puesto" en el detalle; disponible para Administrador y Recursos Humanos.</w:t>
+      </w:r>
+    </w:p>
+    <w:p>
+      <w:pPr>
+        <w:pStyle w:val="Prrafodelista"/>
+      </w:pPr>
+      <w:r>
+        <w:t>Se puede cambiar nombre, departamento, a quién reporta, objetivo, responsabilidades, competencias y perfil.</w:t>
+      </w:r>
+    </w:p>
+    <w:p>
+      <w:pPr>
+        <w:pStyle w:val="Prrafodelista"/>
+      </w:pPr>
+      <w:r>
+        <w:t>En "Reporta a" no aparecen el propio puesto ni nadie de su equipo, y una nota lo explica; el servidor también rechaza cualquier ciclo. El puesto de mayor nivel no puede reportar a nadie.</w:t>
+      </w:r>
+    </w:p>
+    <w:p>
+      <w:pPr>
+        <w:pStyle w:val="Prrafodelista"/>
+      </w:pPr>
+      <w:r>
+        <w:t>Cambiar la descripción la regresa a "Pendiente"; cambiar solo a quién reporta, el nombre o el departamento no (RN-16).</w:t>
+      </w:r>
+    </w:p>
+    <w:p>
+      <w:pPr>
+        <w:pStyle w:val="Ttulo2"/>
+      </w:pPr>
+      <w:r>
+        <w:t>26.4 Bienvenida según el rol</w:t>
+      </w:r>
+    </w:p>
+    <w:p>
+      <w:pPr>
+        <w:pStyle w:val="Prrafodelista"/>
+      </w:pPr>
+      <w:r>
+        <w:t>Al iniciar sesión aparece "Hola, [nombre] · [rol]" con una descripción del rol, una tabla de lo que puede consultar, crear/editar y aprobar en cada módulo, lo que puede hacer con la IA y atajos a sus módulos.</w:t>
+      </w:r>
+    </w:p>
+    <w:p>
+      <w:pPr>
+        <w:pStyle w:val="Prrafodelista"/>
+      </w:pPr>
+      <w:r>
+        <w:t>Se puede volver a abrir en cualquier momento con un clic en el nombre del usuario, arriba a la derecha.</w:t>
+      </w:r>
+    </w:p>
+    <w:p>
+      <w:pPr>
+        <w:pStyle w:val="Ttulo2"/>
+      </w:pPr>
+      <w:r>
+        <w:t>26.5 Evidencia de pruebas</w:t>
+      </w:r>
+    </w:p>
+    <w:p>
+      <w:pPr>
+        <w:pStyle w:val="Prrafodelista"/>
+      </w:pPr>
+      <w:r>
+        <w:t>En local: bienvenida con los 4 roles, edición de puestos (cambio de jefe, exclusión del equipo, regreso a Pendiente solo al cambiar la descripción, puesto raíz bloqueado), resaltado al pasar el cursor y vista en escritorio y móvil sin desbordamiento.</w:t>
+      </w:r>
+    </w:p>
+    <w:p>
+      <w:pPr>
+        <w:pStyle w:val="Prrafodelista"/>
+      </w:pPr>
+      <w:r>
+        <w:t>12 de octubre de 2026, en el sitio publicado: bienvenida correcta para Calidad, diseño nuevo visible y cambio de a quién reporta guardado en la base de datos (se revirtió después para conservar los datos de ejemplo).</w:t>
+      </w:r>
+    </w:p>
+    <w:p>
+      <w:pPr>
+        <w:pStyle w:val="Prrafodelista"/>
+      </w:pPr>
+      <w:r>
+        <w:t>Nota de despliegue: en dos ocasiones Vercel no recibió el aviso de GitHub y no publicó el cambio; se resolvió con un commit vacío. Si se repite, conviene reconectar el repositorio en Vercel (Settings → Git).</w:t>
       </w:r>
     </w:p>
     <w:p>
@@ -37913,7 +39017,7 @@
           <w:i/>
           <w:sz w:val="18"/>
         </w:rPr>
-        <w:t>Documento actualizado el 12 de octubre de 2026 (versión 5), a partir del MVP publicado en Vercel con backend y base de datos.</w:t>
+        <w:t>Documento actualizado el 12 de octubre de 2026 (versión 6), a partir del MVP publicado en Vercel.</w:t>
       </w:r>
     </w:p>
     <w:sectPr>

</xml_diff>

<commit_message>
Documentación versión 7: multiempresa y multiusuario
Co-Authored-By: Claude Opus 5.5 <noreply@anthropic.com>
</commit_message>
<xml_diff>
--- a/Documentacion_MVP_Plataforma.docx
+++ b/Documentacion_MVP_Plataforma.docx
@@ -941,7 +941,7 @@
                 <w:sz w:val="19"/>
                 <w:szCs w:val="19"/>
               </w:rPr>
-              <w:t>Configura la empresa y sus usuarios</w:t>
+              <w:t>Administra su empresa dentro de la plataforma</w:t>
             </w:r>
           </w:p>
         </w:tc>
@@ -1001,7 +1001,134 @@
                 <w:sz w:val="19"/>
                 <w:szCs w:val="19"/>
               </w:rPr>
-              <w:t>Cuenta de prueba con todos los permisos</w:t>
+              <w:t>Cuenta de prueba con todos los permisos de su empresa; gestiona usuarios, logo y nombre (sección 27)</w:t>
+            </w:r>
+          </w:p>
+        </w:tc>
+      </w:tr>
+      <w:tr>
+        <w:trPr>
+          <w:cantSplit/>
+        </w:trPr>
+        <w:tc>
+          <w:tcPr>
+            <w:tcW w:w="1600" w:type="dxa"/>
+            <w:tcBorders>
+              <w:top w:val="single" w:sz="4" w:space="0" w:color="D1D5DB"/>
+              <w:left w:val="single" w:sz="4" w:space="0" w:color="D1D5DB"/>
+              <w:bottom w:val="single" w:sz="4" w:space="0" w:color="D1D5DB"/>
+              <w:right w:val="single" w:sz="4" w:space="0" w:color="D1D5DB"/>
+            </w:tcBorders>
+            <w:tcMar>
+              <w:top w:w="70" w:type="dxa"/>
+              <w:left w:w="100" w:type="dxa"/>
+              <w:bottom w:w="70" w:type="dxa"/>
+              <w:right w:w="100" w:type="dxa"/>
+            </w:tcMar>
+          </w:tcPr>
+          <w:p>
+            <w:pPr>
+              <w:spacing w:after="20"/>
+            </w:pPr>
+            <w:r>
+              <w:rPr>
+                <w:b/>
+                <w:bCs/>
+                <w:color w:val="172033"/>
+                <w:sz w:val="19"/>
+                <w:szCs w:val="19"/>
+              </w:rPr>
+              <w:t>Súper administrador</w:t>
+            </w:r>
+          </w:p>
+        </w:tc>
+        <w:tc>
+          <w:tcPr>
+            <w:tcW w:w="2400" w:type="dxa"/>
+            <w:tcBorders>
+              <w:top w:val="single" w:sz="4" w:space="0" w:color="D1D5DB"/>
+              <w:left w:val="single" w:sz="4" w:space="0" w:color="D1D5DB"/>
+              <w:bottom w:val="single" w:sz="4" w:space="0" w:color="D1D5DB"/>
+              <w:right w:val="single" w:sz="4" w:space="0" w:color="D1D5DB"/>
+            </w:tcBorders>
+            <w:tcMar>
+              <w:top w:w="70" w:type="dxa"/>
+              <w:left w:w="100" w:type="dxa"/>
+              <w:bottom w:w="70" w:type="dxa"/>
+              <w:right w:w="100" w:type="dxa"/>
+            </w:tcMar>
+          </w:tcPr>
+          <w:p>
+            <w:pPr>
+              <w:spacing w:after="20"/>
+            </w:pPr>
+            <w:r>
+              <w:rPr>
+                <w:color w:val="172033"/>
+                <w:sz w:val="19"/>
+                <w:szCs w:val="19"/>
+              </w:rPr>
+              <w:t>Equipo de IOT Technologies que opera la plataforma</w:t>
+            </w:r>
+          </w:p>
+        </w:tc>
+        <w:tc>
+          <w:tcPr>
+            <w:tcW w:w="3200" w:type="dxa"/>
+            <w:tcBorders>
+              <w:top w:val="single" w:sz="4" w:space="0" w:color="D1D5DB"/>
+              <w:left w:val="single" w:sz="4" w:space="0" w:color="D1D5DB"/>
+              <w:bottom w:val="single" w:sz="4" w:space="0" w:color="D1D5DB"/>
+              <w:right w:val="single" w:sz="4" w:space="0" w:color="D1D5DB"/>
+            </w:tcBorders>
+            <w:tcMar>
+              <w:top w:w="70" w:type="dxa"/>
+              <w:left w:w="100" w:type="dxa"/>
+              <w:bottom w:w="70" w:type="dxa"/>
+              <w:right w:w="100" w:type="dxa"/>
+            </w:tcMar>
+          </w:tcPr>
+          <w:p>
+            <w:pPr>
+              <w:spacing w:after="20"/>
+            </w:pPr>
+            <w:r>
+              <w:rPr>
+                <w:color w:val="172033"/>
+                <w:sz w:val="19"/>
+                <w:szCs w:val="19"/>
+              </w:rPr>
+              <w:t>Dar de alta empresas con su logo y su primer administrador; activarlas o desactivarlas</w:t>
+            </w:r>
+          </w:p>
+        </w:tc>
+        <w:tc>
+          <w:tcPr>
+            <w:tcW w:w="2160" w:type="dxa"/>
+            <w:tcBorders>
+              <w:top w:val="single" w:sz="4" w:space="0" w:color="D1D5DB"/>
+              <w:left w:val="single" w:sz="4" w:space="0" w:color="D1D5DB"/>
+              <w:bottom w:val="single" w:sz="4" w:space="0" w:color="D1D5DB"/>
+              <w:right w:val="single" w:sz="4" w:space="0" w:color="D1D5DB"/>
+            </w:tcBorders>
+            <w:tcMar>
+              <w:top w:w="70" w:type="dxa"/>
+              <w:left w:w="100" w:type="dxa"/>
+              <w:bottom w:w="70" w:type="dxa"/>
+              <w:right w:w="100" w:type="dxa"/>
+            </w:tcMar>
+          </w:tcPr>
+          <w:p>
+            <w:pPr>
+              <w:spacing w:after="20"/>
+            </w:pPr>
+            <w:r>
+              <w:rPr>
+                <w:color w:val="172033"/>
+                <w:sz w:val="19"/>
+                <w:szCs w:val="19"/>
+              </w:rPr>
+              <w:t>Cuenta de prueba superadmin@plataforma-do.mx; no ve los datos de ninguna empresa (sección 27)</w:t>
             </w:r>
           </w:p>
         </w:tc>
@@ -10902,7 +11029,7 @@
               <w:rPr>
                 <w:sz w:val="18"/>
               </w:rPr>
-              <w:t>Implementado por rol, validado en el servidor (sección 25.3); sin multiempresa</w:t>
+              <w:t>Implementado por rol dentro de cada empresa, validado en el servidor (secciones 25.3 y 27)</w:t>
             </w:r>
           </w:p>
         </w:tc>
@@ -11042,7 +11169,7 @@
               <w:bottom w:val="single" w:sz="4" w:space="0" w:color="D1D5DB"/>
               <w:right w:val="single" w:sz="4" w:space="0" w:color="D1D5DB"/>
             </w:tcBorders>
-            <w:shd w:val="clear" w:color="auto" w:fill="FDE8E8"/>
+            <w:shd w:val="clear" w:color="auto" w:fill="E6F4EC"/>
             <w:tcMar>
               <w:top w:w="70" w:type="dxa"/>
               <w:left w:w="100" w:type="dxa"/>
@@ -11055,7 +11182,7 @@
               <w:rPr>
                 <w:sz w:val="18"/>
               </w:rPr>
-              <w:t>No</w:t>
+              <w:t>Implementado en la versión 7: cada empresa ve solo sus datos; el servidor filtra toda consulta por empresa (sección 27)</w:t>
             </w:r>
           </w:p>
         </w:tc>
@@ -11352,7 +11479,7 @@
               <w:bottom w:val="single" w:sz="4" w:space="0" w:color="D1D5DB"/>
               <w:right w:val="single" w:sz="4" w:space="0" w:color="D1D5DB"/>
             </w:tcBorders>
-            <w:shd w:val="clear" w:color="auto" w:fill="FDE8E8"/>
+            <w:shd w:val="clear" w:color="auto" w:fill="E6F4EC"/>
             <w:tcMar>
               <w:top w:w="70" w:type="dxa"/>
               <w:left w:w="100" w:type="dxa"/>
@@ -11365,7 +11492,7 @@
               <w:rPr>
                 <w:sz w:val="18"/>
               </w:rPr>
-              <w:t>No</w:t>
+              <w:t>Implementado en la versión 7: el Administrador crea usuarios, asigna rol, los activa o desactiva y restablece contraseñas</w:t>
             </w:r>
           </w:p>
         </w:tc>
@@ -11825,6 +11952,465 @@
                 <w:sz w:val="18"/>
               </w:rPr>
               <w:t>Implementado (ventana de bienvenida; se reabre con clic en el nombre del usuario)</w:t>
+            </w:r>
+          </w:p>
+        </w:tc>
+      </w:tr>
+      <w:tr>
+        <w:trPr>
+          <w:cantSplit/>
+        </w:trPr>
+        <w:tc>
+          <w:tcPr>
+            <w:tcW w:w="900" w:type="dxa"/>
+            <w:tcBorders>
+              <w:top w:val="single" w:sz="4" w:space="0" w:color="D1D5DB"/>
+              <w:left w:val="single" w:sz="4" w:space="0" w:color="D1D5DB"/>
+              <w:bottom w:val="single" w:sz="4" w:space="0" w:color="D1D5DB"/>
+              <w:right w:val="single" w:sz="4" w:space="0" w:color="D1D5DB"/>
+            </w:tcBorders>
+            <w:tcMar>
+              <w:top w:w="70" w:type="dxa"/>
+              <w:left w:w="100" w:type="dxa"/>
+              <w:bottom w:w="70" w:type="dxa"/>
+              <w:right w:w="100" w:type="dxa"/>
+            </w:tcMar>
+          </w:tcPr>
+          <w:p>
+            <w:pPr>
+              <w:spacing w:after="20"/>
+            </w:pPr>
+            <w:r>
+              <w:rPr>
+                <w:b/>
+                <w:bCs/>
+                <w:color w:val="172033"/>
+                <w:sz w:val="19"/>
+                <w:szCs w:val="19"/>
+              </w:rPr>
+              <w:t>GEN-13</w:t>
+            </w:r>
+          </w:p>
+        </w:tc>
+        <w:tc>
+          <w:tcPr>
+            <w:tcW w:w="4160" w:type="dxa"/>
+            <w:tcBorders>
+              <w:top w:val="single" w:sz="4" w:space="0" w:color="D1D5DB"/>
+              <w:left w:val="single" w:sz="4" w:space="0" w:color="D1D5DB"/>
+              <w:bottom w:val="single" w:sz="4" w:space="0" w:color="D1D5DB"/>
+              <w:right w:val="single" w:sz="4" w:space="0" w:color="D1D5DB"/>
+            </w:tcBorders>
+            <w:tcMar>
+              <w:top w:w="70" w:type="dxa"/>
+              <w:left w:w="100" w:type="dxa"/>
+              <w:bottom w:w="70" w:type="dxa"/>
+              <w:right w:w="100" w:type="dxa"/>
+            </w:tcMar>
+          </w:tcPr>
+          <w:p>
+            <w:pPr>
+              <w:spacing w:after="20"/>
+            </w:pPr>
+            <w:r>
+              <w:rPr>
+                <w:color w:val="172033"/>
+                <w:sz w:val="19"/>
+                <w:szCs w:val="19"/>
+              </w:rPr>
+              <w:t>Logo y nombre de cada empresa en el menú, con la leyenda «Con tecnología de IOT Technologies»</w:t>
+            </w:r>
+          </w:p>
+        </w:tc>
+        <w:tc>
+          <w:tcPr>
+            <w:tcW w:w="1000" w:type="dxa"/>
+            <w:tcBorders>
+              <w:top w:val="single" w:sz="4" w:space="0" w:color="D1D5DB"/>
+              <w:left w:val="single" w:sz="4" w:space="0" w:color="D1D5DB"/>
+              <w:bottom w:val="single" w:sz="4" w:space="0" w:color="D1D5DB"/>
+              <w:right w:val="single" w:sz="4" w:space="0" w:color="D1D5DB"/>
+            </w:tcBorders>
+            <w:tcMar>
+              <w:top w:w="70" w:type="dxa"/>
+              <w:left w:w="100" w:type="dxa"/>
+              <w:bottom w:w="70" w:type="dxa"/>
+              <w:right w:w="100" w:type="dxa"/>
+            </w:tcMar>
+          </w:tcPr>
+          <w:p>
+            <w:pPr>
+              <w:spacing w:after="20"/>
+            </w:pPr>
+            <w:r>
+              <w:rPr>
+                <w:color w:val="172033"/>
+                <w:sz w:val="19"/>
+                <w:szCs w:val="19"/>
+              </w:rPr>
+              <w:t>Alta</w:t>
+            </w:r>
+          </w:p>
+        </w:tc>
+        <w:tc>
+          <w:tcPr>
+            <w:tcW w:w="700" w:type="dxa"/>
+            <w:tcBorders>
+              <w:top w:val="single" w:sz="4" w:space="0" w:color="D1D5DB"/>
+              <w:left w:val="single" w:sz="4" w:space="0" w:color="D1D5DB"/>
+              <w:bottom w:val="single" w:sz="4" w:space="0" w:color="D1D5DB"/>
+              <w:right w:val="single" w:sz="4" w:space="0" w:color="D1D5DB"/>
+            </w:tcBorders>
+            <w:tcMar>
+              <w:top w:w="70" w:type="dxa"/>
+              <w:left w:w="100" w:type="dxa"/>
+              <w:bottom w:w="70" w:type="dxa"/>
+              <w:right w:w="100" w:type="dxa"/>
+            </w:tcMar>
+          </w:tcPr>
+          <w:p>
+            <w:pPr>
+              <w:spacing w:after="20"/>
+            </w:pPr>
+            <w:r>
+              <w:rPr>
+                <w:color w:val="172033"/>
+                <w:sz w:val="19"/>
+                <w:szCs w:val="19"/>
+              </w:rPr>
+              <w:t>1</w:t>
+            </w:r>
+          </w:p>
+        </w:tc>
+        <w:tc>
+          <w:tcPr>
+            <w:tcW w:w="2600" w:type="dxa"/>
+            <w:tcBorders>
+              <w:top w:val="single" w:sz="4" w:space="0" w:color="D1D5DB"/>
+              <w:left w:val="single" w:sz="4" w:space="0" w:color="D1D5DB"/>
+              <w:bottom w:val="single" w:sz="4" w:space="0" w:color="D1D5DB"/>
+              <w:right w:val="single" w:sz="4" w:space="0" w:color="D1D5DB"/>
+            </w:tcBorders>
+            <w:shd w:val="clear" w:color="auto" w:fill="E6F4EC"/>
+            <w:tcMar>
+              <w:top w:w="70" w:type="dxa"/>
+              <w:left w:w="100" w:type="dxa"/>
+              <w:bottom w:w="70" w:type="dxa"/>
+              <w:right w:w="100" w:type="dxa"/>
+            </w:tcMar>
+          </w:tcPr>
+          <w:p>
+            <w:r>
+              <w:rPr>
+                <w:sz w:val="18"/>
+              </w:rPr>
+              <w:t>Implementado (versión 7); el Administrador cambia el logo de su empresa</w:t>
+            </w:r>
+          </w:p>
+        </w:tc>
+      </w:tr>
+      <w:tr>
+        <w:trPr>
+          <w:cantSplit/>
+        </w:trPr>
+        <w:tc>
+          <w:tcPr>
+            <w:tcW w:w="900" w:type="dxa"/>
+            <w:tcBorders>
+              <w:top w:val="single" w:sz="4" w:space="0" w:color="D1D5DB"/>
+              <w:left w:val="single" w:sz="4" w:space="0" w:color="D1D5DB"/>
+              <w:bottom w:val="single" w:sz="4" w:space="0" w:color="D1D5DB"/>
+              <w:right w:val="single" w:sz="4" w:space="0" w:color="D1D5DB"/>
+            </w:tcBorders>
+            <w:tcMar>
+              <w:top w:w="70" w:type="dxa"/>
+              <w:left w:w="100" w:type="dxa"/>
+              <w:bottom w:w="70" w:type="dxa"/>
+              <w:right w:w="100" w:type="dxa"/>
+            </w:tcMar>
+          </w:tcPr>
+          <w:p>
+            <w:pPr>
+              <w:spacing w:after="20"/>
+            </w:pPr>
+            <w:r>
+              <w:rPr>
+                <w:b/>
+                <w:bCs/>
+                <w:color w:val="172033"/>
+                <w:sz w:val="19"/>
+                <w:szCs w:val="19"/>
+              </w:rPr>
+              <w:t>GEN-14</w:t>
+            </w:r>
+          </w:p>
+        </w:tc>
+        <w:tc>
+          <w:tcPr>
+            <w:tcW w:w="4160" w:type="dxa"/>
+            <w:tcBorders>
+              <w:top w:val="single" w:sz="4" w:space="0" w:color="D1D5DB"/>
+              <w:left w:val="single" w:sz="4" w:space="0" w:color="D1D5DB"/>
+              <w:bottom w:val="single" w:sz="4" w:space="0" w:color="D1D5DB"/>
+              <w:right w:val="single" w:sz="4" w:space="0" w:color="D1D5DB"/>
+            </w:tcBorders>
+            <w:tcMar>
+              <w:top w:w="70" w:type="dxa"/>
+              <w:left w:w="100" w:type="dxa"/>
+              <w:bottom w:w="70" w:type="dxa"/>
+              <w:right w:w="100" w:type="dxa"/>
+            </w:tcMar>
+          </w:tcPr>
+          <w:p>
+            <w:pPr>
+              <w:spacing w:after="20"/>
+            </w:pPr>
+            <w:r>
+              <w:rPr>
+                <w:color w:val="172033"/>
+                <w:sz w:val="19"/>
+                <w:szCs w:val="19"/>
+              </w:rPr>
+              <w:t>Foto de perfil de cada usuario y cambio de su propia contraseña</w:t>
+            </w:r>
+          </w:p>
+        </w:tc>
+        <w:tc>
+          <w:tcPr>
+            <w:tcW w:w="1000" w:type="dxa"/>
+            <w:tcBorders>
+              <w:top w:val="single" w:sz="4" w:space="0" w:color="D1D5DB"/>
+              <w:left w:val="single" w:sz="4" w:space="0" w:color="D1D5DB"/>
+              <w:bottom w:val="single" w:sz="4" w:space="0" w:color="D1D5DB"/>
+              <w:right w:val="single" w:sz="4" w:space="0" w:color="D1D5DB"/>
+            </w:tcBorders>
+            <w:tcMar>
+              <w:top w:w="70" w:type="dxa"/>
+              <w:left w:w="100" w:type="dxa"/>
+              <w:bottom w:w="70" w:type="dxa"/>
+              <w:right w:w="100" w:type="dxa"/>
+            </w:tcMar>
+          </w:tcPr>
+          <w:p>
+            <w:pPr>
+              <w:spacing w:after="20"/>
+            </w:pPr>
+            <w:r>
+              <w:rPr>
+                <w:color w:val="172033"/>
+                <w:sz w:val="19"/>
+                <w:szCs w:val="19"/>
+              </w:rPr>
+              <w:t>Media</w:t>
+            </w:r>
+          </w:p>
+        </w:tc>
+        <w:tc>
+          <w:tcPr>
+            <w:tcW w:w="700" w:type="dxa"/>
+            <w:tcBorders>
+              <w:top w:val="single" w:sz="4" w:space="0" w:color="D1D5DB"/>
+              <w:left w:val="single" w:sz="4" w:space="0" w:color="D1D5DB"/>
+              <w:bottom w:val="single" w:sz="4" w:space="0" w:color="D1D5DB"/>
+              <w:right w:val="single" w:sz="4" w:space="0" w:color="D1D5DB"/>
+            </w:tcBorders>
+            <w:tcMar>
+              <w:top w:w="70" w:type="dxa"/>
+              <w:left w:w="100" w:type="dxa"/>
+              <w:bottom w:w="70" w:type="dxa"/>
+              <w:right w:w="100" w:type="dxa"/>
+            </w:tcMar>
+          </w:tcPr>
+          <w:p>
+            <w:pPr>
+              <w:spacing w:after="20"/>
+            </w:pPr>
+            <w:r>
+              <w:rPr>
+                <w:color w:val="172033"/>
+                <w:sz w:val="19"/>
+                <w:szCs w:val="19"/>
+              </w:rPr>
+              <w:t>1</w:t>
+            </w:r>
+          </w:p>
+        </w:tc>
+        <w:tc>
+          <w:tcPr>
+            <w:tcW w:w="2600" w:type="dxa"/>
+            <w:tcBorders>
+              <w:top w:val="single" w:sz="4" w:space="0" w:color="D1D5DB"/>
+              <w:left w:val="single" w:sz="4" w:space="0" w:color="D1D5DB"/>
+              <w:bottom w:val="single" w:sz="4" w:space="0" w:color="D1D5DB"/>
+              <w:right w:val="single" w:sz="4" w:space="0" w:color="D1D5DB"/>
+            </w:tcBorders>
+            <w:shd w:val="clear" w:color="auto" w:fill="E6F4EC"/>
+            <w:tcMar>
+              <w:top w:w="70" w:type="dxa"/>
+              <w:left w:w="100" w:type="dxa"/>
+              <w:bottom w:w="70" w:type="dxa"/>
+              <w:right w:w="100" w:type="dxa"/>
+            </w:tcMar>
+          </w:tcPr>
+          <w:p>
+            <w:r>
+              <w:rPr>
+                <w:sz w:val="18"/>
+              </w:rPr>
+              <w:t>Implementado (versión 7) en «Mi perfil»</w:t>
+            </w:r>
+          </w:p>
+        </w:tc>
+      </w:tr>
+      <w:tr>
+        <w:trPr>
+          <w:cantSplit/>
+        </w:trPr>
+        <w:tc>
+          <w:tcPr>
+            <w:tcW w:w="900" w:type="dxa"/>
+            <w:tcBorders>
+              <w:top w:val="single" w:sz="4" w:space="0" w:color="D1D5DB"/>
+              <w:left w:val="single" w:sz="4" w:space="0" w:color="D1D5DB"/>
+              <w:bottom w:val="single" w:sz="4" w:space="0" w:color="D1D5DB"/>
+              <w:right w:val="single" w:sz="4" w:space="0" w:color="D1D5DB"/>
+            </w:tcBorders>
+            <w:tcMar>
+              <w:top w:w="70" w:type="dxa"/>
+              <w:left w:w="100" w:type="dxa"/>
+              <w:bottom w:w="70" w:type="dxa"/>
+              <w:right w:w="100" w:type="dxa"/>
+            </w:tcMar>
+          </w:tcPr>
+          <w:p>
+            <w:pPr>
+              <w:spacing w:after="20"/>
+            </w:pPr>
+            <w:r>
+              <w:rPr>
+                <w:b/>
+                <w:bCs/>
+                <w:color w:val="172033"/>
+                <w:sz w:val="19"/>
+                <w:szCs w:val="19"/>
+              </w:rPr>
+              <w:t>GEN-15</w:t>
+            </w:r>
+          </w:p>
+        </w:tc>
+        <w:tc>
+          <w:tcPr>
+            <w:tcW w:w="4160" w:type="dxa"/>
+            <w:tcBorders>
+              <w:top w:val="single" w:sz="4" w:space="0" w:color="D1D5DB"/>
+              <w:left w:val="single" w:sz="4" w:space="0" w:color="D1D5DB"/>
+              <w:bottom w:val="single" w:sz="4" w:space="0" w:color="D1D5DB"/>
+              <w:right w:val="single" w:sz="4" w:space="0" w:color="D1D5DB"/>
+            </w:tcBorders>
+            <w:tcMar>
+              <w:top w:w="70" w:type="dxa"/>
+              <w:left w:w="100" w:type="dxa"/>
+              <w:bottom w:w="70" w:type="dxa"/>
+              <w:right w:w="100" w:type="dxa"/>
+            </w:tcMar>
+          </w:tcPr>
+          <w:p>
+            <w:pPr>
+              <w:spacing w:after="20"/>
+            </w:pPr>
+            <w:r>
+              <w:rPr>
+                <w:color w:val="172033"/>
+                <w:sz w:val="19"/>
+                <w:szCs w:val="19"/>
+              </w:rPr>
+              <w:t>Súper administrador que da de alta, edita y desactiva empresas</w:t>
+            </w:r>
+          </w:p>
+        </w:tc>
+        <w:tc>
+          <w:tcPr>
+            <w:tcW w:w="1000" w:type="dxa"/>
+            <w:tcBorders>
+              <w:top w:val="single" w:sz="4" w:space="0" w:color="D1D5DB"/>
+              <w:left w:val="single" w:sz="4" w:space="0" w:color="D1D5DB"/>
+              <w:bottom w:val="single" w:sz="4" w:space="0" w:color="D1D5DB"/>
+              <w:right w:val="single" w:sz="4" w:space="0" w:color="D1D5DB"/>
+            </w:tcBorders>
+            <w:tcMar>
+              <w:top w:w="70" w:type="dxa"/>
+              <w:left w:w="100" w:type="dxa"/>
+              <w:bottom w:w="70" w:type="dxa"/>
+              <w:right w:w="100" w:type="dxa"/>
+            </w:tcMar>
+          </w:tcPr>
+          <w:p>
+            <w:pPr>
+              <w:spacing w:after="20"/>
+            </w:pPr>
+            <w:r>
+              <w:rPr>
+                <w:color w:val="172033"/>
+                <w:sz w:val="19"/>
+                <w:szCs w:val="19"/>
+              </w:rPr>
+              <w:t>Alta</w:t>
+            </w:r>
+          </w:p>
+        </w:tc>
+        <w:tc>
+          <w:tcPr>
+            <w:tcW w:w="700" w:type="dxa"/>
+            <w:tcBorders>
+              <w:top w:val="single" w:sz="4" w:space="0" w:color="D1D5DB"/>
+              <w:left w:val="single" w:sz="4" w:space="0" w:color="D1D5DB"/>
+              <w:bottom w:val="single" w:sz="4" w:space="0" w:color="D1D5DB"/>
+              <w:right w:val="single" w:sz="4" w:space="0" w:color="D1D5DB"/>
+            </w:tcBorders>
+            <w:tcMar>
+              <w:top w:w="70" w:type="dxa"/>
+              <w:left w:w="100" w:type="dxa"/>
+              <w:bottom w:w="70" w:type="dxa"/>
+              <w:right w:w="100" w:type="dxa"/>
+            </w:tcMar>
+          </w:tcPr>
+          <w:p>
+            <w:pPr>
+              <w:spacing w:after="20"/>
+            </w:pPr>
+            <w:r>
+              <w:rPr>
+                <w:color w:val="172033"/>
+                <w:sz w:val="19"/>
+                <w:szCs w:val="19"/>
+              </w:rPr>
+              <w:t>1</w:t>
+            </w:r>
+          </w:p>
+        </w:tc>
+        <w:tc>
+          <w:tcPr>
+            <w:tcW w:w="2600" w:type="dxa"/>
+            <w:tcBorders>
+              <w:top w:val="single" w:sz="4" w:space="0" w:color="D1D5DB"/>
+              <w:left w:val="single" w:sz="4" w:space="0" w:color="D1D5DB"/>
+              <w:bottom w:val="single" w:sz="4" w:space="0" w:color="D1D5DB"/>
+              <w:right w:val="single" w:sz="4" w:space="0" w:color="D1D5DB"/>
+            </w:tcBorders>
+            <w:shd w:val="clear" w:color="auto" w:fill="E6F4EC"/>
+            <w:tcMar>
+              <w:top w:w="70" w:type="dxa"/>
+              <w:left w:w="100" w:type="dxa"/>
+              <w:bottom w:w="70" w:type="dxa"/>
+              <w:right w:w="100" w:type="dxa"/>
+            </w:tcMar>
+          </w:tcPr>
+          <w:p>
+            <w:r>
+              <w:rPr>
+                <w:sz w:val="18"/>
+              </w:rPr>
+              <w:t>Implementado (versión 7) en la pantalla «Empresas»</w:t>
             </w:r>
           </w:p>
         </w:tc>
@@ -17583,7 +18169,7 @@
                 <w:sz w:val="19"/>
                 <w:szCs w:val="19"/>
               </w:rPr>
-              <w:t>Una empresa nunca puede ver ni modificar datos de otra empresa (Fase 2).</w:t>
+              <w:t>Una empresa nunca puede ver ni modificar datos de otra empresa. Implementada en el MVP desde la versión 7: toda consulta se filtra por la empresa del usuario.</w:t>
             </w:r>
           </w:p>
         </w:tc>
@@ -18084,6 +18670,282 @@
                 <w:szCs w:val="19"/>
               </w:rPr>
               <w:t>Al editar un puesto, cambiar objetivo, responsabilidades, competencias o perfil regresa la descripción a "Pendiente"; cambiar el nombre, el departamento o a quién reporta no la invalida.</w:t>
+            </w:r>
+          </w:p>
+        </w:tc>
+      </w:tr>
+      <w:tr>
+        <w:trPr>
+          <w:cantSplit/>
+        </w:trPr>
+        <w:tc>
+          <w:tcPr>
+            <w:tcW w:w="1100" w:type="dxa"/>
+            <w:tcBorders>
+              <w:top w:val="single" w:sz="4" w:space="0" w:color="D1D5DB"/>
+              <w:left w:val="single" w:sz="4" w:space="0" w:color="D1D5DB"/>
+              <w:bottom w:val="single" w:sz="4" w:space="0" w:color="D1D5DB"/>
+              <w:right w:val="single" w:sz="4" w:space="0" w:color="D1D5DB"/>
+            </w:tcBorders>
+            <w:shd w:val="clear" w:color="auto" w:fill="F3F4F6"/>
+            <w:tcMar>
+              <w:top w:w="70" w:type="dxa"/>
+              <w:left w:w="100" w:type="dxa"/>
+              <w:bottom w:w="70" w:type="dxa"/>
+              <w:right w:w="100" w:type="dxa"/>
+            </w:tcMar>
+          </w:tcPr>
+          <w:p>
+            <w:pPr>
+              <w:spacing w:after="20"/>
+            </w:pPr>
+            <w:r>
+              <w:rPr>
+                <w:b/>
+                <w:bCs/>
+                <w:color w:val="172033"/>
+                <w:sz w:val="19"/>
+                <w:szCs w:val="19"/>
+              </w:rPr>
+              <w:t>RN-17</w:t>
+            </w:r>
+          </w:p>
+        </w:tc>
+        <w:tc>
+          <w:tcPr>
+            <w:tcW w:w="8260" w:type="dxa"/>
+            <w:tcBorders>
+              <w:top w:val="single" w:sz="4" w:space="0" w:color="D1D5DB"/>
+              <w:left w:val="single" w:sz="4" w:space="0" w:color="D1D5DB"/>
+              <w:bottom w:val="single" w:sz="4" w:space="0" w:color="D1D5DB"/>
+              <w:right w:val="single" w:sz="4" w:space="0" w:color="D1D5DB"/>
+            </w:tcBorders>
+            <w:shd w:val="clear" w:color="auto" w:fill="F3F4F6"/>
+            <w:tcMar>
+              <w:top w:w="70" w:type="dxa"/>
+              <w:left w:w="100" w:type="dxa"/>
+              <w:bottom w:w="70" w:type="dxa"/>
+              <w:right w:w="100" w:type="dxa"/>
+            </w:tcMar>
+          </w:tcPr>
+          <w:p>
+            <w:pPr>
+              <w:spacing w:after="20"/>
+            </w:pPr>
+            <w:r>
+              <w:rPr>
+                <w:color w:val="172033"/>
+                <w:sz w:val="19"/>
+                <w:szCs w:val="19"/>
+              </w:rPr>
+              <w:t>El correo de un usuario es único en toda la plataforma; con él se identifica a qué empresa entra.</w:t>
+            </w:r>
+          </w:p>
+        </w:tc>
+      </w:tr>
+      <w:tr>
+        <w:trPr>
+          <w:cantSplit/>
+        </w:trPr>
+        <w:tc>
+          <w:tcPr>
+            <w:tcW w:w="1100" w:type="dxa"/>
+            <w:tcBorders>
+              <w:top w:val="single" w:sz="4" w:space="0" w:color="D1D5DB"/>
+              <w:left w:val="single" w:sz="4" w:space="0" w:color="D1D5DB"/>
+              <w:bottom w:val="single" w:sz="4" w:space="0" w:color="D1D5DB"/>
+              <w:right w:val="single" w:sz="4" w:space="0" w:color="D1D5DB"/>
+            </w:tcBorders>
+            <w:shd w:val="clear" w:color="auto" w:fill="F3F4F6"/>
+            <w:tcMar>
+              <w:top w:w="70" w:type="dxa"/>
+              <w:left w:w="100" w:type="dxa"/>
+              <w:bottom w:w="70" w:type="dxa"/>
+              <w:right w:w="100" w:type="dxa"/>
+            </w:tcMar>
+          </w:tcPr>
+          <w:p>
+            <w:pPr>
+              <w:spacing w:after="20"/>
+            </w:pPr>
+            <w:r>
+              <w:rPr>
+                <w:b/>
+                <w:bCs/>
+                <w:color w:val="172033"/>
+                <w:sz w:val="19"/>
+                <w:szCs w:val="19"/>
+              </w:rPr>
+              <w:t>RN-18</w:t>
+            </w:r>
+          </w:p>
+        </w:tc>
+        <w:tc>
+          <w:tcPr>
+            <w:tcW w:w="8260" w:type="dxa"/>
+            <w:tcBorders>
+              <w:top w:val="single" w:sz="4" w:space="0" w:color="D1D5DB"/>
+              <w:left w:val="single" w:sz="4" w:space="0" w:color="D1D5DB"/>
+              <w:bottom w:val="single" w:sz="4" w:space="0" w:color="D1D5DB"/>
+              <w:right w:val="single" w:sz="4" w:space="0" w:color="D1D5DB"/>
+            </w:tcBorders>
+            <w:shd w:val="clear" w:color="auto" w:fill="F3F4F6"/>
+            <w:tcMar>
+              <w:top w:w="70" w:type="dxa"/>
+              <w:left w:w="100" w:type="dxa"/>
+              <w:bottom w:w="70" w:type="dxa"/>
+              <w:right w:w="100" w:type="dxa"/>
+            </w:tcMar>
+          </w:tcPr>
+          <w:p>
+            <w:pPr>
+              <w:spacing w:after="20"/>
+            </w:pPr>
+            <w:r>
+              <w:rPr>
+                <w:color w:val="172033"/>
+                <w:sz w:val="19"/>
+                <w:szCs w:val="19"/>
+              </w:rPr>
+              <w:t>Solo el súper administrador crea, edita o desactiva empresas. El Administrador de cada empresa gestiona sus usuarios y no puede quitarse su propio rol ni desactivar su cuenta.</w:t>
+            </w:r>
+          </w:p>
+        </w:tc>
+      </w:tr>
+      <w:tr>
+        <w:trPr>
+          <w:cantSplit/>
+        </w:trPr>
+        <w:tc>
+          <w:tcPr>
+            <w:tcW w:w="1100" w:type="dxa"/>
+            <w:tcBorders>
+              <w:top w:val="single" w:sz="4" w:space="0" w:color="D1D5DB"/>
+              <w:left w:val="single" w:sz="4" w:space="0" w:color="D1D5DB"/>
+              <w:bottom w:val="single" w:sz="4" w:space="0" w:color="D1D5DB"/>
+              <w:right w:val="single" w:sz="4" w:space="0" w:color="D1D5DB"/>
+            </w:tcBorders>
+            <w:shd w:val="clear" w:color="auto" w:fill="F3F4F6"/>
+            <w:tcMar>
+              <w:top w:w="70" w:type="dxa"/>
+              <w:left w:w="100" w:type="dxa"/>
+              <w:bottom w:w="70" w:type="dxa"/>
+              <w:right w:w="100" w:type="dxa"/>
+            </w:tcMar>
+          </w:tcPr>
+          <w:p>
+            <w:pPr>
+              <w:spacing w:after="20"/>
+            </w:pPr>
+            <w:r>
+              <w:rPr>
+                <w:b/>
+                <w:bCs/>
+                <w:color w:val="172033"/>
+                <w:sz w:val="19"/>
+                <w:szCs w:val="19"/>
+              </w:rPr>
+              <w:t>RN-19</w:t>
+            </w:r>
+          </w:p>
+        </w:tc>
+        <w:tc>
+          <w:tcPr>
+            <w:tcW w:w="8260" w:type="dxa"/>
+            <w:tcBorders>
+              <w:top w:val="single" w:sz="4" w:space="0" w:color="D1D5DB"/>
+              <w:left w:val="single" w:sz="4" w:space="0" w:color="D1D5DB"/>
+              <w:bottom w:val="single" w:sz="4" w:space="0" w:color="D1D5DB"/>
+              <w:right w:val="single" w:sz="4" w:space="0" w:color="D1D5DB"/>
+            </w:tcBorders>
+            <w:shd w:val="clear" w:color="auto" w:fill="F3F4F6"/>
+            <w:tcMar>
+              <w:top w:w="70" w:type="dxa"/>
+              <w:left w:w="100" w:type="dxa"/>
+              <w:bottom w:w="70" w:type="dxa"/>
+              <w:right w:w="100" w:type="dxa"/>
+            </w:tcMar>
+          </w:tcPr>
+          <w:p>
+            <w:pPr>
+              <w:spacing w:after="20"/>
+            </w:pPr>
+            <w:r>
+              <w:rPr>
+                <w:color w:val="172033"/>
+                <w:sz w:val="19"/>
+                <w:szCs w:val="19"/>
+              </w:rPr>
+              <w:t>Desactivar una empresa o un usuario impide iniciar sesión y corta las sesiones que estén abiertas.</w:t>
+            </w:r>
+          </w:p>
+        </w:tc>
+      </w:tr>
+      <w:tr>
+        <w:trPr>
+          <w:cantSplit/>
+        </w:trPr>
+        <w:tc>
+          <w:tcPr>
+            <w:tcW w:w="1100" w:type="dxa"/>
+            <w:tcBorders>
+              <w:top w:val="single" w:sz="4" w:space="0" w:color="D1D5DB"/>
+              <w:left w:val="single" w:sz="4" w:space="0" w:color="D1D5DB"/>
+              <w:bottom w:val="single" w:sz="4" w:space="0" w:color="D1D5DB"/>
+              <w:right w:val="single" w:sz="4" w:space="0" w:color="D1D5DB"/>
+            </w:tcBorders>
+            <w:shd w:val="clear" w:color="auto" w:fill="F3F4F6"/>
+            <w:tcMar>
+              <w:top w:w="70" w:type="dxa"/>
+              <w:left w:w="100" w:type="dxa"/>
+              <w:bottom w:w="70" w:type="dxa"/>
+              <w:right w:w="100" w:type="dxa"/>
+            </w:tcMar>
+          </w:tcPr>
+          <w:p>
+            <w:pPr>
+              <w:spacing w:after="20"/>
+            </w:pPr>
+            <w:r>
+              <w:rPr>
+                <w:b/>
+                <w:bCs/>
+                <w:color w:val="172033"/>
+                <w:sz w:val="19"/>
+                <w:szCs w:val="19"/>
+              </w:rPr>
+              <w:t>RN-20</w:t>
+            </w:r>
+          </w:p>
+        </w:tc>
+        <w:tc>
+          <w:tcPr>
+            <w:tcW w:w="8260" w:type="dxa"/>
+            <w:tcBorders>
+              <w:top w:val="single" w:sz="4" w:space="0" w:color="D1D5DB"/>
+              <w:left w:val="single" w:sz="4" w:space="0" w:color="D1D5DB"/>
+              <w:bottom w:val="single" w:sz="4" w:space="0" w:color="D1D5DB"/>
+              <w:right w:val="single" w:sz="4" w:space="0" w:color="D1D5DB"/>
+            </w:tcBorders>
+            <w:shd w:val="clear" w:color="auto" w:fill="F3F4F6"/>
+            <w:tcMar>
+              <w:top w:w="70" w:type="dxa"/>
+              <w:left w:w="100" w:type="dxa"/>
+              <w:bottom w:w="70" w:type="dxa"/>
+              <w:right w:w="100" w:type="dxa"/>
+            </w:tcMar>
+          </w:tcPr>
+          <w:p>
+            <w:pPr>
+              <w:spacing w:after="20"/>
+            </w:pPr>
+            <w:r>
+              <w:rPr>
+                <w:color w:val="172033"/>
+                <w:sz w:val="19"/>
+                <w:szCs w:val="19"/>
+              </w:rPr>
+              <w:t>Restablecer los datos de ejemplo solo afecta a la empresa del Administrador que lo hace.</w:t>
             </w:r>
           </w:p>
         </w:tc>
@@ -20220,7 +21082,7 @@
               <w:rPr>
                 <w:sz w:val="18"/>
               </w:rPr>
-              <w:t>Endpoints en /api: auth, data, items, generate, draft y chat. Validan sesión, rol y datos en el servidor.</w:t>
+              <w:t>Endpoints en /api: auth, data, items, generate, draft, chat, usuarios, empresas y perfil. Validan permisos y datos en el servidor y filtran todo por la empresa del usuario.</w:t>
             </w:r>
           </w:p>
         </w:tc>
@@ -20315,7 +21177,7 @@
               <w:rPr>
                 <w:sz w:val="18"/>
               </w:rPr>
-              <w:t>Contraseñas cifradas, sesión de 8 horas, permisos por rol.</w:t>
+              <w:t>Contraseñas cifradas, sesión de 8 horas, permisos por rol y por empresa; la sesión se corta si la empresa o el usuario se desactivan.</w:t>
             </w:r>
           </w:p>
         </w:tc>
@@ -23042,7 +23904,7 @@
           <w:sz w:val="17"/>
           <w:szCs w:val="17"/>
         </w:rPr>
-        <w:t>usuarios   (id, email, nombre, rol, pass_hash, activo, creado_el)</w:t>
+        <w:t>empresas   (id, nombre, logo, plantilla, activa, creado_el)</w:t>
       </w:r>
     </w:p>
     <w:p>
@@ -23060,7 +23922,7 @@
           <w:sz w:val="17"/>
           <w:szCs w:val="17"/>
         </w:rPr>
-        <w:t>puestos    (id, parent_id, nombre, dept, resp, obj, comp, perfil, estado, creado_por, actualizado_el)</w:t>
+        <w:t>usuarios   (id, empresa_id, email, nombre, rol, pass_hash, foto, activo, creado_el)</w:t>
       </w:r>
     </w:p>
     <w:p>
@@ -23078,7 +23940,7 @@
           <w:sz w:val="17"/>
           <w:szCs w:val="17"/>
         </w:rPr>
-        <w:t>documentos (id, modulo, codigo, nombre, estado, version, datos, aprobado_por, aprobado_el, creado_por, actualizado_el)</w:t>
+        <w:t>puestos    (id, empresa_id, parent_id, nombre, dept, resp, obj, comp, perfil, estado, creado_por, actualizado_el)</w:t>
       </w:r>
     </w:p>
     <w:p>
@@ -23096,7 +23958,25 @@
           <w:sz w:val="17"/>
           <w:szCs w:val="17"/>
         </w:rPr>
-        <w:t>historial  (id, modulo, registro_id, version, fecha, autor, nota)</w:t>
+        <w:t>documentos (id, empresa_id, modulo, codigo, nombre, estado, version, datos, aprobado_por, aprobado_el, creado_por, actualizado_el)</w:t>
+      </w:r>
+    </w:p>
+    <w:p>
+      <w:pPr>
+        <w:pBdr>
+          <w:left w:val="single" w:sz="12" w:space="6" w:color="3157D5"/>
+        </w:pBdr>
+        <w:shd w:val="clear" w:color="auto" w:fill="F3F4F6"/>
+        <w:ind w:left="120"/>
+      </w:pPr>
+      <w:r>
+        <w:rPr>
+          <w:rFonts w:ascii="Consolas" w:eastAsia="Consolas" w:hAnsi="Consolas" w:cs="Consolas"/>
+          <w:color w:val="172033"/>
+          <w:sz w:val="17"/>
+          <w:szCs w:val="17"/>
+        </w:rPr>
+        <w:t>historial  (id, empresa_id, modulo, registro_id, version, fecha, autor, nota)</w:t>
       </w:r>
     </w:p>
     <w:p>
@@ -30845,6 +31725,211 @@
           </w:p>
         </w:tc>
       </w:tr>
+      <w:tr>
+        <w:tc>
+          <w:tcPr>
+            <w:tcW w:w="900" w:type="dxa"/>
+          </w:tcPr>
+          <w:p>
+            <w:r>
+              <w:rPr>
+                <w:sz w:val="18"/>
+              </w:rPr>
+              <w:t>CP-34</w:t>
+            </w:r>
+          </w:p>
+        </w:tc>
+        <w:tc>
+          <w:tcPr>
+            <w:tcW w:w="3960" w:type="dxa"/>
+          </w:tcPr>
+          <w:p>
+            <w:r>
+              <w:rPr>
+                <w:sz w:val="18"/>
+              </w:rPr>
+              <w:t>Iniciar sesión con usuarios de dos empresas distintas</w:t>
+            </w:r>
+          </w:p>
+        </w:tc>
+        <w:tc>
+          <w:tcPr>
+            <w:tcW w:w="4500" w:type="dxa"/>
+          </w:tcPr>
+          <w:p>
+            <w:r>
+              <w:rPr>
+                <w:sz w:val="18"/>
+              </w:rPr>
+              <w:t>Cada uno ve el logo, el organigrama y los módulos de su propia empresa.</w:t>
+            </w:r>
+          </w:p>
+        </w:tc>
+      </w:tr>
+      <w:tr>
+        <w:tc>
+          <w:tcPr>
+            <w:tcW w:w="900" w:type="dxa"/>
+          </w:tcPr>
+          <w:p>
+            <w:r>
+              <w:rPr>
+                <w:sz w:val="18"/>
+              </w:rPr>
+              <w:t>CP-35</w:t>
+            </w:r>
+          </w:p>
+        </w:tc>
+        <w:tc>
+          <w:tcPr>
+            <w:tcW w:w="3960" w:type="dxa"/>
+          </w:tcPr>
+          <w:p>
+            <w:r>
+              <w:rPr>
+                <w:sz w:val="18"/>
+              </w:rPr>
+              <w:t>Intentar editar, borrar o aprobar un registro de otra empresa (por la API)</w:t>
+            </w:r>
+          </w:p>
+        </w:tc>
+        <w:tc>
+          <w:tcPr>
+            <w:tcW w:w="4500" w:type="dxa"/>
+          </w:tcPr>
+          <w:p>
+            <w:r>
+              <w:rPr>
+                <w:sz w:val="18"/>
+              </w:rPr>
+              <w:t>El servidor responde que el registro no existe y no modifica nada.</w:t>
+            </w:r>
+          </w:p>
+        </w:tc>
+      </w:tr>
+      <w:tr>
+        <w:tc>
+          <w:tcPr>
+            <w:tcW w:w="900" w:type="dxa"/>
+          </w:tcPr>
+          <w:p>
+            <w:r>
+              <w:rPr>
+                <w:sz w:val="18"/>
+              </w:rPr>
+              <w:t>CP-36</w:t>
+            </w:r>
+          </w:p>
+        </w:tc>
+        <w:tc>
+          <w:tcPr>
+            <w:tcW w:w="3960" w:type="dxa"/>
+          </w:tcPr>
+          <w:p>
+            <w:r>
+              <w:rPr>
+                <w:sz w:val="18"/>
+              </w:rPr>
+              <w:t>Administrador crea un usuario, lo desactiva y le restablece la contraseña</w:t>
+            </w:r>
+          </w:p>
+        </w:tc>
+        <w:tc>
+          <w:tcPr>
+            <w:tcW w:w="4500" w:type="dxa"/>
+          </w:tcPr>
+          <w:p>
+            <w:r>
+              <w:rPr>
+                <w:sz w:val="18"/>
+              </w:rPr>
+              <w:t>El usuario aparece en la lista; desactivado ya no puede entrar.</w:t>
+            </w:r>
+          </w:p>
+        </w:tc>
+      </w:tr>
+      <w:tr>
+        <w:tc>
+          <w:tcPr>
+            <w:tcW w:w="900" w:type="dxa"/>
+          </w:tcPr>
+          <w:p>
+            <w:r>
+              <w:rPr>
+                <w:sz w:val="18"/>
+              </w:rPr>
+              <w:t>CP-37</w:t>
+            </w:r>
+          </w:p>
+        </w:tc>
+        <w:tc>
+          <w:tcPr>
+            <w:tcW w:w="3960" w:type="dxa"/>
+          </w:tcPr>
+          <w:p>
+            <w:r>
+              <w:rPr>
+                <w:sz w:val="18"/>
+              </w:rPr>
+              <w:t>Subir foto de perfil y logo de la empresa</w:t>
+            </w:r>
+          </w:p>
+        </w:tc>
+        <w:tc>
+          <w:tcPr>
+            <w:tcW w:w="4500" w:type="dxa"/>
+          </w:tcPr>
+          <w:p>
+            <w:r>
+              <w:rPr>
+                <w:sz w:val="18"/>
+              </w:rPr>
+              <w:t>La foto aparece junto al nombre y el logo en el menú de todos los usuarios de la empresa.</w:t>
+            </w:r>
+          </w:p>
+        </w:tc>
+      </w:tr>
+      <w:tr>
+        <w:tc>
+          <w:tcPr>
+            <w:tcW w:w="900" w:type="dxa"/>
+          </w:tcPr>
+          <w:p>
+            <w:r>
+              <w:rPr>
+                <w:sz w:val="18"/>
+              </w:rPr>
+              <w:t>CP-38</w:t>
+            </w:r>
+          </w:p>
+        </w:tc>
+        <w:tc>
+          <w:tcPr>
+            <w:tcW w:w="3960" w:type="dxa"/>
+          </w:tcPr>
+          <w:p>
+            <w:r>
+              <w:rPr>
+                <w:sz w:val="18"/>
+              </w:rPr>
+              <w:t>Súper administrador crea una empresa vacía y luego la desactiva</w:t>
+            </w:r>
+          </w:p>
+        </w:tc>
+        <w:tc>
+          <w:tcPr>
+            <w:tcW w:w="4500" w:type="dxa"/>
+          </w:tcPr>
+          <w:p>
+            <w:r>
+              <w:rPr>
+                <w:sz w:val="18"/>
+              </w:rPr>
+              <w:t>Su administrador entra, crea el primer puesto; al desactivarla nadie de esa empresa puede entrar.</w:t>
+            </w:r>
+          </w:p>
+        </w:tc>
+      </w:tr>
     </w:tbl>
     <w:p>
       <w:pPr>
@@ -32159,7 +33244,7 @@
               <w:rPr>
                 <w:sz w:val="18"/>
               </w:rPr>
-              <w:t>Fase 2: alta de usuarios por empresa y recuperación de contraseña.</w:t>
+              <w:t>Resuelto en la versión 7: alta de usuarios por empresa. Falta recuperación de contraseña por correo.</w:t>
             </w:r>
           </w:p>
         </w:tc>
@@ -32213,7 +33298,7 @@
               <w:rPr>
                 <w:sz w:val="18"/>
               </w:rPr>
-              <w:t>Fase 2: permisos por empresa (multiempresa).</w:t>
+              <w:t>Resuelto en la versión 7: permisos por rol dentro de cada empresa.</w:t>
             </w:r>
           </w:p>
         </w:tc>
@@ -32267,7 +33352,7 @@
               <w:rPr>
                 <w:sz w:val="18"/>
               </w:rPr>
-              <w:t>Fase 2: migrar a Django y agregar multiempresa.</w:t>
+              <w:t>Multiempresa resuelto en la versión 7. Fase 2: migrar a Django si el ingeniero lo confirma.</w:t>
             </w:r>
           </w:p>
         </w:tc>
@@ -37494,7 +38579,7 @@
                 <w:sz w:val="19"/>
                 <w:szCs w:val="19"/>
               </w:rPr>
-              <w:t>Devuelve puestos, procesos, competencias, políticas y KPIs</w:t>
+              <w:t>Devuelve puestos, procesos, competencias, políticas y KPIs de la empresa del usuario</w:t>
             </w:r>
           </w:p>
         </w:tc>
@@ -37748,7 +38833,7 @@
                 <w:sz w:val="19"/>
                 <w:szCs w:val="19"/>
               </w:rPr>
-              <w:t>Restablecer los datos de ejemplo</w:t>
+              <w:t>Restablecer los datos de ejemplo de su propia empresa</w:t>
             </w:r>
           </w:p>
         </w:tc>
@@ -38003,6 +39088,387 @@
                 <w:szCs w:val="19"/>
               </w:rPr>
               <w:t>Chat con el asistente</w:t>
+            </w:r>
+          </w:p>
+        </w:tc>
+        <w:tc>
+          <w:tcPr>
+            <w:tcW w:w="2000" w:type="dxa"/>
+            <w:tcBorders>
+              <w:top w:val="single" w:sz="4" w:space="0" w:color="D1D5DB"/>
+              <w:left w:val="single" w:sz="4" w:space="0" w:color="D1D5DB"/>
+              <w:bottom w:val="single" w:sz="4" w:space="0" w:color="D1D5DB"/>
+              <w:right w:val="single" w:sz="4" w:space="0" w:color="D1D5DB"/>
+            </w:tcBorders>
+            <w:tcMar>
+              <w:top w:w="70" w:type="dxa"/>
+              <w:left w:w="100" w:type="dxa"/>
+              <w:bottom w:w="70" w:type="dxa"/>
+              <w:right w:w="100" w:type="dxa"/>
+            </w:tcMar>
+          </w:tcPr>
+          <w:p>
+            <w:pPr>
+              <w:spacing w:after="20"/>
+            </w:pPr>
+            <w:r>
+              <w:rPr>
+                <w:color w:val="172033"/>
+                <w:sz w:val="19"/>
+                <w:szCs w:val="19"/>
+              </w:rPr>
+              <w:t>Con sesión</w:t>
+            </w:r>
+          </w:p>
+        </w:tc>
+      </w:tr>
+      <w:tr>
+        <w:trPr>
+          <w:cantSplit/>
+        </w:trPr>
+        <w:tc>
+          <w:tcPr>
+            <w:tcW w:w="1900" w:type="dxa"/>
+            <w:tcBorders>
+              <w:top w:val="single" w:sz="4" w:space="0" w:color="D1D5DB"/>
+              <w:left w:val="single" w:sz="4" w:space="0" w:color="D1D5DB"/>
+              <w:bottom w:val="single" w:sz="4" w:space="0" w:color="D1D5DB"/>
+              <w:right w:val="single" w:sz="4" w:space="0" w:color="D1D5DB"/>
+            </w:tcBorders>
+            <w:tcMar>
+              <w:top w:w="70" w:type="dxa"/>
+              <w:left w:w="100" w:type="dxa"/>
+              <w:bottom w:w="70" w:type="dxa"/>
+              <w:right w:w="100" w:type="dxa"/>
+            </w:tcMar>
+          </w:tcPr>
+          <w:p>
+            <w:pPr>
+              <w:spacing w:after="20"/>
+            </w:pPr>
+            <w:r>
+              <w:rPr>
+                <w:b/>
+                <w:bCs/>
+                <w:color w:val="172033"/>
+                <w:sz w:val="19"/>
+                <w:szCs w:val="19"/>
+              </w:rPr>
+              <w:t>/api/usuarios</w:t>
+            </w:r>
+          </w:p>
+        </w:tc>
+        <w:tc>
+          <w:tcPr>
+            <w:tcW w:w="1800" w:type="dxa"/>
+            <w:tcBorders>
+              <w:top w:val="single" w:sz="4" w:space="0" w:color="D1D5DB"/>
+              <w:left w:val="single" w:sz="4" w:space="0" w:color="D1D5DB"/>
+              <w:bottom w:val="single" w:sz="4" w:space="0" w:color="D1D5DB"/>
+              <w:right w:val="single" w:sz="4" w:space="0" w:color="D1D5DB"/>
+            </w:tcBorders>
+            <w:tcMar>
+              <w:top w:w="70" w:type="dxa"/>
+              <w:left w:w="100" w:type="dxa"/>
+              <w:bottom w:w="70" w:type="dxa"/>
+              <w:right w:w="100" w:type="dxa"/>
+            </w:tcMar>
+          </w:tcPr>
+          <w:p>
+            <w:pPr>
+              <w:spacing w:after="20"/>
+            </w:pPr>
+            <w:r>
+              <w:rPr>
+                <w:color w:val="172033"/>
+                <w:sz w:val="19"/>
+                <w:szCs w:val="19"/>
+              </w:rPr>
+              <w:t>GET / POST</w:t>
+            </w:r>
+          </w:p>
+        </w:tc>
+        <w:tc>
+          <w:tcPr>
+            <w:tcW w:w="3660" w:type="dxa"/>
+            <w:tcBorders>
+              <w:top w:val="single" w:sz="4" w:space="0" w:color="D1D5DB"/>
+              <w:left w:val="single" w:sz="4" w:space="0" w:color="D1D5DB"/>
+              <w:bottom w:val="single" w:sz="4" w:space="0" w:color="D1D5DB"/>
+              <w:right w:val="single" w:sz="4" w:space="0" w:color="D1D5DB"/>
+            </w:tcBorders>
+            <w:tcMar>
+              <w:top w:w="70" w:type="dxa"/>
+              <w:left w:w="100" w:type="dxa"/>
+              <w:bottom w:w="70" w:type="dxa"/>
+              <w:right w:w="100" w:type="dxa"/>
+            </w:tcMar>
+          </w:tcPr>
+          <w:p>
+            <w:pPr>
+              <w:spacing w:after="20"/>
+            </w:pPr>
+            <w:r>
+              <w:rPr>
+                <w:color w:val="172033"/>
+                <w:sz w:val="19"/>
+                <w:szCs w:val="19"/>
+              </w:rPr>
+              <w:t>Lista, crea y edita usuarios de la empresa; activa, desactiva y restablece contraseñas</w:t>
+            </w:r>
+          </w:p>
+        </w:tc>
+        <w:tc>
+          <w:tcPr>
+            <w:tcW w:w="2000" w:type="dxa"/>
+            <w:tcBorders>
+              <w:top w:val="single" w:sz="4" w:space="0" w:color="D1D5DB"/>
+              <w:left w:val="single" w:sz="4" w:space="0" w:color="D1D5DB"/>
+              <w:bottom w:val="single" w:sz="4" w:space="0" w:color="D1D5DB"/>
+              <w:right w:val="single" w:sz="4" w:space="0" w:color="D1D5DB"/>
+            </w:tcBorders>
+            <w:tcMar>
+              <w:top w:w="70" w:type="dxa"/>
+              <w:left w:w="100" w:type="dxa"/>
+              <w:bottom w:w="70" w:type="dxa"/>
+              <w:right w:w="100" w:type="dxa"/>
+            </w:tcMar>
+          </w:tcPr>
+          <w:p>
+            <w:pPr>
+              <w:spacing w:after="20"/>
+            </w:pPr>
+            <w:r>
+              <w:rPr>
+                <w:color w:val="172033"/>
+                <w:sz w:val="19"/>
+                <w:szCs w:val="19"/>
+              </w:rPr>
+              <w:t>Solo Administrador de la empresa</w:t>
+            </w:r>
+          </w:p>
+        </w:tc>
+      </w:tr>
+      <w:tr>
+        <w:trPr>
+          <w:cantSplit/>
+        </w:trPr>
+        <w:tc>
+          <w:tcPr>
+            <w:tcW w:w="1900" w:type="dxa"/>
+            <w:tcBorders>
+              <w:top w:val="single" w:sz="4" w:space="0" w:color="D1D5DB"/>
+              <w:left w:val="single" w:sz="4" w:space="0" w:color="D1D5DB"/>
+              <w:bottom w:val="single" w:sz="4" w:space="0" w:color="D1D5DB"/>
+              <w:right w:val="single" w:sz="4" w:space="0" w:color="D1D5DB"/>
+            </w:tcBorders>
+            <w:tcMar>
+              <w:top w:w="70" w:type="dxa"/>
+              <w:left w:w="100" w:type="dxa"/>
+              <w:bottom w:w="70" w:type="dxa"/>
+              <w:right w:w="100" w:type="dxa"/>
+            </w:tcMar>
+          </w:tcPr>
+          <w:p>
+            <w:pPr>
+              <w:spacing w:after="20"/>
+            </w:pPr>
+            <w:r>
+              <w:rPr>
+                <w:b/>
+                <w:bCs/>
+                <w:color w:val="172033"/>
+                <w:sz w:val="19"/>
+                <w:szCs w:val="19"/>
+              </w:rPr>
+              <w:t>/api/empresas</w:t>
+            </w:r>
+          </w:p>
+        </w:tc>
+        <w:tc>
+          <w:tcPr>
+            <w:tcW w:w="1800" w:type="dxa"/>
+            <w:tcBorders>
+              <w:top w:val="single" w:sz="4" w:space="0" w:color="D1D5DB"/>
+              <w:left w:val="single" w:sz="4" w:space="0" w:color="D1D5DB"/>
+              <w:bottom w:val="single" w:sz="4" w:space="0" w:color="D1D5DB"/>
+              <w:right w:val="single" w:sz="4" w:space="0" w:color="D1D5DB"/>
+            </w:tcBorders>
+            <w:tcMar>
+              <w:top w:w="70" w:type="dxa"/>
+              <w:left w:w="100" w:type="dxa"/>
+              <w:bottom w:w="70" w:type="dxa"/>
+              <w:right w:w="100" w:type="dxa"/>
+            </w:tcMar>
+          </w:tcPr>
+          <w:p>
+            <w:pPr>
+              <w:spacing w:after="20"/>
+            </w:pPr>
+            <w:r>
+              <w:rPr>
+                <w:color w:val="172033"/>
+                <w:sz w:val="19"/>
+                <w:szCs w:val="19"/>
+              </w:rPr>
+              <w:t>GET / POST</w:t>
+            </w:r>
+          </w:p>
+        </w:tc>
+        <w:tc>
+          <w:tcPr>
+            <w:tcW w:w="3660" w:type="dxa"/>
+            <w:tcBorders>
+              <w:top w:val="single" w:sz="4" w:space="0" w:color="D1D5DB"/>
+              <w:left w:val="single" w:sz="4" w:space="0" w:color="D1D5DB"/>
+              <w:bottom w:val="single" w:sz="4" w:space="0" w:color="D1D5DB"/>
+              <w:right w:val="single" w:sz="4" w:space="0" w:color="D1D5DB"/>
+            </w:tcBorders>
+            <w:tcMar>
+              <w:top w:w="70" w:type="dxa"/>
+              <w:left w:w="100" w:type="dxa"/>
+              <w:bottom w:w="70" w:type="dxa"/>
+              <w:right w:w="100" w:type="dxa"/>
+            </w:tcMar>
+          </w:tcPr>
+          <w:p>
+            <w:pPr>
+              <w:spacing w:after="20"/>
+            </w:pPr>
+            <w:r>
+              <w:rPr>
+                <w:color w:val="172033"/>
+                <w:sz w:val="19"/>
+                <w:szCs w:val="19"/>
+              </w:rPr>
+              <w:t>Lista, crea, edita y desactiva empresas; el Administrador solo cambia el nombre y logo de la suya</w:t>
+            </w:r>
+          </w:p>
+        </w:tc>
+        <w:tc>
+          <w:tcPr>
+            <w:tcW w:w="2000" w:type="dxa"/>
+            <w:tcBorders>
+              <w:top w:val="single" w:sz="4" w:space="0" w:color="D1D5DB"/>
+              <w:left w:val="single" w:sz="4" w:space="0" w:color="D1D5DB"/>
+              <w:bottom w:val="single" w:sz="4" w:space="0" w:color="D1D5DB"/>
+              <w:right w:val="single" w:sz="4" w:space="0" w:color="D1D5DB"/>
+            </w:tcBorders>
+            <w:tcMar>
+              <w:top w:w="70" w:type="dxa"/>
+              <w:left w:w="100" w:type="dxa"/>
+              <w:bottom w:w="70" w:type="dxa"/>
+              <w:right w:w="100" w:type="dxa"/>
+            </w:tcMar>
+          </w:tcPr>
+          <w:p>
+            <w:pPr>
+              <w:spacing w:after="20"/>
+            </w:pPr>
+            <w:r>
+              <w:rPr>
+                <w:color w:val="172033"/>
+                <w:sz w:val="19"/>
+                <w:szCs w:val="19"/>
+              </w:rPr>
+              <w:t>Súper administrador (y Administrador para su empresa)</w:t>
+            </w:r>
+          </w:p>
+        </w:tc>
+      </w:tr>
+      <w:tr>
+        <w:trPr>
+          <w:cantSplit/>
+        </w:trPr>
+        <w:tc>
+          <w:tcPr>
+            <w:tcW w:w="1900" w:type="dxa"/>
+            <w:tcBorders>
+              <w:top w:val="single" w:sz="4" w:space="0" w:color="D1D5DB"/>
+              <w:left w:val="single" w:sz="4" w:space="0" w:color="D1D5DB"/>
+              <w:bottom w:val="single" w:sz="4" w:space="0" w:color="D1D5DB"/>
+              <w:right w:val="single" w:sz="4" w:space="0" w:color="D1D5DB"/>
+            </w:tcBorders>
+            <w:tcMar>
+              <w:top w:w="70" w:type="dxa"/>
+              <w:left w:w="100" w:type="dxa"/>
+              <w:bottom w:w="70" w:type="dxa"/>
+              <w:right w:w="100" w:type="dxa"/>
+            </w:tcMar>
+          </w:tcPr>
+          <w:p>
+            <w:pPr>
+              <w:spacing w:after="20"/>
+            </w:pPr>
+            <w:r>
+              <w:rPr>
+                <w:b/>
+                <w:bCs/>
+                <w:color w:val="172033"/>
+                <w:sz w:val="19"/>
+                <w:szCs w:val="19"/>
+              </w:rPr>
+              <w:t>/api/perfil</w:t>
+            </w:r>
+          </w:p>
+        </w:tc>
+        <w:tc>
+          <w:tcPr>
+            <w:tcW w:w="1800" w:type="dxa"/>
+            <w:tcBorders>
+              <w:top w:val="single" w:sz="4" w:space="0" w:color="D1D5DB"/>
+              <w:left w:val="single" w:sz="4" w:space="0" w:color="D1D5DB"/>
+              <w:bottom w:val="single" w:sz="4" w:space="0" w:color="D1D5DB"/>
+              <w:right w:val="single" w:sz="4" w:space="0" w:color="D1D5DB"/>
+            </w:tcBorders>
+            <w:tcMar>
+              <w:top w:w="70" w:type="dxa"/>
+              <w:left w:w="100" w:type="dxa"/>
+              <w:bottom w:w="70" w:type="dxa"/>
+              <w:right w:w="100" w:type="dxa"/>
+            </w:tcMar>
+          </w:tcPr>
+          <w:p>
+            <w:pPr>
+              <w:spacing w:after="20"/>
+            </w:pPr>
+            <w:r>
+              <w:rPr>
+                <w:color w:val="172033"/>
+                <w:sz w:val="19"/>
+                <w:szCs w:val="19"/>
+              </w:rPr>
+              <w:t>POST</w:t>
+            </w:r>
+          </w:p>
+        </w:tc>
+        <w:tc>
+          <w:tcPr>
+            <w:tcW w:w="3660" w:type="dxa"/>
+            <w:tcBorders>
+              <w:top w:val="single" w:sz="4" w:space="0" w:color="D1D5DB"/>
+              <w:left w:val="single" w:sz="4" w:space="0" w:color="D1D5DB"/>
+              <w:bottom w:val="single" w:sz="4" w:space="0" w:color="D1D5DB"/>
+              <w:right w:val="single" w:sz="4" w:space="0" w:color="D1D5DB"/>
+            </w:tcBorders>
+            <w:tcMar>
+              <w:top w:w="70" w:type="dxa"/>
+              <w:left w:w="100" w:type="dxa"/>
+              <w:bottom w:w="70" w:type="dxa"/>
+              <w:right w:w="100" w:type="dxa"/>
+            </w:tcMar>
+          </w:tcPr>
+          <w:p>
+            <w:pPr>
+              <w:spacing w:after="20"/>
+            </w:pPr>
+            <w:r>
+              <w:rPr>
+                <w:color w:val="172033"/>
+                <w:sz w:val="19"/>
+                <w:szCs w:val="19"/>
+              </w:rPr>
+              <w:t>Cambia la foto de perfil o la contraseña del propio usuario</w:t>
             </w:r>
           </w:p>
         </w:tc>
@@ -38786,7 +40252,7 @@
         <w:pStyle w:val="Prrafodelista"/>
       </w:pPr>
       <w:r>
-        <w:t>Multiempresa: cada empresa con sus propios datos y usuarios (Fase 2).</w:t>
+        <w:t>Resuelto en la versión 7: multiempresa, cada empresa con sus propios datos y usuarios.</w:t>
       </w:r>
     </w:p>
     <w:p>
@@ -38794,7 +40260,7 @@
         <w:pStyle w:val="Prrafodelista"/>
       </w:pPr>
       <w:r>
-        <w:t>Administración de usuarios desde la página (alta, baja, cambio de rol y de contraseña).</w:t>
+        <w:t>Resuelto en la versión 7: administración de usuarios desde la página (alta, baja, cambio de rol y de contraseña).</w:t>
       </w:r>
     </w:p>
     <w:p>
@@ -39010,6 +40476,321 @@
     </w:p>
     <w:p>
       <w:pPr>
+        <w:pStyle w:val="Ttulo1"/>
+      </w:pPr>
+      <w:r>
+        <w:t>27. Actualización del MVP — versión 7: multiempresa y multiusuario (19 de octubre de 2026)</w:t>
+      </w:r>
+    </w:p>
+    <w:p>
+      <w:pPr>
+        <w:spacing w:after="120" w:line="276" w:lineRule="auto"/>
+      </w:pPr>
+      <w:r>
+        <w:rPr>
+          <w:color w:val="172033"/>
+        </w:rPr>
+        <w:t>A petición del ingeniero, la plataforma deja de ser de una sola empresa: varias empresas la usan al mismo tiempo, cada una con su propio logo, sus usuarios con foto de perfil y su propia información, sin ver nunca la de las demás. Se mantiene el mismo backend (Node.js en Vercel y PostgreSQL en Neon), sin Django.</w:t>
+      </w:r>
+    </w:p>
+    <w:p>
+      <w:pPr>
+        <w:pStyle w:val="Ttulo2"/>
+      </w:pPr>
+      <w:r>
+        <w:t>27.1 Cómo funciona la separación entre empresas</w:t>
+      </w:r>
+    </w:p>
+    <w:p>
+      <w:pPr>
+        <w:pStyle w:val="Prrafodelista"/>
+      </w:pPr>
+      <w:r>
+        <w:t>Nueva tabla empresas (nombre, logo, plantilla de datos de ejemplo y si está activa).</w:t>
+      </w:r>
+    </w:p>
+    <w:p>
+      <w:pPr>
+        <w:pStyle w:val="Prrafodelista"/>
+      </w:pPr>
+      <w:r>
+        <w:t>Las tablas usuarios, puestos, documentos e historial tienen la columna empresa_id; el servidor la toma de la sesión, nunca de lo que envía la página.</w:t>
+      </w:r>
+    </w:p>
+    <w:p>
+      <w:pPr>
+        <w:pStyle w:val="Prrafodelista"/>
+      </w:pPr>
+      <w:r>
+        <w:t>Cada lectura, alta, cambio, aprobación y baja se filtra por la empresa del usuario. Si alguien pide un registro de otra empresa, el servidor responde que no existe.</w:t>
+      </w:r>
+    </w:p>
+    <w:p>
+      <w:pPr>
+        <w:pStyle w:val="Prrafodelista"/>
+      </w:pPr>
+      <w:r>
+        <w:t>Los códigos (por ejemplo POL-PRO-01) se numeran por empresa, y «Restablecer» solo recarga los datos de ejemplo de la propia empresa.</w:t>
+      </w:r>
+    </w:p>
+    <w:p>
+      <w:pPr>
+        <w:pStyle w:val="Prrafodelista"/>
+      </w:pPr>
+      <w:r>
+        <w:t>Un usuario entra con su correo, que es único en la plataforma; así se sabe a qué empresa pertenece.</w:t>
+      </w:r>
+    </w:p>
+    <w:p>
+      <w:pPr>
+        <w:pStyle w:val="Ttulo2"/>
+      </w:pPr>
+      <w:r>
+        <w:t>27.2 Roles y cuentas</w:t>
+      </w:r>
+    </w:p>
+    <w:p>
+      <w:pPr>
+        <w:pStyle w:val="Prrafodelista"/>
+      </w:pPr>
+      <w:r>
+        <w:t>Súper administrador (IOT Technologies): pantalla «Empresas» para dar de alta empresas con su logo y su primer Administrador, con o sin datos de ejemplo, y para activarlas o desactivarlas. No ve los datos de ninguna empresa.</w:t>
+      </w:r>
+    </w:p>
+    <w:p>
+      <w:pPr>
+        <w:pStyle w:val="Prrafodelista"/>
+      </w:pPr>
+      <w:r>
+        <w:t>Administrador de cada empresa: pantalla «Usuarios y empresa» para cambiar el logo y el nombre de su empresa, crear usuarios, asignar su rol, activarlos o desactivarlos y restablecer contraseñas. No puede quitarse su propio rol ni desactivarse.</w:t>
+      </w:r>
+    </w:p>
+    <w:p>
+      <w:pPr>
+        <w:pStyle w:val="Prrafodelista"/>
+      </w:pPr>
+      <w:r>
+        <w:t>Recursos Humanos, Calidad y Dirección: mismos permisos que en la versión 5, ahora dentro de su empresa.</w:t>
+      </w:r>
+    </w:p>
+    <w:p>
+      <w:pPr>
+        <w:pStyle w:val="Prrafodelista"/>
+      </w:pPr>
+      <w:r>
+        <w:t>Todos: «Mi perfil» (clic en el nombre, arriba a la derecha) para subir su foto de perfil y cambiar su contraseña.</w:t>
+      </w:r>
+    </w:p>
+    <w:p>
+      <w:pPr>
+        <w:pStyle w:val="Prrafodelista"/>
+      </w:pPr>
+      <w:r>
+        <w:t>Cuentas de prueba (contraseña demo2026), agrupadas por empresa en el inicio de sesión: Empresa Demo (admin@, rh@, calidad@ y direccion@empresademo.mx), Manufacturas del Norte (admin@, rh@ y calidad@manufacturasnorte.mx) y el súper administrador (superadmin@plataforma-do.mx).</w:t>
+      </w:r>
+    </w:p>
+    <w:p>
+      <w:pPr>
+        <w:pStyle w:val="Ttulo2"/>
+      </w:pPr>
+      <w:r>
+        <w:t>27.3 Cambios implementados</w:t>
+      </w:r>
+    </w:p>
+    <w:p>
+      <w:pPr>
+        <w:pStyle w:val="Prrafodelista"/>
+      </w:pPr>
+      <w:r>
+        <w:t>Logo de la empresa arriba en el menú lateral y, abajo, «Con tecnología de IOT Technologies» con el logo oficial, respetando el manual de identidad.</w:t>
+      </w:r>
+    </w:p>
+    <w:p>
+      <w:pPr>
+        <w:pStyle w:val="Prrafodelista"/>
+      </w:pPr>
+      <w:r>
+        <w:t>Foto de perfil en el encabezado y en la lista de usuarios; si no hay foto se muestran las iniciales.</w:t>
+      </w:r>
+    </w:p>
+    <w:p>
+      <w:pPr>
+        <w:pStyle w:val="Prrafodelista"/>
+      </w:pPr>
+      <w:r>
+        <w:t>Las imágenes se reducen en el navegador antes de subirse (logo hasta 480 × 160 px en PNG; foto cuadrada de 256 px en JPG) y el servidor solo acepta PNG, JPG o WebP.</w:t>
+      </w:r>
+    </w:p>
+    <w:p>
+      <w:pPr>
+        <w:pStyle w:val="Prrafodelista"/>
+      </w:pPr>
+      <w:r>
+        <w:t>Título del organigrama y pestaña del navegador con el nombre de la empresa.</w:t>
+      </w:r>
+    </w:p>
+    <w:p>
+      <w:pPr>
+        <w:pStyle w:val="Prrafodelista"/>
+      </w:pPr>
+      <w:r>
+        <w:t>Una empresa nueva puede empezar vacía: el organigrama muestra un botón para crear el puesto de mayor nivel.</w:t>
+      </w:r>
+    </w:p>
+    <w:p>
+      <w:pPr>
+        <w:pStyle w:val="Prrafodelista"/>
+      </w:pPr>
+      <w:r>
+        <w:t>Al intentar asignar jefe al puesto de mayor nivel, el servidor ahora avisa en lugar de ignorar el cambio.</w:t>
+      </w:r>
+    </w:p>
+    <w:p>
+      <w:pPr>
+        <w:pStyle w:val="Prrafodelista"/>
+      </w:pPr>
+      <w:r>
+        <w:t>Desactivar una empresa o un usuario corta sus sesiones abiertas.</w:t>
+      </w:r>
+    </w:p>
+    <w:p>
+      <w:pPr>
+        <w:pStyle w:val="Prrafodelista"/>
+      </w:pPr>
+      <w:r>
+        <w:t>Nuevos endpoints: /api/usuarios, /api/empresas y /api/perfil (sección 25.2).</w:t>
+      </w:r>
+    </w:p>
+    <w:p>
+      <w:pPr>
+        <w:pStyle w:val="Ttulo2"/>
+      </w:pPr>
+      <w:r>
+        <w:t>27.4 Migración de la base de datos</w:t>
+      </w:r>
+    </w:p>
+    <w:p>
+      <w:pPr>
+        <w:pStyle w:val="Prrafodelista"/>
+      </w:pPr>
+      <w:r>
+        <w:t>Es automática: al primer uso después de publicar, el servidor agrega las columnas nuevas a las tablas existentes sin borrar nada.</w:t>
+      </w:r>
+    </w:p>
+    <w:p>
+      <w:pPr>
+        <w:pStyle w:val="Prrafodelista"/>
+      </w:pPr>
+      <w:r>
+        <w:t>Todos los datos que ya existían (puestos, procesos, competencias, políticas, KPIs, historial y las 4 cuentas) quedan asignados a «Empresa Demo».</w:t>
+      </w:r>
+    </w:p>
+    <w:p>
+      <w:pPr>
+        <w:pStyle w:val="Prrafodelista"/>
+      </w:pPr>
+      <w:r>
+        <w:t>Además se crean la empresa de ejemplo «Manufacturas del Norte» con su organigrama y sus usuarios, y la cuenta del súper administrador.</w:t>
+      </w:r>
+    </w:p>
+    <w:p>
+      <w:pPr>
+        <w:pStyle w:val="Prrafodelista"/>
+      </w:pPr>
+      <w:r>
+        <w:t>Una marca en la tabla config evita que se repita o se duplique si dos servidores arrancan al mismo tiempo.</w:t>
+      </w:r>
+    </w:p>
+    <w:p>
+      <w:pPr>
+        <w:pStyle w:val="Ttulo2"/>
+      </w:pPr>
+      <w:r>
+        <w:t>27.5 Evidencia de pruebas</w:t>
+      </w:r>
+    </w:p>
+    <w:p>
+      <w:pPr>
+        <w:pStyle w:val="Prrafodelista"/>
+      </w:pPr>
+      <w:r>
+        <w:t>42 pruebas automáticas de la API en local (PostgreSQL en memoria), todas aprobadas: cada empresa ve solo lo suyo; una empresa no puede editar, borrar ni aprobar registros de otra, ni colgar puestos de jefes ajenos, ni tocar sus usuarios; restablecer no afecta a otras empresas; usuarios y empresas desactivados no pueden entrar; se rechazan archivos que no son imagen.</w:t>
+      </w:r>
+    </w:p>
+    <w:p>
+      <w:pPr>
+        <w:pStyle w:val="Prrafodelista"/>
+      </w:pPr>
+      <w:r>
+        <w:t>Migración simulada sobre una base con el esquema de la versión 6: se conservaron los 10 puestos (incluido uno creado antes de migrar), los 16 documentos y los 4 usuarios en «Empresa Demo»; sin registros huérfanos y sin duplicados al arrancar una segunda vez.</w:t>
+      </w:r>
+    </w:p>
+    <w:p>
+      <w:pPr>
+        <w:pStyle w:val="Prrafodelista"/>
+      </w:pPr>
+      <w:r>
+        <w:t>Recorrido en la página: logo y organigrama distintos para Empresa Demo y Manufacturas del Norte, subida de foto y de logo, alta de una empresa desde el súper administrador con su administrador, y una empresa vacía creando su primer puesto.</w:t>
+      </w:r>
+    </w:p>
+    <w:p>
+      <w:pPr>
+        <w:pStyle w:val="Prrafodelista"/>
+      </w:pPr>
+      <w:r>
+        <w:t>19 de octubre de 2026: la versión quedó publicada en Vercel. La migración de Neon ocurre en el primer inicio de sesión; queda pendiente confirmarla entrando con una cuenta.</w:t>
+      </w:r>
+    </w:p>
+    <w:p>
+      <w:pPr>
+        <w:pStyle w:val="Ttulo2"/>
+      </w:pPr>
+      <w:r>
+        <w:t>27.6 Pendientes</w:t>
+      </w:r>
+    </w:p>
+    <w:p>
+      <w:pPr>
+        <w:pStyle w:val="Prrafodelista"/>
+      </w:pPr>
+      <w:r>
+        <w:t>Confirmar en el sitio publicado el primer inicio de sesión (migración de Neon).</w:t>
+      </w:r>
+    </w:p>
+    <w:p>
+      <w:pPr>
+        <w:pStyle w:val="Prrafodelista"/>
+      </w:pPr>
+      <w:r>
+        <w:t>Cambiar la contraseña de prueba del súper administrador antes de usar la plataforma con empresas reales.</w:t>
+      </w:r>
+    </w:p>
+    <w:p>
+      <w:pPr>
+        <w:pStyle w:val="Prrafodelista"/>
+      </w:pPr>
+      <w:r>
+        <w:t>Recuperación de contraseña por correo y límite de intentos de inicio de sesión.</w:t>
+      </w:r>
+    </w:p>
+    <w:p>
+      <w:pPr>
+        <w:pStyle w:val="Prrafodelista"/>
+      </w:pPr>
+      <w:r>
+        <w:t>Que el súper administrador pueda entrar a una empresa para dar soporte, si el ingeniero lo requiere.</w:t>
+      </w:r>
+    </w:p>
+    <w:p>
+      <w:pPr>
+        <w:pStyle w:val="Prrafodelista"/>
+      </w:pPr>
+      <w:r>
+        <w:t>No se probó con un servidor MySQL real; los logos y fotos usan mediumtext en MySQL.</w:t>
+      </w:r>
+    </w:p>
+    <w:p>
+      <w:pPr>
         <w:jc w:val="center"/>
       </w:pPr>
       <w:r>
@@ -39017,7 +40798,7 @@
           <w:i/>
           <w:sz w:val="18"/>
         </w:rPr>
-        <w:t>Documento actualizado el 12 de octubre de 2026 (versión 6), a partir del MVP publicado en Vercel.</w:t>
+        <w:t>Documento actualizado el 19 de octubre de 2026 (versión 7), a partir del MVP publicado en Vercel.</w:t>
       </w:r>
     </w:p>
     <w:sectPr>

</xml_diff>

<commit_message>
Documentación: migración multiempresa confirmada en el sitio publicado
Co-Authored-By: Claude Opus 5.5 <noreply@anthropic.com>
</commit_message>
<xml_diff>
--- a/Documentacion_MVP_Plataforma.docx
+++ b/Documentacion_MVP_Plataforma.docx
@@ -40738,7 +40738,7 @@
         <w:pStyle w:val="Prrafodelista"/>
       </w:pPr>
       <w:r>
-        <w:t>19 de octubre de 2026: la versión quedó publicada en Vercel. La migración de Neon ocurre en el primer inicio de sesión; queda pendiente confirmarla entrando con una cuenta.</w:t>
+        <w:t>19 de octubre de 2026, en el sitio publicado: el primer inicio de sesión con el Administrador de Empresa Demo hizo la migración en Neon y se ven los datos que ya existían.</w:t>
       </w:r>
     </w:p>
     <w:p>
@@ -40754,7 +40754,7 @@
         <w:pStyle w:val="Prrafodelista"/>
       </w:pPr>
       <w:r>
-        <w:t>Confirmar en el sitio publicado el primer inicio de sesión (migración de Neon).</w:t>
+        <w:t>Resuelto: migración de Neon confirmada en el sitio publicado (19 de octubre de 2026).</w:t>
       </w:r>
     </w:p>
     <w:p>

</xml_diff>